<commit_message>
complete upto chapter 7, add glossary
</commit_message>
<xml_diff>
--- a/documents/Research Proposal.docx
+++ b/documents/Research Proposal.docx
@@ -21,7 +21,7 @@
           <w:sz w:val="44"/>
           <w:szCs w:val="44"/>
         </w:rPr>
-        <w:t xml:space="preserve">Low-Cost Offline Voice Assistant for </w:t>
+        <w:t>Low-Cost Offline Voice Assistant for</w:t>
       </w:r>
     </w:p>
     <w:p>
@@ -41,7 +41,7 @@
           <w:sz w:val="44"/>
           <w:szCs w:val="44"/>
         </w:rPr>
-        <w:t xml:space="preserve">Hospitality Services in Sri Lanka Using </w:t>
+        <w:t>Hospitality Services in Sri Lanka Using</w:t>
       </w:r>
     </w:p>
     <w:p>
@@ -66,6 +66,7 @@
     </w:p>
     <w:p>
       <w:pPr>
+        <w:jc w:val="both"/>
         <w:rPr>
           <w:b/>
           <w:bCs/>
@@ -103,45 +104,77 @@
         <w:jc w:val="both"/>
       </w:pPr>
       <w:r>
-        <w:t>The hospitality industry in Sri Lanka is a key contributor to the national economy, with hotels continuously seeking ways to enhance the guest experience while managing operational costs. Traditional room service communication methods such as telephone calls to the front desk or physical service request forms are often inefficient, prone to miscommunication, and depend on dedicated staff availability. As a result, guest request handling suffers from delays, a lack of accountability, and poor service traceability.</w:t>
-      </w:r>
-    </w:p>
-    <w:p>
-      <w:pPr>
-        <w:jc w:val="both"/>
-      </w:pPr>
-      <w:r>
-        <w:t xml:space="preserve">Recent advancements in speech recognition and natural language processing (NLP) have produced commercial voice assistant solutions such as Amazon Alexa for Hospitality and Google Nest for Hotels. However, these systems rely heavily on cloud infrastructure, require continuous internet connectivity, and raise significant data privacy concerns for hotel guests. Furthermore, their high costs including proprietary hardware and recurring cloud API subscriptions render them impractical for </w:t>
-      </w:r>
-      <w:r>
-        <w:t>h</w:t>
-      </w:r>
-      <w:r>
-        <w:t>otels in developing countries such as Sri Lanka.</w:t>
-      </w:r>
-    </w:p>
-    <w:p>
-      <w:pPr>
-        <w:jc w:val="both"/>
-      </w:pPr>
-      <w:r>
-        <w:t xml:space="preserve">This research proposes a low-cost, offline-capable voice assistant system designed specifically for hotel room service operations. Named </w:t>
-      </w:r>
-      <w:r>
-        <w:t>‘</w:t>
-      </w:r>
-      <w:r>
-        <w:t>Sera</w:t>
-      </w:r>
-      <w:r>
-        <w:t>’</w:t>
-      </w:r>
-      <w:r>
-        <w:t>, the system leverages small-scale neural models running on commodity Android devices to provide speech-to-text (STT), intent classification, and text-to-speech (TTS) capabilities operating entirely on-device or within a local network, without any dependency on external cloud services. Guests make service requests through natural voice commands, which are automatically classified, routed to the appropriate hotel department, and tracked in real-time through a web-based staff dashboard.</w:t>
-      </w:r>
-    </w:p>
-    <w:p>
-      <w:pPr>
+        <w:t>Sri Lanka's hospitality industry is a major part of the national economy, and hotels are always looking for ways to improve the guest experience while keeping costs down. The most common way guests request room services today calling the front desk or filling in a paper form is slow and unreliable. Requests get delayed, staff miss things, and there is no easy way to track what was asked for or when.</w:t>
+      </w:r>
+    </w:p>
+    <w:p>
+      <w:pPr>
+        <w:jc w:val="both"/>
+      </w:pPr>
+      <w:r>
+        <w:t xml:space="preserve">Systems like Amazon Alexa for Hospitality and Google Nest Hub have tried to solve this with voice assistants. But these products depend on cloud servers, </w:t>
+      </w:r>
+      <w:proofErr w:type="gramStart"/>
+      <w:r>
+        <w:t>need</w:t>
+      </w:r>
+      <w:proofErr w:type="gramEnd"/>
+      <w:r>
+        <w:t xml:space="preserve"> a reliable internet connection, and send guest voice data to third-party servers. That raises privacy concerns. They also cost a lot to run hardware, licensing, and API fees add up quickly. For most hotels in Sri Lanka, that kind of investment simply is not practical.</w:t>
+      </w:r>
+    </w:p>
+    <w:p>
+      <w:pPr>
+        <w:jc w:val="both"/>
+      </w:pPr>
+      <w:r>
+        <w:t xml:space="preserve">This research builds a voice assistant designed specifically for hotel room service. It runs entirely on a standard </w:t>
+      </w:r>
+      <w:r>
+        <w:t>commodity</w:t>
+      </w:r>
+      <w:r>
+        <w:t xml:space="preserve"> </w:t>
+      </w:r>
+      <w:r>
+        <w:t xml:space="preserve">mobile </w:t>
+      </w:r>
+      <w:r>
+        <w:t>device</w:t>
+      </w:r>
+      <w:r>
+        <w:t xml:space="preserve"> </w:t>
+      </w:r>
+      <w:r>
+        <w:t xml:space="preserve">which </w:t>
+      </w:r>
+      <w:r>
+        <w:t>provides</w:t>
+      </w:r>
+      <w:r>
+        <w:t xml:space="preserve"> speech-to-text (STT), intent classification, and text-to-speech (TTS) capabilities operating entirely on-device </w:t>
+      </w:r>
+      <w:r>
+        <w:t>w</w:t>
+      </w:r>
+      <w:r>
+        <w:t>ithin a local network</w:t>
+      </w:r>
+      <w:r>
+        <w:t xml:space="preserve">. No internet is needed. No guest data leaves the building. Guests </w:t>
+      </w:r>
+      <w:proofErr w:type="gramStart"/>
+      <w:r>
+        <w:t>speak</w:t>
+      </w:r>
+      <w:proofErr w:type="gramEnd"/>
+      <w:r>
+        <w:t xml:space="preserve"> their request, the device understands it, routes it to the right department, and staff can see and manage all requests on a web dashboard in real time.</w:t>
+      </w:r>
+    </w:p>
+    <w:p>
+      <w:pPr>
+        <w:jc w:val="both"/>
         <w:rPr>
           <w:b/>
           <w:bCs/>
@@ -151,6 +184,7 @@
     </w:p>
     <w:p>
       <w:pPr>
+        <w:jc w:val="both"/>
         <w:rPr>
           <w:b/>
           <w:bCs/>
@@ -169,38 +203,75 @@
         <w:jc w:val="both"/>
       </w:pPr>
       <w:r>
-        <w:t xml:space="preserve">Hotels in Sri Lanka and similar developing economies face several challenges in </w:t>
-      </w:r>
-      <w:r>
-        <w:t>modernizing</w:t>
-      </w:r>
-      <w:r>
-        <w:t xml:space="preserve"> their guest service operations. Existing commercial voice assistant systems are built upon cloud-dependent architectures that incur recurring subscription fees, require proprietary hardware, and transmit guest voice data to external servers raising both economic and privacy barriers to adoption. </w:t>
-      </w:r>
-    </w:p>
-    <w:p>
-      <w:pPr>
-        <w:jc w:val="both"/>
-      </w:pPr>
-      <w:r>
-        <w:t xml:space="preserve">Traditional room service communication primarily telephone-based suffers from language barriers, long wait times, and an absence of systematic request tracking, making quality assurance difficult. Furthermore, existing voice assistants are primarily </w:t>
-      </w:r>
-      <w:r>
-        <w:t>optimized</w:t>
-      </w:r>
-      <w:r>
-        <w:t xml:space="preserve"> for native English speakers, producing significantly degraded performance with </w:t>
-      </w:r>
-      <w:r>
-        <w:t>other</w:t>
-      </w:r>
-      <w:r>
-        <w:t xml:space="preserve"> accents common among both local staff and international guests in Sri Lanka.</w:t>
-      </w:r>
-    </w:p>
-    <w:p>
-      <w:pPr>
-        <w:jc w:val="both"/>
+        <w:t>Hotels in developing economies like Sri Lanka face a specific problem: the commercial voice assistant options are either too expensive or require cloud access that is not always reliable. Beyond cost, there is a real privacy issue guests are increasingly uncomfortable knowing their voice is being sent to a remote server.</w:t>
+      </w:r>
+    </w:p>
+    <w:p>
+      <w:pPr>
+        <w:jc w:val="both"/>
+      </w:pPr>
+      <w:r>
+        <w:t>Phone-based room service has its own problems too. There are language barriers, long wait times, and no way to systematically track whether requests are being handled. The whole process depends on staff availability at any given moment.</w:t>
+      </w:r>
+    </w:p>
+    <w:p>
+      <w:pPr>
+        <w:jc w:val="both"/>
+      </w:pPr>
+    </w:p>
+    <w:p>
+      <w:pPr>
+        <w:jc w:val="both"/>
+      </w:pPr>
+      <w:r>
+        <w:rPr>
+          <w:b/>
+          <w:bCs/>
+        </w:rPr>
+        <w:t>Research Question</w:t>
+      </w:r>
+    </w:p>
+    <w:p>
+      <w:pPr>
+        <w:jc w:val="both"/>
+      </w:pPr>
+      <w:r>
+        <w:t xml:space="preserve">Can a low-cost, fully offline voice assistant </w:t>
+      </w:r>
+      <w:r>
+        <w:t>system,</w:t>
+      </w:r>
+      <w:r>
+        <w:t xml:space="preserve"> built on a standard </w:t>
+      </w:r>
+      <w:r>
+        <w:t>commodity mobile</w:t>
+      </w:r>
+      <w:r>
+        <w:t xml:space="preserve"> device, achieve sufficient technical accuracy and performance to be a viable alternative to traditional room service communication in Sri Lankan hotels</w:t>
+      </w:r>
+      <w:r>
+        <w:t>?</w:t>
+      </w:r>
+    </w:p>
+    <w:p>
+      <w:pPr>
+        <w:jc w:val="both"/>
+      </w:pPr>
+      <w:r>
+        <w:t>The aim of this project is to design, build, and evaluate a complete system that runs inside a hotel's local network with no cloud dependency at all</w:t>
+      </w:r>
+      <w:r>
+        <w:t>.</w:t>
+      </w:r>
+    </w:p>
+    <w:p>
+      <w:pPr>
+        <w:jc w:val="both"/>
+        <w:rPr>
+          <w:b/>
+          <w:bCs/>
+        </w:rPr>
       </w:pPr>
       <w:r>
         <w:rPr>
@@ -208,160 +279,319 @@
           <w:bCs/>
         </w:rPr>
         <w:lastRenderedPageBreak/>
-        <w:t>Research Question</w:t>
-      </w:r>
-      <w:r>
-        <w:t>: How effective is a commodity hardware-based, offline voice assistant system at reducing operational inefficiency and improving service quality compared to traditional room service methods in Sri Lankan hotels?</w:t>
-      </w:r>
-    </w:p>
-    <w:p>
-      <w:pPr>
-        <w:jc w:val="both"/>
-      </w:pPr>
-      <w:r>
-        <w:t>This research aims to design, develop, and evaluate an integrated offline voice assistant system that operates entirely within a hotel's local network using commodity Android devices, small-scale on-device neural models, and a real-time hotel management backend without any cloud dependency.</w:t>
-      </w:r>
-    </w:p>
-    <w:p>
-      <w:pPr>
-        <w:rPr>
-          <w:b/>
-          <w:bCs/>
-        </w:rPr>
-      </w:pPr>
-      <w:r>
-        <w:rPr>
-          <w:b/>
-          <w:bCs/>
-        </w:rPr>
         <w:t>Objectives</w:t>
-      </w:r>
-    </w:p>
-    <w:p>
-      <w:pPr>
-        <w:jc w:val="both"/>
-      </w:pPr>
-      <w:r>
-        <w:t>Design, develop, and evaluate a low-cost, privacy-preserving offline voice assistant system for hotel room service operations that is deployable on commodity Android hardware.</w:t>
       </w:r>
     </w:p>
     <w:p>
       <w:pPr>
         <w:numPr>
           <w:ilvl w:val="0"/>
-          <w:numId w:val="1"/>
+          <w:numId w:val="4"/>
         </w:numPr>
         <w:jc w:val="both"/>
       </w:pPr>
       <w:r>
-        <w:t xml:space="preserve">Design and implement on-device speech-to-text (STT) using </w:t>
-      </w:r>
-      <w:proofErr w:type="spellStart"/>
-      <w:r>
-        <w:t>Vosk</w:t>
-      </w:r>
-      <w:proofErr w:type="spellEnd"/>
-      <w:r>
-        <w:t xml:space="preserve"> and on-device intent classification using a fine-tuned </w:t>
-      </w:r>
-      <w:proofErr w:type="spellStart"/>
-      <w:r>
-        <w:t>MobileBERT</w:t>
-      </w:r>
-      <w:proofErr w:type="spellEnd"/>
-      <w:r>
-        <w:t xml:space="preserve"> model converted to TensorFlow Lite</w:t>
+        <w:t xml:space="preserve">Design and build a fully offline, low-cost voice assistant prototype covering on-device speech recognition, intent classification, and the complete request lifecycle (submission, confirmation, cancellation, and rating) deployable on commodity </w:t>
+      </w:r>
+      <w:r>
+        <w:t>mobile</w:t>
+      </w:r>
+      <w:r>
+        <w:t xml:space="preserve"> hardware without any cloud dependency.</w:t>
       </w:r>
     </w:p>
     <w:p>
       <w:pPr>
         <w:numPr>
           <w:ilvl w:val="0"/>
-          <w:numId w:val="1"/>
+          <w:numId w:val="4"/>
         </w:numPr>
         <w:jc w:val="both"/>
       </w:pPr>
       <w:r>
-        <w:t xml:space="preserve">Create a hotel-specific intent classification dataset covering </w:t>
-      </w:r>
-      <w:r>
-        <w:t xml:space="preserve">most </w:t>
-      </w:r>
-      <w:r>
-        <w:t>common service request categories</w:t>
+        <w:t xml:space="preserve">Create a hotel-specific intent classification dataset covering the most common room service request </w:t>
+      </w:r>
+      <w:r>
+        <w:t>categories and</w:t>
+      </w:r>
+      <w:r>
+        <w:t xml:space="preserve"> train an intent classification model that can handle the accuracy challenges introduced by on-device speech recognition.</w:t>
       </w:r>
     </w:p>
     <w:p>
       <w:pPr>
         <w:numPr>
           <w:ilvl w:val="0"/>
-          <w:numId w:val="1"/>
+          <w:numId w:val="4"/>
         </w:numPr>
         <w:jc w:val="both"/>
       </w:pPr>
       <w:r>
-        <w:t>Build a real-time hotel management backend with automated department routing and a web-based staff dashboard for request tracking and bidirectional communication</w:t>
+        <w:t>Build a lightweight backend with automated department routing and a web-based staff dashboard, supporting real-time bidirectional communication between guests and hotel staff.</w:t>
       </w:r>
     </w:p>
     <w:p>
       <w:pPr>
         <w:numPr>
           <w:ilvl w:val="0"/>
-          <w:numId w:val="1"/>
+          <w:numId w:val="4"/>
         </w:numPr>
         <w:jc w:val="both"/>
       </w:pPr>
       <w:r>
-        <w:t>Implement voice-based interaction for the complete request lifecycle, including submission, confirmation, cancellation, and service rating</w:t>
-      </w:r>
-    </w:p>
-    <w:p>
-      <w:pPr>
+        <w:t>Evaluate the system's intent classification accuracy, end-to-end latency, and cost per request compared to cloud-based alternatives and demonstrate that a fully privacy-preserving, offline voice processing architecture is achievable on low-cost hardware.</w:t>
+      </w:r>
+    </w:p>
+    <w:p>
+      <w:pPr>
+        <w:jc w:val="both"/>
+        <w:rPr>
+          <w:b/>
+          <w:bCs/>
+          <w:lang w:val="en-GB"/>
+        </w:rPr>
+      </w:pPr>
+    </w:p>
+    <w:p>
+      <w:pPr>
+        <w:jc w:val="both"/>
+        <w:rPr>
+          <w:b/>
+          <w:bCs/>
+        </w:rPr>
+      </w:pPr>
+      <w:r>
+        <w:rPr>
+          <w:b/>
+          <w:bCs/>
+        </w:rPr>
+        <w:t>Literature Review</w:t>
+      </w:r>
+    </w:p>
+    <w:p>
+      <w:pPr>
+        <w:jc w:val="both"/>
+      </w:pPr>
+      <w:r>
+        <w:t xml:space="preserve">Voice assistants in hotels have been </w:t>
+      </w:r>
+      <w:proofErr w:type="gramStart"/>
+      <w:r>
+        <w:t>studied</w:t>
+      </w:r>
+      <w:proofErr w:type="gramEnd"/>
+      <w:r>
+        <w:t xml:space="preserve"> quite a bit. </w:t>
+      </w:r>
+      <w:proofErr w:type="spellStart"/>
+      <w:r>
+        <w:t>Buhalis</w:t>
+      </w:r>
+      <w:proofErr w:type="spellEnd"/>
+      <w:r>
+        <w:t xml:space="preserve"> and </w:t>
+      </w:r>
+      <w:proofErr w:type="spellStart"/>
+      <w:r>
+        <w:t>Moldavska</w:t>
+      </w:r>
+      <w:proofErr w:type="spellEnd"/>
+      <w:r>
+        <w:t xml:space="preserve"> (2022) found that while guests appreciate these systems, 67% feel uncomfortable with cloud-connected microphones in their rooms. Commercial deployments like Alexa for Hospitality need continuous internet access and ongoing API subscriptions  which </w:t>
+      </w:r>
+      <w:proofErr w:type="gramStart"/>
+      <w:r>
+        <w:t>is</w:t>
+      </w:r>
+      <w:proofErr w:type="gramEnd"/>
+      <w:r>
+        <w:t xml:space="preserve"> a real barrier for smaller hotels in developing countries.</w:t>
+      </w:r>
+    </w:p>
+    <w:p>
+      <w:pPr>
+        <w:jc w:val="both"/>
+      </w:pPr>
+      <w:r>
+        <w:t xml:space="preserve">Offline Speech Recognition has come a long way. </w:t>
+      </w:r>
+      <w:proofErr w:type="spellStart"/>
+      <w:r>
+        <w:t>Vosk</w:t>
+      </w:r>
+      <w:proofErr w:type="spellEnd"/>
+      <w:r>
+        <w:t xml:space="preserve"> (Alpha Cephei, 2020) is a lightweight offline speech recognition library that works well in privacy-sensitive environments. Korkmaz et al. (2025) showed </w:t>
+      </w:r>
+      <w:proofErr w:type="spellStart"/>
+      <w:r>
+        <w:t>Vosk</w:t>
+      </w:r>
+      <w:proofErr w:type="spellEnd"/>
+      <w:r>
+        <w:t xml:space="preserve"> running on edge hardware with very low latency, making it a practical choice for real-time use. OpenAI's Whisper (Radford et al., 2023) is more accurate, but it needs far more computing power than a budget Android device can provide.</w:t>
+      </w:r>
+    </w:p>
+    <w:p>
+      <w:pPr>
+        <w:jc w:val="both"/>
+      </w:pPr>
+      <w:r>
+        <w:t xml:space="preserve">Small-Scale NLU Models make it possible to run natural language understanding on a phone or tablet. </w:t>
+      </w:r>
+      <w:proofErr w:type="spellStart"/>
+      <w:r>
+        <w:t>MobileBERT</w:t>
+      </w:r>
+      <w:proofErr w:type="spellEnd"/>
+      <w:r>
+        <w:t xml:space="preserve"> (Sun et al., 2020) compresses the original BERT model to 4.3× smaller and 5.5× faster while keeping 96% of its accuracy. It can run on Android via </w:t>
+      </w:r>
+      <w:proofErr w:type="spellStart"/>
+      <w:r>
+        <w:t>TFLite</w:t>
+      </w:r>
+      <w:proofErr w:type="spellEnd"/>
+      <w:r>
+        <w:t xml:space="preserve">. </w:t>
+      </w:r>
+      <w:proofErr w:type="spellStart"/>
+      <w:r>
+        <w:t>DistilBERT</w:t>
+      </w:r>
+      <w:proofErr w:type="spellEnd"/>
+      <w:r>
+        <w:t xml:space="preserve"> (Sanh et al., 2019) is another option  40% </w:t>
+      </w:r>
+      <w:proofErr w:type="gramStart"/>
+      <w:r>
+        <w:t>smaller, but</w:t>
+      </w:r>
+      <w:proofErr w:type="gramEnd"/>
+      <w:r>
+        <w:t xml:space="preserve"> retaining 97% of BERT's performance. </w:t>
+      </w:r>
+      <w:proofErr w:type="spellStart"/>
+      <w:r>
+        <w:t>Bujel</w:t>
+      </w:r>
+      <w:proofErr w:type="spellEnd"/>
+      <w:r>
+        <w:t xml:space="preserve"> et al. (2021) showed that fine-tuning these models with roughly 1,000 examples per class is enough to get strong results on domain-specific tasks, which is useful here since a </w:t>
+      </w:r>
+      <w:proofErr w:type="gramStart"/>
+      <w:r>
+        <w:t>large labelled</w:t>
+      </w:r>
+      <w:proofErr w:type="gramEnd"/>
+      <w:r>
+        <w:t xml:space="preserve"> hospitality dataset does </w:t>
+      </w:r>
+      <w:proofErr w:type="gramStart"/>
+      <w:r>
+        <w:t>not already</w:t>
+      </w:r>
+      <w:proofErr w:type="gramEnd"/>
+      <w:r>
+        <w:t xml:space="preserve"> exist.</w:t>
+      </w:r>
+    </w:p>
+    <w:p>
+      <w:pPr>
+        <w:jc w:val="both"/>
+      </w:pPr>
+      <w:r>
+        <w:lastRenderedPageBreak/>
+        <w:t xml:space="preserve">Edge Computing and Privacy are central to this project's design. Shi et al. (2016) established that processing data at the network edge rather than sending it to the cloud cuts both latency and privacy risk. Purdue University (2018) documented specific privacy vulnerabilities in hotel Alexa deployments. More recent work (2025) showed that </w:t>
+      </w:r>
+      <w:r>
+        <w:t xml:space="preserve">a custom </w:t>
+      </w:r>
+      <w:proofErr w:type="spellStart"/>
+      <w:r>
+        <w:t>Vosk</w:t>
+      </w:r>
+      <w:proofErr w:type="spellEnd"/>
+      <w:r>
+        <w:t xml:space="preserve"> model can achieve a 40% Word Error Rate (WER) reduction over cloud STT</w:t>
+      </w:r>
+      <w:r>
+        <w:t xml:space="preserve"> while keeping all audio local.</w:t>
+      </w:r>
+    </w:p>
+    <w:p>
+      <w:pPr>
+        <w:jc w:val="both"/>
+      </w:pPr>
+      <w:r>
+        <w:t>Task-Oriented Dialogue research (Larson et al., 2022) shows there is a clear gap in hospitality-specific datasets and on-device NLU pipelines. Rasa's DIET architecture (Bunk et al., 2020) handles intent classification well, but it runs on a server not on a mobile device. No published system combines offline STT, on-device NLU, and a hotel management backend in one integrated product.</w:t>
+      </w:r>
+    </w:p>
+    <w:p>
+      <w:pPr>
+        <w:jc w:val="both"/>
+        <w:rPr>
+          <w:b/>
+          <w:bCs/>
+        </w:rPr>
+      </w:pPr>
+    </w:p>
+    <w:p>
+      <w:pPr>
+        <w:jc w:val="both"/>
+      </w:pPr>
+      <w:r>
+        <w:rPr>
+          <w:b/>
+          <w:bCs/>
+        </w:rPr>
+        <w:t>Research Gap:</w:t>
+      </w:r>
+      <w:r>
+        <w:t xml:space="preserve"> The individual </w:t>
+      </w:r>
+      <w:proofErr w:type="gramStart"/>
+      <w:r>
+        <w:t>components</w:t>
+      </w:r>
+      <w:proofErr w:type="gramEnd"/>
+      <w:r>
+        <w:t xml:space="preserve"> offline STT, on-device NLU, hotel management systems all exist, but nobody has combined them into a single, fully offline hospitality voice assistant. More specifically, training NLU models to handle speech recognition output is an established technique for cloud systems, but no published work applies this to offline, on-device deployments in a hospitality context. This research addresses that gap directly.</w:t>
+      </w:r>
+    </w:p>
+    <w:p>
+      <w:pPr>
+        <w:jc w:val="both"/>
+        <w:rPr>
+          <w:b/>
+          <w:bCs/>
+        </w:rPr>
+      </w:pPr>
+    </w:p>
+    <w:p>
+      <w:pPr>
+        <w:jc w:val="both"/>
+        <w:rPr>
+          <w:b/>
+          <w:bCs/>
+        </w:rPr>
+      </w:pPr>
+      <w:r>
+        <w:rPr>
+          <w:b/>
+          <w:bCs/>
+        </w:rPr>
+        <w:t>Methodology</w:t>
+      </w:r>
+    </w:p>
+    <w:p>
+      <w:pPr>
+        <w:pStyle w:val="ListParagraph"/>
         <w:numPr>
           <w:ilvl w:val="0"/>
-          <w:numId w:val="1"/>
+          <w:numId w:val="8"/>
         </w:numPr>
         <w:jc w:val="both"/>
-      </w:pPr>
-      <w:r>
-        <w:t xml:space="preserve">Evaluate the </w:t>
-      </w:r>
-      <w:r>
-        <w:t xml:space="preserve">edge </w:t>
-      </w:r>
-      <w:r>
-        <w:t>system's intent classification accuracy, end-to-end latency, and cost-effectiveness compared to cloud</w:t>
-      </w:r>
-      <w:r>
-        <w:t xml:space="preserve">/on-prem server </w:t>
-      </w:r>
-      <w:r>
-        <w:t>based alternatives</w:t>
-      </w:r>
-    </w:p>
-    <w:p>
-      <w:pPr>
-        <w:numPr>
-          <w:ilvl w:val="0"/>
-          <w:numId w:val="1"/>
-        </w:numPr>
-        <w:jc w:val="both"/>
-      </w:pPr>
-      <w:r>
-        <w:t>Demonstrate a privacy-preserving edge computing architecture for hospitality AI with no external voice data transmission</w:t>
-      </w:r>
-    </w:p>
-    <w:p>
-      <w:pPr>
-        <w:rPr>
-          <w:b/>
-          <w:bCs/>
-          <w:lang w:val="en-GB"/>
-        </w:rPr>
-      </w:pPr>
-    </w:p>
-    <w:p>
-      <w:pPr>
         <w:rPr>
           <w:b/>
           <w:bCs/>
@@ -377,172 +607,11 @@
     </w:p>
     <w:p>
       <w:pPr>
-        <w:jc w:val="both"/>
-      </w:pPr>
-      <w:r>
-        <w:t xml:space="preserve">The adoption of voice assistants in the hospitality industry has gained significant momentum, with major hotel chains deploying Amazon Alexa for Hospitality and Google Nest Hub. Research by </w:t>
-      </w:r>
-      <w:proofErr w:type="spellStart"/>
-      <w:r>
-        <w:t>Buhalis</w:t>
-      </w:r>
-      <w:proofErr w:type="spellEnd"/>
-      <w:r>
-        <w:t xml:space="preserve"> and </w:t>
-      </w:r>
-      <w:proofErr w:type="spellStart"/>
-      <w:r>
-        <w:t>Moldavska</w:t>
-      </w:r>
-      <w:proofErr w:type="spellEnd"/>
-      <w:r>
-        <w:t xml:space="preserve"> (2022) highlighted that while AI-powered voice assistants improve guest satisfaction and operational efficiency, privacy concerns remain a significant barrier to adoption, with 67% of hotel guests expressing discomfort with cloud-connected microphones in their rooms. These commercial deployments require </w:t>
-      </w:r>
-      <w:r>
-        <w:lastRenderedPageBreak/>
-        <w:t>continuous cloud connectivity and incur ongoing API costs limitations that are especially prohibitive for hotels in developing economies.</w:t>
-      </w:r>
-    </w:p>
-    <w:p>
-      <w:pPr>
-        <w:jc w:val="both"/>
-      </w:pPr>
-      <w:r>
-        <w:t xml:space="preserve">Offline Speech Recognition has advanced considerably with models such as </w:t>
-      </w:r>
-      <w:proofErr w:type="spellStart"/>
-      <w:r>
-        <w:t>Vosk</w:t>
-      </w:r>
-      <w:proofErr w:type="spellEnd"/>
-      <w:r>
-        <w:t xml:space="preserve"> (Alpha Cephei, 2020), providing lightweight, offline-capable speech recognition suitable for privacy-sensitive applications. Korkmaz et al. (2025) demonstrated deployment of </w:t>
-      </w:r>
-      <w:proofErr w:type="spellStart"/>
-      <w:r>
-        <w:t>Vosk</w:t>
-      </w:r>
-      <w:proofErr w:type="spellEnd"/>
-      <w:r>
-        <w:t>-based STT on edge hardware with ultra-low latency, validating its suitability for real-time applications. OpenAI Whisper (Radford et al., 2023) achieves state-of-the-art accuracy but requires significant computational resources, making it unsuitable for on-device deployment on commodity Android hardware.</w:t>
-      </w:r>
-    </w:p>
-    <w:p>
-      <w:pPr>
-        <w:jc w:val="both"/>
-      </w:pPr>
-      <w:r>
-        <w:t xml:space="preserve">Small-Scale NLU Models have enabled on-device natural language understanding through knowledge distillation. </w:t>
-      </w:r>
-      <w:proofErr w:type="spellStart"/>
-      <w:r>
-        <w:t>MobileBERT</w:t>
-      </w:r>
-      <w:proofErr w:type="spellEnd"/>
-      <w:r>
-        <w:t xml:space="preserve"> (Sun et al., 2020) achieves 4.3x compression and 5.5x speedup over BERT-Base while retaining 96% of its </w:t>
-      </w:r>
-      <w:proofErr w:type="gramStart"/>
-      <w:r>
-        <w:t>performance, and</w:t>
-      </w:r>
-      <w:proofErr w:type="gramEnd"/>
-      <w:r>
-        <w:t xml:space="preserve"> is deployable via TensorFlow Lite on mobile devices. </w:t>
-      </w:r>
-      <w:proofErr w:type="spellStart"/>
-      <w:r>
-        <w:t>DistilBERT</w:t>
-      </w:r>
-      <w:proofErr w:type="spellEnd"/>
-      <w:r>
-        <w:t xml:space="preserve"> (Sanh et al., 2019) similarly retains 97% of BERT's accuracy at 40% smaller size. </w:t>
-      </w:r>
-      <w:proofErr w:type="spellStart"/>
-      <w:r>
-        <w:t>Bujel</w:t>
-      </w:r>
-      <w:proofErr w:type="spellEnd"/>
-      <w:r>
-        <w:t xml:space="preserve"> et al. (2021) demonstrated that fine-tuning BERT variants with approximately 1,000 labelled examples per class achieves strong intent classification accuracy on domain-specific datasets, validating the feasibility of hotel-specific NLU training with limited data.</w:t>
-      </w:r>
-    </w:p>
-    <w:p>
-      <w:pPr>
-        <w:jc w:val="both"/>
-      </w:pPr>
-      <w:r>
-        <w:t xml:space="preserve">Edge Computing and Privacy-Preserving AI form a critical theoretical foundation for this research. Shi et al. (2016) established the framework for edge intelligence, demonstrating that processing data locally at the network edge reduces both latency and privacy risks. Privacy vulnerabilities in hotel Alexa deployments have been documented (Purdue University, 2018), reinforcing the need for local-processing alternatives. Recent work on privacy-preserving on-device speech recognition (2025) demonstrated that custom </w:t>
-      </w:r>
-      <w:proofErr w:type="spellStart"/>
-      <w:r>
-        <w:t>Vosk</w:t>
-      </w:r>
-      <w:proofErr w:type="spellEnd"/>
-      <w:r>
-        <w:t xml:space="preserve"> models can outperform cloud STT with a 40% Word Error Rate (WER) reduction while processing all audio locally.</w:t>
-      </w:r>
-    </w:p>
-    <w:p>
-      <w:pPr>
-        <w:jc w:val="both"/>
-      </w:pPr>
-      <w:r>
-        <w:t>Task-Oriented Dialogue Systems for domain-specific applications have been surveyed extensively (Larson et al., 2022), identifying a critical gap in hospitality-specific datasets and on-device intent classification pipelines. Rasa's DIET architecture (Bunk et al., 2020) provides server-side intent classification but does not support on-device mobile inference. No existing published work combines offline STT, on-device NLU, and a real-time hotel management backend into a single integrated system for hospitality operations.</w:t>
-      </w:r>
-    </w:p>
-    <w:p>
-      <w:pPr>
-        <w:jc w:val="both"/>
-      </w:pPr>
-    </w:p>
-    <w:p>
-      <w:pPr>
-        <w:jc w:val="both"/>
-      </w:pPr>
-    </w:p>
-    <w:p>
-      <w:pPr>
-        <w:jc w:val="both"/>
-      </w:pPr>
-    </w:p>
-    <w:p>
-      <w:pPr>
-        <w:jc w:val="both"/>
-      </w:pPr>
-      <w:r>
-        <w:rPr>
-          <w:b/>
-          <w:bCs/>
-        </w:rPr>
-        <w:lastRenderedPageBreak/>
-        <w:t>Research Gap</w:t>
-      </w:r>
-      <w:r>
-        <w:t>: While individual components offline STT, mobile NLU, and hotel management systems exist in isolation, no published research combines them into an integrated, low-cost, offline-capable voice assistant specifically designed for hospitality services in developing economies. This research addresses this gap by providing a complete end-to-end system operating entirely within a hotel's local network on commodity hardware.</w:t>
-      </w:r>
-    </w:p>
-    <w:p>
-      <w:pPr>
-        <w:rPr>
-          <w:b/>
-          <w:bCs/>
-        </w:rPr>
-      </w:pPr>
-      <w:r>
-        <w:rPr>
-          <w:b/>
-          <w:bCs/>
-        </w:rPr>
-        <w:t>Methodology</w:t>
-      </w:r>
-    </w:p>
-    <w:p>
-      <w:pPr>
-        <w:jc w:val="both"/>
-      </w:pPr>
-      <w:r>
-        <w:t>The following methodology has been identified for this research:</w:t>
+        <w:ind w:left="360"/>
+        <w:jc w:val="both"/>
+      </w:pPr>
+      <w:r>
+        <w:t>A thorough literature review will be conducted covering:</w:t>
       </w:r>
     </w:p>
     <w:p>
@@ -554,79 +623,7 @@
         <w:jc w:val="both"/>
       </w:pPr>
       <w:r>
-        <w:t>Comprehensive Literature Review Conduct a complete review of existing research on voice assistants in hospitality, offline speech recognition, small-scale neural models, edge computing, and privacy-preserving AI.</w:t>
-      </w:r>
-    </w:p>
-    <w:p>
-      <w:pPr>
-        <w:numPr>
-          <w:ilvl w:val="1"/>
-          <w:numId w:val="2"/>
-        </w:numPr>
-        <w:jc w:val="both"/>
-      </w:pPr>
-      <w:r>
-        <w:t>Voice Assistants in Hospitality: commercial deployments and guest experience research</w:t>
-      </w:r>
-    </w:p>
-    <w:p>
-      <w:pPr>
-        <w:numPr>
-          <w:ilvl w:val="1"/>
-          <w:numId w:val="2"/>
-        </w:numPr>
-        <w:jc w:val="both"/>
-      </w:pPr>
-      <w:r>
-        <w:t>Offline and Edge-Based Speech Recognition Systems</w:t>
-      </w:r>
-    </w:p>
-    <w:p>
-      <w:pPr>
-        <w:numPr>
-          <w:ilvl w:val="1"/>
-          <w:numId w:val="2"/>
-        </w:numPr>
-        <w:jc w:val="both"/>
-      </w:pPr>
-      <w:r>
-        <w:t>Small-Scale NLU Models for Resource-Constrained Devices</w:t>
-      </w:r>
-    </w:p>
-    <w:p>
-      <w:pPr>
-        <w:numPr>
-          <w:ilvl w:val="1"/>
-          <w:numId w:val="2"/>
-        </w:numPr>
-        <w:jc w:val="both"/>
-      </w:pPr>
-      <w:r>
-        <w:t>Privacy-Preserving AI and Edge Computing Architectures</w:t>
-      </w:r>
-    </w:p>
-    <w:p>
-      <w:pPr>
-        <w:numPr>
-          <w:ilvl w:val="1"/>
-          <w:numId w:val="2"/>
-        </w:numPr>
-        <w:jc w:val="both"/>
-      </w:pPr>
-      <w:r>
-        <w:t>Task-Oriented Dialogue Systems and Intent Classification</w:t>
-      </w:r>
-    </w:p>
-    <w:p>
-      <w:pPr>
-        <w:numPr>
-          <w:ilvl w:val="1"/>
-          <w:numId w:val="2"/>
-        </w:numPr>
-        <w:jc w:val="both"/>
-      </w:pPr>
-      <w:r>
-        <w:t>Sri Lankan hospitality industry context and digital readiness</w:t>
+        <w:t>Voice assistants in hospitality: commercial products and guest experience research</w:t>
       </w:r>
     </w:p>
     <w:p>
@@ -638,58 +635,7 @@
         <w:jc w:val="both"/>
       </w:pPr>
       <w:r>
-        <w:t>Problem Definition and Dataset Preparation Define system requirements based on the operational needs of Sri Lankan hotels and create a domain-specific training dataset.</w:t>
-      </w:r>
-    </w:p>
-    <w:p>
-      <w:pPr>
-        <w:numPr>
-          <w:ilvl w:val="1"/>
-          <w:numId w:val="2"/>
-        </w:numPr>
-        <w:jc w:val="both"/>
-      </w:pPr>
-      <w:r>
-        <w:t>Identify the most common hotel service request intent categories</w:t>
-      </w:r>
-    </w:p>
-    <w:p>
-      <w:pPr>
-        <w:numPr>
-          <w:ilvl w:val="1"/>
-          <w:numId w:val="2"/>
-        </w:numPr>
-        <w:jc w:val="both"/>
-      </w:pPr>
-      <w:r>
-        <w:t>Curate approximately 5,000 labelled natural language examples with colloquial and accent-influenced variations</w:t>
-      </w:r>
-    </w:p>
-    <w:p>
-      <w:pPr>
-        <w:numPr>
-          <w:ilvl w:val="1"/>
-          <w:numId w:val="2"/>
-        </w:numPr>
-        <w:jc w:val="both"/>
-      </w:pPr>
-      <w:r>
-        <w:t>Apply stratified splitting (85% training / 15% validation) for balanced class representation</w:t>
-      </w:r>
-    </w:p>
-    <w:p>
-      <w:pPr>
-        <w:numPr>
-          <w:ilvl w:val="1"/>
-          <w:numId w:val="2"/>
-        </w:numPr>
-        <w:jc w:val="both"/>
-      </w:pPr>
-      <w:r>
-        <w:t xml:space="preserve">Augment training data with paraphrasing and synonym replacement to improve </w:t>
-      </w:r>
-      <w:r>
-        <w:t>generalization</w:t>
+        <w:t>Offline and edge-based speech recognition systems</w:t>
       </w:r>
     </w:p>
     <w:p>
@@ -701,110 +647,7 @@
         <w:jc w:val="both"/>
       </w:pPr>
       <w:r>
-        <w:t>Model Development and Training Develop and train the on-device speech and language understanding components.</w:t>
-      </w:r>
-    </w:p>
-    <w:p>
-      <w:pPr>
-        <w:numPr>
-          <w:ilvl w:val="1"/>
-          <w:numId w:val="2"/>
-        </w:numPr>
-        <w:jc w:val="both"/>
-      </w:pPr>
-      <w:r>
-        <w:lastRenderedPageBreak/>
-        <w:t xml:space="preserve">Deploy </w:t>
-      </w:r>
-      <w:proofErr w:type="spellStart"/>
-      <w:r>
-        <w:t>Vosk</w:t>
-      </w:r>
-      <w:proofErr w:type="spellEnd"/>
-      <w:r>
-        <w:t xml:space="preserve"> offline STT (vosk-model-en-</w:t>
-      </w:r>
-      <w:r>
-        <w:t>in</w:t>
-      </w:r>
-      <w:r>
-        <w:t>-0.22, 205MB) with custom Voice Activity Detection</w:t>
-      </w:r>
-    </w:p>
-    <w:p>
-      <w:pPr>
-        <w:numPr>
-          <w:ilvl w:val="1"/>
-          <w:numId w:val="2"/>
-        </w:numPr>
-        <w:jc w:val="both"/>
-      </w:pPr>
-      <w:r>
-        <w:t xml:space="preserve">Fine-tune </w:t>
-      </w:r>
-      <w:proofErr w:type="spellStart"/>
-      <w:r>
-        <w:t>MobileBERT</w:t>
-      </w:r>
-      <w:proofErr w:type="spellEnd"/>
-      <w:r>
-        <w:t xml:space="preserve"> (google/</w:t>
-      </w:r>
-      <w:proofErr w:type="spellStart"/>
-      <w:r>
-        <w:t>mobilebert</w:t>
-      </w:r>
-      <w:proofErr w:type="spellEnd"/>
-      <w:r>
-        <w:t xml:space="preserve">-uncased) on the hotel intent dataset using </w:t>
-      </w:r>
-      <w:proofErr w:type="spellStart"/>
-      <w:r>
-        <w:t>AdamW</w:t>
-      </w:r>
-      <w:proofErr w:type="spellEnd"/>
-      <w:r>
-        <w:t xml:space="preserve"> </w:t>
-      </w:r>
-      <w:proofErr w:type="spellStart"/>
-      <w:r>
-        <w:t>optimiser</w:t>
-      </w:r>
-      <w:proofErr w:type="spellEnd"/>
-    </w:p>
-    <w:p>
-      <w:pPr>
-        <w:numPr>
-          <w:ilvl w:val="1"/>
-          <w:numId w:val="2"/>
-        </w:numPr>
-        <w:jc w:val="both"/>
-      </w:pPr>
-      <w:r>
-        <w:t>Convert the trained model to TensorFlow Lite format for on-device Android inference</w:t>
-      </w:r>
-    </w:p>
-    <w:p>
-      <w:pPr>
-        <w:numPr>
-          <w:ilvl w:val="1"/>
-          <w:numId w:val="2"/>
-        </w:numPr>
-        <w:jc w:val="both"/>
-      </w:pPr>
-      <w:r>
-        <w:t xml:space="preserve">Implement a hybrid classification pipeline: Rule-based keyword matching (Tier 1, confidence 0.99) + </w:t>
-      </w:r>
-      <w:proofErr w:type="spellStart"/>
-      <w:r>
-        <w:t>MobileBERT</w:t>
-      </w:r>
-      <w:proofErr w:type="spellEnd"/>
-      <w:r>
-        <w:t xml:space="preserve"> inference (Tier 2) with a minimum </w:t>
-      </w:r>
-      <w:r>
-        <w:t>confidence threshold of 0.60</w:t>
+        <w:t>Small-scale NLU models for resource-constrained devices</w:t>
       </w:r>
     </w:p>
     <w:p>
@@ -816,57 +659,7 @@
         <w:jc w:val="both"/>
       </w:pPr>
       <w:r>
-        <w:t>System Development Design and implement the complete end-to-end system</w:t>
-      </w:r>
-      <w:r>
-        <w:t xml:space="preserve"> prototype </w:t>
-      </w:r>
-      <w:r>
-        <w:t>across three components:</w:t>
-      </w:r>
-    </w:p>
-    <w:p>
-      <w:pPr>
-        <w:numPr>
-          <w:ilvl w:val="1"/>
-          <w:numId w:val="2"/>
-        </w:numPr>
-        <w:jc w:val="both"/>
-      </w:pPr>
-      <w:r>
-        <w:t>Android Application (Guest Device): Kotlin with Jetpack Compose; on-device STT and NLU; voice confirmation, cancellation, and rating; real-time WebSocket status updates</w:t>
-      </w:r>
-    </w:p>
-    <w:p>
-      <w:pPr>
-        <w:numPr>
-          <w:ilvl w:val="1"/>
-          <w:numId w:val="2"/>
-        </w:numPr>
-        <w:jc w:val="both"/>
-      </w:pPr>
-      <w:r>
-        <w:t xml:space="preserve">Backend Server: </w:t>
-      </w:r>
-      <w:proofErr w:type="spellStart"/>
-      <w:r>
-        <w:t>FastAPI</w:t>
-      </w:r>
-      <w:proofErr w:type="spellEnd"/>
-      <w:r>
-        <w:t xml:space="preserve"> (Python) with SQLite; RESTful API for request lifecycle management; WebSocket hub for real-time bidirectional communication; automatic intent-to-department routing across 5 departments</w:t>
-      </w:r>
-    </w:p>
-    <w:p>
-      <w:pPr>
-        <w:numPr>
-          <w:ilvl w:val="1"/>
-          <w:numId w:val="2"/>
-        </w:numPr>
-        <w:jc w:val="both"/>
-      </w:pPr>
-      <w:r>
-        <w:t>Staff Dashboard: Single-page web application; department-specific request queues; status management; staff-to-guest messaging; browser desktop notifications; live WebSocket connection status</w:t>
+        <w:t>Privacy-preserving AI and edge computing architectures</w:t>
       </w:r>
     </w:p>
     <w:p>
@@ -878,97 +671,357 @@
         <w:jc w:val="both"/>
       </w:pPr>
       <w:r>
-        <w:t>Evaluation Metrics and Testing Evaluate the system across model performance, system performance, cost, and user dimensions.</w:t>
+        <w:t>Task-oriented dialogue systems and intent classification</w:t>
       </w:r>
     </w:p>
     <w:p>
       <w:pPr>
         <w:numPr>
-          <w:ilvl w:val="1"/>
+          <w:ilvl w:val="0"/>
           <w:numId w:val="2"/>
         </w:numPr>
         <w:jc w:val="both"/>
       </w:pPr>
       <w:r>
-        <w:t>Quantitative Analysis</w:t>
-      </w:r>
-    </w:p>
-    <w:p>
-      <w:pPr>
+        <w:t>Sri Lankan hospitality context and digital readiness</w:t>
+      </w:r>
+    </w:p>
+    <w:p>
+      <w:pPr>
+        <w:ind w:left="720"/>
+        <w:jc w:val="both"/>
+      </w:pPr>
+    </w:p>
+    <w:p>
+      <w:pPr>
+        <w:ind w:left="720"/>
+        <w:jc w:val="both"/>
+      </w:pPr>
+    </w:p>
+    <w:p>
+      <w:pPr>
+        <w:ind w:left="720"/>
+        <w:jc w:val="both"/>
+      </w:pPr>
+    </w:p>
+    <w:p>
+      <w:pPr>
+        <w:pStyle w:val="ListParagraph"/>
         <w:numPr>
-          <w:ilvl w:val="2"/>
+          <w:ilvl w:val="0"/>
+          <w:numId w:val="8"/>
+        </w:numPr>
+        <w:jc w:val="both"/>
+        <w:rPr>
+          <w:b/>
+          <w:bCs/>
+        </w:rPr>
+      </w:pPr>
+      <w:r>
+        <w:rPr>
+          <w:b/>
+          <w:bCs/>
+        </w:rPr>
+        <w:lastRenderedPageBreak/>
+        <w:t>Dataset Preparation</w:t>
+      </w:r>
+    </w:p>
+    <w:p>
+      <w:pPr>
+        <w:numPr>
+          <w:ilvl w:val="0"/>
           <w:numId w:val="2"/>
         </w:numPr>
         <w:jc w:val="both"/>
       </w:pPr>
       <w:r>
-        <w:t>NLU Intent Accuracy</w:t>
+        <w:t>The first step is deciding what the system needs to understand what kinds of requests hotel guests typically make</w:t>
+      </w:r>
+      <w:r>
+        <w:t xml:space="preserve"> and categorize them</w:t>
+      </w:r>
+      <w:r>
+        <w:t>, and which department each one belongs to.</w:t>
       </w:r>
     </w:p>
     <w:p>
       <w:pPr>
         <w:numPr>
-          <w:ilvl w:val="2"/>
+          <w:ilvl w:val="0"/>
           <w:numId w:val="2"/>
         </w:numPr>
         <w:jc w:val="both"/>
       </w:pPr>
       <w:r>
-        <w:t>STT Word Error Rate (WER) benchmark on hotel-domain speech</w:t>
+        <w:t xml:space="preserve">Once those categories are defined, a labelled dataset will be built with enough examples per category to train a reliable intent classifier. The examples will cover different ways of phrasing the same request formal, casual, short, indirect because guests do not all speak the same way. The class distribution will be kept </w:t>
+      </w:r>
+      <w:proofErr w:type="gramStart"/>
+      <w:r>
+        <w:t>balanced</w:t>
+      </w:r>
+      <w:proofErr w:type="gramEnd"/>
+      <w:r>
+        <w:t xml:space="preserve"> so no single intent dominates the training data.</w:t>
       </w:r>
     </w:p>
     <w:p>
       <w:pPr>
         <w:numPr>
-          <w:ilvl w:val="2"/>
+          <w:ilvl w:val="0"/>
           <w:numId w:val="2"/>
         </w:numPr>
         <w:jc w:val="both"/>
       </w:pPr>
       <w:r>
-        <w:t>End-to-end latency measurement per pipeline stage</w:t>
-      </w:r>
-    </w:p>
-    <w:p>
-      <w:pPr>
+        <w:t xml:space="preserve">The dataset will also need to reflect what the model </w:t>
+      </w:r>
+      <w:proofErr w:type="gramStart"/>
+      <w:r>
+        <w:t>actually receives</w:t>
+      </w:r>
+      <w:proofErr w:type="gramEnd"/>
+      <w:r>
+        <w:t xml:space="preserve"> in practice not perfect, clean text, but the kind of slightly imperfect output that comes from a speech recognition engine. The data will be split into training and validation sets using a stratified approach, so every intent is represented fairly in both.</w:t>
+      </w:r>
+    </w:p>
+    <w:p>
+      <w:pPr>
+        <w:pStyle w:val="ListParagraph"/>
         <w:numPr>
-          <w:ilvl w:val="1"/>
+          <w:ilvl w:val="0"/>
+          <w:numId w:val="8"/>
+        </w:numPr>
+        <w:jc w:val="both"/>
+        <w:rPr>
+          <w:b/>
+          <w:bCs/>
+        </w:rPr>
+      </w:pPr>
+      <w:r>
+        <w:rPr>
+          <w:b/>
+          <w:bCs/>
+        </w:rPr>
+        <w:t>Model Training</w:t>
+      </w:r>
+    </w:p>
+    <w:p>
+      <w:pPr>
+        <w:numPr>
+          <w:ilvl w:val="0"/>
           <w:numId w:val="2"/>
         </w:numPr>
         <w:jc w:val="both"/>
       </w:pPr>
       <w:r>
-        <w:t>System Performance Analysis</w:t>
+        <w:t xml:space="preserve">An offline speech recognition model will be selected based on suitability for low-resource </w:t>
+      </w:r>
+      <w:r>
+        <w:t>commodity</w:t>
+      </w:r>
+      <w:r>
+        <w:t xml:space="preserve"> hardwar</w:t>
+      </w:r>
+      <w:r>
+        <w:t>e</w:t>
+      </w:r>
+      <w:r>
+        <w:t xml:space="preserve">. </w:t>
+      </w:r>
+      <w:r>
+        <w:t xml:space="preserve">The intent classification model will be </w:t>
+      </w:r>
+      <w:r>
+        <w:t xml:space="preserve">a compact, fine-tuned language model chosen for its ability to run </w:t>
+      </w:r>
+      <w:proofErr w:type="gramStart"/>
+      <w:r>
+        <w:t>on-device</w:t>
+      </w:r>
+      <w:proofErr w:type="gramEnd"/>
+      <w:r>
+        <w:t>.</w:t>
       </w:r>
     </w:p>
     <w:p>
       <w:pPr>
         <w:numPr>
-          <w:ilvl w:val="2"/>
+          <w:ilvl w:val="0"/>
           <w:numId w:val="2"/>
         </w:numPr>
         <w:jc w:val="both"/>
       </w:pPr>
       <w:r>
-        <w:t>CPU</w:t>
-      </w:r>
-      <w:r>
-        <w:t xml:space="preserve"> and </w:t>
-      </w:r>
-      <w:r>
-        <w:t>memory consumption on commodity Android devices at varying price points</w:t>
-      </w:r>
-    </w:p>
-    <w:p>
-      <w:pPr>
+        <w:t xml:space="preserve">The model will be trained on the prepared dataset and converted to </w:t>
+      </w:r>
+      <w:r>
+        <w:t xml:space="preserve">a mobile device compatible </w:t>
+      </w:r>
+      <w:r>
+        <w:t xml:space="preserve">format for on-device </w:t>
+      </w:r>
+      <w:r>
+        <w:t>d</w:t>
+      </w:r>
+      <w:r>
+        <w:t xml:space="preserve">eployment. The NLU pipeline will combine rule-based keyword matching for common, high-confidence requests with the neural model for the wider range of phrasing </w:t>
+      </w:r>
+      <w:r>
+        <w:t>g</w:t>
+      </w:r>
+      <w:r>
+        <w:t>iving better overall reliability than either approach alone.</w:t>
+      </w:r>
+    </w:p>
+    <w:p>
+      <w:pPr>
+        <w:pStyle w:val="ListParagraph"/>
         <w:numPr>
-          <w:ilvl w:val="2"/>
+          <w:ilvl w:val="0"/>
+          <w:numId w:val="8"/>
+        </w:numPr>
+        <w:jc w:val="both"/>
+        <w:rPr>
+          <w:b/>
+          <w:bCs/>
+        </w:rPr>
+      </w:pPr>
+      <w:r>
+        <w:rPr>
+          <w:b/>
+          <w:bCs/>
+        </w:rPr>
+        <w:t>System Development</w:t>
+      </w:r>
+    </w:p>
+    <w:p>
+      <w:pPr>
+        <w:ind w:firstLine="360"/>
+        <w:jc w:val="both"/>
+      </w:pPr>
+      <w:r>
+        <w:t>The full system will be built across three components:</w:t>
+      </w:r>
+    </w:p>
+    <w:p>
+      <w:pPr>
+        <w:numPr>
+          <w:ilvl w:val="0"/>
           <w:numId w:val="2"/>
         </w:numPr>
         <w:jc w:val="both"/>
       </w:pPr>
       <w:r>
-        <w:t xml:space="preserve">Cost-per-request comparison against cloud-based alternatives (Alexa, Google, </w:t>
+        <w:t>Android App (Guest Device): On-device speech recognition and intent classification, covering the full request lifecycle submission, confirmation, cancellation, and rating with real-time status updates from the hotel server.</w:t>
+      </w:r>
+    </w:p>
+    <w:p>
+      <w:pPr>
+        <w:numPr>
+          <w:ilvl w:val="0"/>
+          <w:numId w:val="2"/>
+        </w:numPr>
+        <w:jc w:val="both"/>
+      </w:pPr>
+      <w:r>
+        <w:t>Backend Server: Manages the request lifecycle, routes requests to the correct department automatically, and handles real-time bidirectional communication with both guest devices and staff.</w:t>
+      </w:r>
+    </w:p>
+    <w:p>
+      <w:pPr>
+        <w:numPr>
+          <w:ilvl w:val="0"/>
+          <w:numId w:val="2"/>
+        </w:numPr>
+        <w:jc w:val="both"/>
+      </w:pPr>
+      <w:r>
+        <w:t>Staff Dashboard: A web-based interface showing department-specific request queues, allowing staff to update request status and send messages back to guests.</w:t>
+      </w:r>
+    </w:p>
+    <w:p>
+      <w:pPr>
+        <w:pStyle w:val="ListParagraph"/>
+        <w:numPr>
+          <w:ilvl w:val="0"/>
+          <w:numId w:val="8"/>
+        </w:numPr>
+        <w:jc w:val="both"/>
+        <w:rPr>
+          <w:b/>
+          <w:bCs/>
+        </w:rPr>
+      </w:pPr>
+      <w:r>
+        <w:rPr>
+          <w:b/>
+          <w:bCs/>
+        </w:rPr>
+        <w:lastRenderedPageBreak/>
+        <w:t>Evaluation</w:t>
+      </w:r>
+    </w:p>
+    <w:p>
+      <w:pPr>
+        <w:ind w:firstLine="360"/>
+        <w:jc w:val="both"/>
+      </w:pPr>
+      <w:r>
+        <w:t>The system will be evaluated across three dimensions:</w:t>
+      </w:r>
+    </w:p>
+    <w:p>
+      <w:pPr>
+        <w:numPr>
+          <w:ilvl w:val="0"/>
+          <w:numId w:val="2"/>
+        </w:numPr>
+        <w:jc w:val="both"/>
+      </w:pPr>
+      <w:r>
+        <w:t>Intent classification accuracy</w:t>
+      </w:r>
+      <w:r>
+        <w:t>:</w:t>
+      </w:r>
+      <w:r>
+        <w:t> measured on both clean text and speech-transcribed input, to quantify any accuracy gap introduced by the on-device speech recognition step</w:t>
+      </w:r>
+    </w:p>
+    <w:p>
+      <w:pPr>
+        <w:numPr>
+          <w:ilvl w:val="0"/>
+          <w:numId w:val="2"/>
+        </w:numPr>
+        <w:jc w:val="both"/>
+      </w:pPr>
+      <w:r>
+        <w:t>System performance</w:t>
+      </w:r>
+      <w:r>
+        <w:t xml:space="preserve">: </w:t>
+      </w:r>
+      <w:r>
+        <w:t>end-to-end latency per pipeline stage and resource consumption on budget Android hardware</w:t>
+      </w:r>
+    </w:p>
+    <w:p>
+      <w:pPr>
+        <w:numPr>
+          <w:ilvl w:val="0"/>
+          <w:numId w:val="2"/>
+        </w:numPr>
+        <w:jc w:val="both"/>
+      </w:pPr>
+      <w:r>
+        <w:t>Cost</w:t>
+      </w:r>
+      <w:r>
+        <w:t xml:space="preserve">: </w:t>
+      </w:r>
+      <w:r>
+        <w:t xml:space="preserve">cost-per-request estimate compared to cloud-based voice assistant alternatives (Alexa, Google, </w:t>
       </w:r>
       <w:proofErr w:type="spellStart"/>
       <w:r>
@@ -976,23 +1029,41 @@
       </w:r>
       <w:proofErr w:type="spellEnd"/>
       <w:r>
-        <w:t xml:space="preserve"> -</w:t>
-      </w:r>
-      <w:r>
-        <w:t xml:space="preserve"> </w:t>
-      </w:r>
-      <w:r>
-        <w:t>research based</w:t>
-      </w:r>
-      <w:r>
         <w:t>)</w:t>
       </w:r>
     </w:p>
     <w:p>
-      <w:r>
+      <w:pPr>
+        <w:jc w:val="both"/>
+        <w:rPr>
+          <w:b/>
+          <w:bCs/>
+        </w:rPr>
+      </w:pPr>
+      <w:bookmarkStart w:id="2" w:name="_Toc223942199"/>
+      <w:r>
+        <w:rPr>
+          <w:b/>
+          <w:bCs/>
+        </w:rPr>
+        <w:br/>
+      </w:r>
+      <w:r>
+        <w:rPr>
+          <w:b/>
+          <w:bCs/>
+        </w:rPr>
         <w:br w:type="page"/>
       </w:r>
-      <w:bookmarkStart w:id="2" w:name="_Toc223942199"/>
+    </w:p>
+    <w:p>
+      <w:pPr>
+        <w:jc w:val="both"/>
+        <w:rPr>
+          <w:b/>
+          <w:bCs/>
+        </w:rPr>
+      </w:pPr>
       <w:r>
         <w:rPr>
           <w:b/>
@@ -1004,6 +1075,9 @@
       <w:bookmarkEnd w:id="2"/>
     </w:p>
     <w:p>
+      <w:pPr>
+        <w:jc w:val="both"/>
+      </w:pPr>
       <w:r>
         <w:t>The system operates across three distinct layers connected via a local Wi-Fi network within the hotel premises. No external internet connection is required for core operations.</w:t>
       </w:r>
@@ -1017,36 +1091,33 @@
     <w:p>
       <w:pPr>
         <w:spacing w:line="240" w:lineRule="auto"/>
-      </w:pPr>
-      <w:r>
-        <w:rPr>
-          <w:b/>
-          <w:bCs/>
-          <w:i/>
-          <w:iCs/>
+        <w:jc w:val="both"/>
+      </w:pPr>
+      <w:r>
+        <w:rPr>
           <w:noProof/>
         </w:rPr>
         <w:drawing>
-          <wp:anchor distT="0" distB="0" distL="114300" distR="114300" simplePos="0" relativeHeight="251659264" behindDoc="1" locked="0" layoutInCell="1" allowOverlap="1" wp14:anchorId="16472182" wp14:editId="41DD233C">
+          <wp:anchor distT="0" distB="0" distL="114300" distR="114300" simplePos="0" relativeHeight="251658240" behindDoc="1" locked="0" layoutInCell="1" allowOverlap="1" wp14:anchorId="2B488375" wp14:editId="72692EF1">
             <wp:simplePos x="0" y="0"/>
             <wp:positionH relativeFrom="column">
-              <wp:posOffset>1436370</wp:posOffset>
+              <wp:posOffset>1543050</wp:posOffset>
             </wp:positionH>
             <wp:positionV relativeFrom="paragraph">
-              <wp:posOffset>120954</wp:posOffset>
+              <wp:posOffset>53185</wp:posOffset>
             </wp:positionV>
-            <wp:extent cx="2830195" cy="6497320"/>
-            <wp:effectExtent l="0" t="0" r="8255" b="0"/>
+            <wp:extent cx="2769444" cy="6362700"/>
+            <wp:effectExtent l="0" t="0" r="0" b="0"/>
             <wp:wrapTight wrapText="bothSides">
               <wp:wrapPolygon edited="0">
                 <wp:start x="0" y="0"/>
-                <wp:lineTo x="0" y="21532"/>
-                <wp:lineTo x="21518" y="21532"/>
-                <wp:lineTo x="21518" y="0"/>
+                <wp:lineTo x="0" y="21535"/>
+                <wp:lineTo x="21397" y="21535"/>
+                <wp:lineTo x="21397" y="0"/>
                 <wp:lineTo x="0" y="0"/>
               </wp:wrapPolygon>
             </wp:wrapTight>
-            <wp:docPr id="515877267" name="Picture 1"/>
+            <wp:docPr id="1163854590" name="Picture 1"/>
             <wp:cNvGraphicFramePr>
               <a:graphicFrameLocks xmlns:a="http://schemas.openxmlformats.org/drawingml/2006/main" noChangeAspect="1"/>
             </wp:cNvGraphicFramePr>
@@ -1060,7 +1131,7 @@
                     </pic:cNvPicPr>
                   </pic:nvPicPr>
                   <pic:blipFill>
-                    <a:blip r:embed="rId6">
+                    <a:blip r:embed="rId8">
                       <a:extLst>
                         <a:ext uri="{28A0092B-C50C-407E-A947-70E740481C1C}">
                           <a14:useLocalDpi xmlns:a14="http://schemas.microsoft.com/office/drawing/2010/main" val="0"/>
@@ -1075,7 +1146,7 @@
                   <pic:spPr bwMode="auto">
                     <a:xfrm>
                       <a:off x="0" y="0"/>
-                      <a:ext cx="2830195" cy="6497320"/>
+                      <a:ext cx="2769444" cy="6362700"/>
                     </a:xfrm>
                     <a:prstGeom prst="rect">
                       <a:avLst/>
@@ -1101,6 +1172,7 @@
     <w:p>
       <w:pPr>
         <w:pStyle w:val="Caption"/>
+        <w:jc w:val="both"/>
         <w:rPr>
           <w:b w:val="0"/>
           <w:bCs w:val="0"/>
@@ -1112,6 +1184,7 @@
     <w:p>
       <w:pPr>
         <w:pStyle w:val="Caption"/>
+        <w:jc w:val="both"/>
         <w:rPr>
           <w:b w:val="0"/>
           <w:bCs w:val="0"/>
@@ -1123,6 +1196,7 @@
     <w:p>
       <w:pPr>
         <w:pStyle w:val="Caption"/>
+        <w:jc w:val="both"/>
         <w:rPr>
           <w:b w:val="0"/>
           <w:bCs w:val="0"/>
@@ -1134,6 +1208,7 @@
     <w:p>
       <w:pPr>
         <w:pStyle w:val="Caption"/>
+        <w:jc w:val="both"/>
         <w:rPr>
           <w:b w:val="0"/>
           <w:bCs w:val="0"/>
@@ -1145,6 +1220,7 @@
     <w:p>
       <w:pPr>
         <w:pStyle w:val="Caption"/>
+        <w:jc w:val="both"/>
         <w:rPr>
           <w:b w:val="0"/>
           <w:bCs w:val="0"/>
@@ -1156,6 +1232,7 @@
     <w:p>
       <w:pPr>
         <w:pStyle w:val="Caption"/>
+        <w:jc w:val="both"/>
         <w:rPr>
           <w:b w:val="0"/>
           <w:bCs w:val="0"/>
@@ -1167,6 +1244,7 @@
     <w:p>
       <w:pPr>
         <w:pStyle w:val="Caption"/>
+        <w:jc w:val="both"/>
         <w:rPr>
           <w:b w:val="0"/>
           <w:bCs w:val="0"/>
@@ -1178,6 +1256,7 @@
     <w:p>
       <w:pPr>
         <w:pStyle w:val="Caption"/>
+        <w:jc w:val="both"/>
         <w:rPr>
           <w:b w:val="0"/>
           <w:bCs w:val="0"/>
@@ -1189,6 +1268,7 @@
     <w:p>
       <w:pPr>
         <w:pStyle w:val="Caption"/>
+        <w:jc w:val="both"/>
         <w:rPr>
           <w:b w:val="0"/>
           <w:bCs w:val="0"/>
@@ -1200,6 +1280,7 @@
     <w:p>
       <w:pPr>
         <w:pStyle w:val="Caption"/>
+        <w:jc w:val="both"/>
         <w:rPr>
           <w:b w:val="0"/>
           <w:bCs w:val="0"/>
@@ -1211,6 +1292,7 @@
     <w:p>
       <w:pPr>
         <w:pStyle w:val="Caption"/>
+        <w:jc w:val="both"/>
         <w:rPr>
           <w:b w:val="0"/>
           <w:bCs w:val="0"/>
@@ -1222,6 +1304,7 @@
     <w:p>
       <w:pPr>
         <w:pStyle w:val="Caption"/>
+        <w:jc w:val="both"/>
         <w:rPr>
           <w:b w:val="0"/>
           <w:bCs w:val="0"/>
@@ -1233,6 +1316,7 @@
     <w:p>
       <w:pPr>
         <w:pStyle w:val="Caption"/>
+        <w:jc w:val="both"/>
         <w:rPr>
           <w:b w:val="0"/>
           <w:bCs w:val="0"/>
@@ -1244,6 +1328,7 @@
     <w:p>
       <w:pPr>
         <w:pStyle w:val="Caption"/>
+        <w:jc w:val="both"/>
         <w:rPr>
           <w:b w:val="0"/>
           <w:bCs w:val="0"/>
@@ -1255,6 +1340,7 @@
     <w:p>
       <w:pPr>
         <w:pStyle w:val="Caption"/>
+        <w:jc w:val="both"/>
         <w:rPr>
           <w:b w:val="0"/>
           <w:bCs w:val="0"/>
@@ -1263,9 +1349,14 @@
         </w:rPr>
       </w:pPr>
     </w:p>
-    <w:p/>
-    <w:p>
-      <w:pPr>
+    <w:p>
+      <w:pPr>
+        <w:jc w:val="both"/>
+      </w:pPr>
+    </w:p>
+    <w:p>
+      <w:pPr>
+        <w:jc w:val="both"/>
         <w:rPr>
           <w:b/>
           <w:bCs/>
@@ -1275,6 +1366,7 @@
     </w:p>
     <w:p>
       <w:pPr>
+        <w:jc w:val="both"/>
         <w:rPr>
           <w:b/>
           <w:bCs/>
@@ -1284,6 +1376,7 @@
     </w:p>
     <w:p>
       <w:pPr>
+        <w:jc w:val="both"/>
         <w:rPr>
           <w:b/>
           <w:bCs/>
@@ -1293,6 +1386,7 @@
     </w:p>
     <w:p>
       <w:pPr>
+        <w:jc w:val="both"/>
         <w:rPr>
           <w:b/>
           <w:bCs/>
@@ -1302,6 +1396,7 @@
     </w:p>
     <w:p>
       <w:pPr>
+        <w:jc w:val="both"/>
         <w:rPr>
           <w:b/>
           <w:bCs/>
@@ -1311,6 +1406,7 @@
     </w:p>
     <w:p>
       <w:pPr>
+        <w:jc w:val="both"/>
         <w:rPr>
           <w:b/>
           <w:bCs/>
@@ -1320,6 +1416,7 @@
     </w:p>
     <w:p>
       <w:pPr>
+        <w:jc w:val="both"/>
         <w:rPr>
           <w:b/>
           <w:bCs/>
@@ -1329,6 +1426,7 @@
     </w:p>
     <w:p>
       <w:pPr>
+        <w:jc w:val="both"/>
         <w:rPr>
           <w:b/>
           <w:bCs/>
@@ -1338,6 +1436,7 @@
     </w:p>
     <w:p>
       <w:pPr>
+        <w:jc w:val="both"/>
         <w:rPr>
           <w:b/>
           <w:bCs/>
@@ -1358,14 +1457,14 @@
       <w:tblPr>
         <w:tblStyle w:val="TableGridLight"/>
         <w:tblW w:w="0" w:type="auto"/>
-        <w:tblInd w:w="3" w:type="dxa"/>
+        <w:tblInd w:w="2095" w:type="dxa"/>
         <w:tblLook w:val="04A0" w:firstRow="1" w:lastRow="0" w:firstColumn="1" w:lastColumn="0" w:noHBand="0" w:noVBand="1"/>
       </w:tblPr>
       <w:tblGrid>
         <w:gridCol w:w="2521"/>
         <w:gridCol w:w="818"/>
         <w:gridCol w:w="818"/>
-        <w:gridCol w:w="4051"/>
+        <w:gridCol w:w="1014"/>
       </w:tblGrid>
       <w:tr>
         <w:tc>
@@ -1376,6 +1475,7 @@
           <w:p>
             <w:pPr>
               <w:spacing w:after="160" w:line="278" w:lineRule="auto"/>
+              <w:jc w:val="both"/>
               <w:rPr>
                 <w:rFonts w:asciiTheme="minorHAnsi" w:hAnsiTheme="minorHAnsi"/>
                 <w:b/>
@@ -1402,6 +1502,7 @@
           <w:p>
             <w:pPr>
               <w:spacing w:after="160" w:line="278" w:lineRule="auto"/>
+              <w:jc w:val="both"/>
               <w:rPr>
                 <w:rFonts w:asciiTheme="minorHAnsi" w:hAnsiTheme="minorHAnsi"/>
                 <w:b/>
@@ -1428,6 +1529,7 @@
           <w:p>
             <w:pPr>
               <w:spacing w:after="160" w:line="278" w:lineRule="auto"/>
+              <w:jc w:val="both"/>
               <w:rPr>
                 <w:rFonts w:asciiTheme="minorHAnsi" w:hAnsiTheme="minorHAnsi"/>
                 <w:b/>
@@ -1454,6 +1556,7 @@
           <w:p>
             <w:pPr>
               <w:spacing w:after="160" w:line="278" w:lineRule="auto"/>
+              <w:jc w:val="both"/>
               <w:rPr>
                 <w:rFonts w:asciiTheme="minorHAnsi" w:hAnsiTheme="minorHAnsi"/>
                 <w:b/>
@@ -1468,7 +1571,7 @@
                 <w:bCs/>
                 <w:lang w:val="en-US"/>
               </w:rPr>
-              <w:t>How scaled</w:t>
+              <w:t>Duration</w:t>
             </w:r>
           </w:p>
         </w:tc>
@@ -1482,6 +1585,7 @@
           <w:p>
             <w:pPr>
               <w:spacing w:after="160" w:line="278" w:lineRule="auto"/>
+              <w:jc w:val="both"/>
               <w:rPr>
                 <w:rFonts w:asciiTheme="minorHAnsi" w:hAnsiTheme="minorHAnsi"/>
                 <w:lang w:val="en-US"/>
@@ -1504,6 +1608,7 @@
           <w:p>
             <w:pPr>
               <w:spacing w:after="160" w:line="278" w:lineRule="auto"/>
+              <w:jc w:val="both"/>
               <w:rPr>
                 <w:rFonts w:asciiTheme="minorHAnsi" w:hAnsiTheme="minorHAnsi"/>
                 <w:lang w:val="en-US"/>
@@ -1526,6 +1631,7 @@
           <w:p>
             <w:pPr>
               <w:spacing w:after="160" w:line="278" w:lineRule="auto"/>
+              <w:jc w:val="both"/>
               <w:rPr>
                 <w:rFonts w:asciiTheme="minorHAnsi" w:hAnsiTheme="minorHAnsi"/>
                 <w:lang w:val="en-US"/>
@@ -1548,6 +1654,7 @@
           <w:p>
             <w:pPr>
               <w:spacing w:after="160" w:line="278" w:lineRule="auto"/>
+              <w:jc w:val="both"/>
               <w:rPr>
                 <w:rFonts w:asciiTheme="minorHAnsi" w:hAnsiTheme="minorHAnsi"/>
                 <w:lang w:val="en-US"/>
@@ -1558,7 +1665,7 @@
                 <w:rFonts w:asciiTheme="minorHAnsi" w:hAnsiTheme="minorHAnsi"/>
                 <w:lang w:val="en-US"/>
               </w:rPr>
-              <w:t>W1–3 → 4 weeks</w:t>
+              <w:t>4 weeks</w:t>
             </w:r>
           </w:p>
         </w:tc>
@@ -1572,6 +1679,7 @@
           <w:p>
             <w:pPr>
               <w:spacing w:after="160" w:line="278" w:lineRule="auto"/>
+              <w:jc w:val="both"/>
               <w:rPr>
                 <w:rFonts w:asciiTheme="minorHAnsi" w:hAnsiTheme="minorHAnsi"/>
                 <w:lang w:val="en-US"/>
@@ -1594,6 +1702,7 @@
           <w:p>
             <w:pPr>
               <w:spacing w:after="160" w:line="278" w:lineRule="auto"/>
+              <w:jc w:val="both"/>
               <w:rPr>
                 <w:rFonts w:asciiTheme="minorHAnsi" w:hAnsiTheme="minorHAnsi"/>
                 <w:lang w:val="en-US"/>
@@ -1616,6 +1725,7 @@
           <w:p>
             <w:pPr>
               <w:spacing w:after="160" w:line="278" w:lineRule="auto"/>
+              <w:jc w:val="both"/>
               <w:rPr>
                 <w:rFonts w:asciiTheme="minorHAnsi" w:hAnsiTheme="minorHAnsi"/>
                 <w:lang w:val="en-US"/>
@@ -1638,6 +1748,7 @@
           <w:p>
             <w:pPr>
               <w:spacing w:after="160" w:line="278" w:lineRule="auto"/>
+              <w:jc w:val="both"/>
               <w:rPr>
                 <w:rFonts w:asciiTheme="minorHAnsi" w:hAnsiTheme="minorHAnsi"/>
                 <w:lang w:val="en-US"/>
@@ -1648,7 +1759,7 @@
                 <w:rFonts w:asciiTheme="minorHAnsi" w:hAnsiTheme="minorHAnsi"/>
                 <w:lang w:val="en-US"/>
               </w:rPr>
-              <w:t>W3–5 → 4 weeks (overlaps Ph1 end)</w:t>
+              <w:t>4 weeks</w:t>
             </w:r>
           </w:p>
         </w:tc>
@@ -1662,6 +1773,7 @@
           <w:p>
             <w:pPr>
               <w:spacing w:after="160" w:line="278" w:lineRule="auto"/>
+              <w:jc w:val="both"/>
               <w:rPr>
                 <w:rFonts w:asciiTheme="minorHAnsi" w:hAnsiTheme="minorHAnsi"/>
                 <w:lang w:val="en-US"/>
@@ -1684,6 +1796,7 @@
           <w:p>
             <w:pPr>
               <w:spacing w:after="160" w:line="278" w:lineRule="auto"/>
+              <w:jc w:val="both"/>
               <w:rPr>
                 <w:rFonts w:asciiTheme="minorHAnsi" w:hAnsiTheme="minorHAnsi"/>
                 <w:lang w:val="en-US"/>
@@ -1706,6 +1819,7 @@
           <w:p>
             <w:pPr>
               <w:spacing w:after="160" w:line="278" w:lineRule="auto"/>
+              <w:jc w:val="both"/>
               <w:rPr>
                 <w:rFonts w:asciiTheme="minorHAnsi" w:hAnsiTheme="minorHAnsi"/>
                 <w:lang w:val="en-US"/>
@@ -1728,6 +1842,7 @@
           <w:p>
             <w:pPr>
               <w:spacing w:after="160" w:line="278" w:lineRule="auto"/>
+              <w:jc w:val="both"/>
               <w:rPr>
                 <w:rFonts w:asciiTheme="minorHAnsi" w:hAnsiTheme="minorHAnsi"/>
                 <w:lang w:val="en-US"/>
@@ -1738,7 +1853,7 @@
                 <w:rFonts w:asciiTheme="minorHAnsi" w:hAnsiTheme="minorHAnsi"/>
                 <w:lang w:val="en-US"/>
               </w:rPr>
-              <w:t>W5–8 → 4 weeks</w:t>
+              <w:t>4 weeks</w:t>
             </w:r>
           </w:p>
         </w:tc>
@@ -1752,6 +1867,7 @@
           <w:p>
             <w:pPr>
               <w:spacing w:after="160" w:line="278" w:lineRule="auto"/>
+              <w:jc w:val="both"/>
               <w:rPr>
                 <w:rFonts w:asciiTheme="minorHAnsi" w:hAnsiTheme="minorHAnsi"/>
                 <w:lang w:val="en-US"/>
@@ -1774,6 +1890,7 @@
           <w:p>
             <w:pPr>
               <w:spacing w:after="160" w:line="278" w:lineRule="auto"/>
+              <w:jc w:val="both"/>
               <w:rPr>
                 <w:rFonts w:asciiTheme="minorHAnsi" w:hAnsiTheme="minorHAnsi"/>
                 <w:lang w:val="en-US"/>
@@ -1796,6 +1913,7 @@
           <w:p>
             <w:pPr>
               <w:spacing w:after="160" w:line="278" w:lineRule="auto"/>
+              <w:jc w:val="both"/>
               <w:rPr>
                 <w:rFonts w:asciiTheme="minorHAnsi" w:hAnsiTheme="minorHAnsi"/>
                 <w:lang w:val="en-US"/>
@@ -1818,6 +1936,7 @@
           <w:p>
             <w:pPr>
               <w:spacing w:after="160" w:line="278" w:lineRule="auto"/>
+              <w:jc w:val="both"/>
               <w:rPr>
                 <w:rFonts w:asciiTheme="minorHAnsi" w:hAnsiTheme="minorHAnsi"/>
                 <w:lang w:val="en-US"/>
@@ -1828,7 +1947,7 @@
                 <w:rFonts w:asciiTheme="minorHAnsi" w:hAnsiTheme="minorHAnsi"/>
                 <w:lang w:val="en-US"/>
               </w:rPr>
-              <w:t>W6–10 → 5 weeks</w:t>
+              <w:t>5 weeks</w:t>
             </w:r>
           </w:p>
         </w:tc>
@@ -1842,6 +1961,7 @@
           <w:p>
             <w:pPr>
               <w:spacing w:after="160" w:line="278" w:lineRule="auto"/>
+              <w:jc w:val="both"/>
               <w:rPr>
                 <w:rFonts w:asciiTheme="minorHAnsi" w:hAnsiTheme="minorHAnsi"/>
                 <w:lang w:val="en-US"/>
@@ -1864,6 +1984,7 @@
           <w:p>
             <w:pPr>
               <w:spacing w:after="160" w:line="278" w:lineRule="auto"/>
+              <w:jc w:val="both"/>
               <w:rPr>
                 <w:rFonts w:asciiTheme="minorHAnsi" w:hAnsiTheme="minorHAnsi"/>
                 <w:lang w:val="en-US"/>
@@ -1886,6 +2007,7 @@
           <w:p>
             <w:pPr>
               <w:spacing w:after="160" w:line="278" w:lineRule="auto"/>
+              <w:jc w:val="both"/>
               <w:rPr>
                 <w:rFonts w:asciiTheme="minorHAnsi" w:hAnsiTheme="minorHAnsi"/>
                 <w:lang w:val="en-US"/>
@@ -1908,6 +2030,7 @@
           <w:p>
             <w:pPr>
               <w:spacing w:after="160" w:line="278" w:lineRule="auto"/>
+              <w:jc w:val="both"/>
               <w:rPr>
                 <w:rFonts w:asciiTheme="minorHAnsi" w:hAnsiTheme="minorHAnsi"/>
                 <w:lang w:val="en-US"/>
@@ -1918,7 +2041,7 @@
                 <w:rFonts w:asciiTheme="minorHAnsi" w:hAnsiTheme="minorHAnsi"/>
                 <w:lang w:val="en-US"/>
               </w:rPr>
-              <w:t>W7–10 → 4 weeks</w:t>
+              <w:t>4 weeks</w:t>
             </w:r>
           </w:p>
         </w:tc>
@@ -1932,6 +2055,7 @@
           <w:p>
             <w:pPr>
               <w:spacing w:after="160" w:line="278" w:lineRule="auto"/>
+              <w:jc w:val="both"/>
               <w:rPr>
                 <w:rFonts w:asciiTheme="minorHAnsi" w:hAnsiTheme="minorHAnsi"/>
                 <w:lang w:val="en-US"/>
@@ -1954,6 +2078,7 @@
           <w:p>
             <w:pPr>
               <w:spacing w:after="160" w:line="278" w:lineRule="auto"/>
+              <w:jc w:val="both"/>
               <w:rPr>
                 <w:rFonts w:asciiTheme="minorHAnsi" w:hAnsiTheme="minorHAnsi"/>
                 <w:lang w:val="en-US"/>
@@ -1976,6 +2101,7 @@
           <w:p>
             <w:pPr>
               <w:spacing w:after="160" w:line="278" w:lineRule="auto"/>
+              <w:jc w:val="both"/>
               <w:rPr>
                 <w:rFonts w:asciiTheme="minorHAnsi" w:hAnsiTheme="minorHAnsi"/>
                 <w:lang w:val="en-US"/>
@@ -1998,6 +2124,7 @@
           <w:p>
             <w:pPr>
               <w:spacing w:after="160" w:line="278" w:lineRule="auto"/>
+              <w:jc w:val="both"/>
               <w:rPr>
                 <w:rFonts w:asciiTheme="minorHAnsi" w:hAnsiTheme="minorHAnsi"/>
                 <w:lang w:val="en-US"/>
@@ -2008,7 +2135,7 @@
                 <w:rFonts w:asciiTheme="minorHAnsi" w:hAnsiTheme="minorHAnsi"/>
                 <w:lang w:val="en-US"/>
               </w:rPr>
-              <w:t>W9–11 → 4 weeks</w:t>
+              <w:t>4 weeks</w:t>
             </w:r>
           </w:p>
         </w:tc>
@@ -2022,6 +2149,7 @@
           <w:p>
             <w:pPr>
               <w:spacing w:after="160" w:line="278" w:lineRule="auto"/>
+              <w:jc w:val="both"/>
               <w:rPr>
                 <w:rFonts w:asciiTheme="minorHAnsi" w:hAnsiTheme="minorHAnsi"/>
                 <w:lang w:val="en-US"/>
@@ -2044,6 +2172,7 @@
           <w:p>
             <w:pPr>
               <w:spacing w:after="160" w:line="278" w:lineRule="auto"/>
+              <w:jc w:val="both"/>
               <w:rPr>
                 <w:rFonts w:asciiTheme="minorHAnsi" w:hAnsiTheme="minorHAnsi"/>
                 <w:lang w:val="en-US"/>
@@ -2066,6 +2195,7 @@
           <w:p>
             <w:pPr>
               <w:spacing w:after="160" w:line="278" w:lineRule="auto"/>
+              <w:jc w:val="both"/>
               <w:rPr>
                 <w:rFonts w:asciiTheme="minorHAnsi" w:hAnsiTheme="minorHAnsi"/>
                 <w:lang w:val="en-US"/>
@@ -2088,6 +2218,7 @@
           <w:p>
             <w:pPr>
               <w:spacing w:after="160" w:line="278" w:lineRule="auto"/>
+              <w:jc w:val="both"/>
               <w:rPr>
                 <w:rFonts w:asciiTheme="minorHAnsi" w:hAnsiTheme="minorHAnsi"/>
                 <w:lang w:val="en-US"/>
@@ -2098,7 +2229,7 @@
                 <w:rFonts w:asciiTheme="minorHAnsi" w:hAnsiTheme="minorHAnsi"/>
                 <w:lang w:val="en-US"/>
               </w:rPr>
-              <w:t>W11–13 → 4 weeks</w:t>
+              <w:t>4 weeks</w:t>
             </w:r>
           </w:p>
         </w:tc>
@@ -2112,6 +2243,7 @@
           <w:p>
             <w:pPr>
               <w:spacing w:after="160" w:line="278" w:lineRule="auto"/>
+              <w:jc w:val="both"/>
               <w:rPr>
                 <w:rFonts w:asciiTheme="minorHAnsi" w:hAnsiTheme="minorHAnsi"/>
                 <w:lang w:val="en-US"/>
@@ -2134,6 +2266,7 @@
           <w:p>
             <w:pPr>
               <w:spacing w:after="160" w:line="278" w:lineRule="auto"/>
+              <w:jc w:val="both"/>
               <w:rPr>
                 <w:rFonts w:asciiTheme="minorHAnsi" w:hAnsiTheme="minorHAnsi"/>
                 <w:lang w:val="en-US"/>
@@ -2156,6 +2289,7 @@
           <w:p>
             <w:pPr>
               <w:spacing w:after="160" w:line="278" w:lineRule="auto"/>
+              <w:jc w:val="both"/>
               <w:rPr>
                 <w:rFonts w:asciiTheme="minorHAnsi" w:hAnsiTheme="minorHAnsi"/>
                 <w:lang w:val="en-US"/>
@@ -2178,6 +2312,7 @@
           <w:p>
             <w:pPr>
               <w:spacing w:after="160" w:line="278" w:lineRule="auto"/>
+              <w:jc w:val="both"/>
               <w:rPr>
                 <w:rFonts w:asciiTheme="minorHAnsi" w:hAnsiTheme="minorHAnsi"/>
                 <w:lang w:val="en-US"/>
@@ -2188,7 +2323,7 @@
                 <w:rFonts w:asciiTheme="minorHAnsi" w:hAnsiTheme="minorHAnsi"/>
                 <w:lang w:val="en-US"/>
               </w:rPr>
-              <w:t>W13–15 → 4 weeks (overlaps integration end)</w:t>
+              <w:t>4 weeks</w:t>
             </w:r>
           </w:p>
         </w:tc>
@@ -2202,6 +2337,7 @@
           <w:p>
             <w:pPr>
               <w:spacing w:after="160" w:line="278" w:lineRule="auto"/>
+              <w:jc w:val="both"/>
               <w:rPr>
                 <w:rFonts w:asciiTheme="minorHAnsi" w:hAnsiTheme="minorHAnsi"/>
                 <w:lang w:val="en-US"/>
@@ -2224,6 +2360,7 @@
           <w:p>
             <w:pPr>
               <w:spacing w:after="160" w:line="278" w:lineRule="auto"/>
+              <w:jc w:val="both"/>
               <w:rPr>
                 <w:rFonts w:asciiTheme="minorHAnsi" w:hAnsiTheme="minorHAnsi"/>
                 <w:lang w:val="en-US"/>
@@ -2246,6 +2383,7 @@
           <w:p>
             <w:pPr>
               <w:spacing w:after="160" w:line="278" w:lineRule="auto"/>
+              <w:jc w:val="both"/>
               <w:rPr>
                 <w:rFonts w:asciiTheme="minorHAnsi" w:hAnsiTheme="minorHAnsi"/>
                 <w:lang w:val="en-US"/>
@@ -2268,6 +2406,7 @@
           <w:p>
             <w:pPr>
               <w:spacing w:after="160" w:line="278" w:lineRule="auto"/>
+              <w:jc w:val="both"/>
               <w:rPr>
                 <w:rFonts w:asciiTheme="minorHAnsi" w:hAnsiTheme="minorHAnsi"/>
                 <w:lang w:val="en-US"/>
@@ -2278,7 +2417,7 @@
                 <w:rFonts w:asciiTheme="minorHAnsi" w:hAnsiTheme="minorHAnsi"/>
                 <w:lang w:val="en-US"/>
               </w:rPr>
-              <w:t>W14–18 → 6 weeks</w:t>
+              <w:t>6 weeks</w:t>
             </w:r>
           </w:p>
         </w:tc>
@@ -2292,6 +2431,7 @@
           <w:p>
             <w:pPr>
               <w:spacing w:after="160" w:line="278" w:lineRule="auto"/>
+              <w:jc w:val="both"/>
               <w:rPr>
                 <w:rFonts w:asciiTheme="minorHAnsi" w:hAnsiTheme="minorHAnsi"/>
                 <w:lang w:val="en-US"/>
@@ -2314,6 +2454,7 @@
           <w:p>
             <w:pPr>
               <w:spacing w:after="160" w:line="278" w:lineRule="auto"/>
+              <w:jc w:val="both"/>
               <w:rPr>
                 <w:rFonts w:asciiTheme="minorHAnsi" w:hAnsiTheme="minorHAnsi"/>
                 <w:lang w:val="en-US"/>
@@ -2336,6 +2477,7 @@
           <w:p>
             <w:pPr>
               <w:spacing w:after="160" w:line="278" w:lineRule="auto"/>
+              <w:jc w:val="both"/>
               <w:rPr>
                 <w:rFonts w:asciiTheme="minorHAnsi" w:hAnsiTheme="minorHAnsi"/>
                 <w:lang w:val="en-US"/>
@@ -2358,6 +2500,7 @@
           <w:p>
             <w:pPr>
               <w:spacing w:after="160" w:line="278" w:lineRule="auto"/>
+              <w:jc w:val="both"/>
               <w:rPr>
                 <w:rFonts w:asciiTheme="minorHAnsi" w:hAnsiTheme="minorHAnsi"/>
                 <w:lang w:val="en-US"/>
@@ -2368,7 +2511,7 @@
                 <w:rFonts w:asciiTheme="minorHAnsi" w:hAnsiTheme="minorHAnsi"/>
                 <w:lang w:val="en-US"/>
               </w:rPr>
-              <w:t>W18–20 → 4 weeks</w:t>
+              <w:t>4 weeks</w:t>
             </w:r>
           </w:p>
         </w:tc>
@@ -2376,6 +2519,7 @@
     </w:tbl>
     <w:p>
       <w:pPr>
+        <w:jc w:val="both"/>
         <w:rPr>
           <w:b/>
           <w:bCs/>
@@ -2385,6 +2529,16 @@
     </w:p>
     <w:p>
       <w:pPr>
+        <w:jc w:val="both"/>
+        <w:rPr>
+          <w:b/>
+          <w:bCs/>
+        </w:rPr>
+      </w:pPr>
+    </w:p>
+    <w:p>
+      <w:pPr>
+        <w:jc w:val="both"/>
         <w:rPr>
           <w:b/>
           <w:bCs/>
@@ -2397,9 +2551,25 @@
           <w:noProof/>
         </w:rPr>
         <w:drawing>
-          <wp:inline distT="0" distB="0" distL="0" distR="0" wp14:anchorId="34B09389" wp14:editId="78B525DE">
+          <wp:anchor distT="0" distB="0" distL="114300" distR="114300" simplePos="0" relativeHeight="251659264" behindDoc="1" locked="0" layoutInCell="1" allowOverlap="1" wp14:anchorId="34B09389" wp14:editId="0644078E">
+            <wp:simplePos x="0" y="0"/>
+            <wp:positionH relativeFrom="column">
+              <wp:posOffset>57150</wp:posOffset>
+            </wp:positionH>
+            <wp:positionV relativeFrom="paragraph">
+              <wp:posOffset>417195</wp:posOffset>
+            </wp:positionV>
             <wp:extent cx="5943600" cy="2695575"/>
             <wp:effectExtent l="0" t="0" r="0" b="9525"/>
+            <wp:wrapTight wrapText="bothSides">
+              <wp:wrapPolygon edited="0">
+                <wp:start x="0" y="0"/>
+                <wp:lineTo x="0" y="21524"/>
+                <wp:lineTo x="21531" y="21524"/>
+                <wp:lineTo x="21531" y="0"/>
+                <wp:lineTo x="0" y="0"/>
+              </wp:wrapPolygon>
+            </wp:wrapTight>
             <wp:docPr id="1633467987" name="Picture 2"/>
             <wp:cNvGraphicFramePr>
               <a:graphicFrameLocks xmlns:a="http://schemas.openxmlformats.org/drawingml/2006/main" noChangeAspect="1"/>
@@ -2414,7 +2584,7 @@
                     </pic:cNvPicPr>
                   </pic:nvPicPr>
                   <pic:blipFill rotWithShape="1">
-                    <a:blip r:embed="rId7">
+                    <a:blip r:embed="rId9">
                       <a:extLst>
                         <a:ext uri="{28A0092B-C50C-407E-A947-70E740481C1C}">
                           <a14:useLocalDpi xmlns:a14="http://schemas.microsoft.com/office/drawing/2010/main" val="0"/>
@@ -2447,16 +2617,34 @@
                 </pic:pic>
               </a:graphicData>
             </a:graphic>
-          </wp:inline>
+          </wp:anchor>
         </w:drawing>
       </w:r>
     </w:p>
     <w:p>
       <w:pPr>
-        <w:rPr>
-          <w:b/>
-          <w:bCs/>
-          <w:lang w:val="en-GB"/>
+        <w:jc w:val="both"/>
+        <w:rPr>
+          <w:b/>
+          <w:bCs/>
+        </w:rPr>
+      </w:pPr>
+    </w:p>
+    <w:p>
+      <w:pPr>
+        <w:jc w:val="both"/>
+        <w:rPr>
+          <w:b/>
+          <w:bCs/>
+        </w:rPr>
+      </w:pPr>
+    </w:p>
+    <w:p>
+      <w:pPr>
+        <w:jc w:val="both"/>
+        <w:rPr>
+          <w:b/>
+          <w:bCs/>
         </w:rPr>
       </w:pPr>
     </w:p>
@@ -2464,16 +2652,18 @@
     <w:bookmarkEnd w:id="1"/>
     <w:p>
       <w:pPr>
-        <w:rPr>
-          <w:b/>
-          <w:bCs/>
-        </w:rPr>
-      </w:pPr>
-      <w:r>
-        <w:rPr>
-          <w:b/>
-          <w:bCs/>
-        </w:rPr>
+        <w:jc w:val="both"/>
+        <w:rPr>
+          <w:b/>
+          <w:bCs/>
+        </w:rPr>
+      </w:pPr>
+      <w:r>
+        <w:rPr>
+          <w:b/>
+          <w:bCs/>
+        </w:rPr>
+        <w:lastRenderedPageBreak/>
         <w:t>Expected Outcome</w:t>
       </w:r>
     </w:p>
@@ -2483,17 +2673,24 @@
           <w:ilvl w:val="0"/>
           <w:numId w:val="3"/>
         </w:numPr>
-      </w:pPr>
-      <w:r>
-        <w:t xml:space="preserve">A Working System Prototype: A fully functional offline voice assistant deployable on commodity Android devices, capable of processing hotel service requests end-to-end without cloud connectivity, comprising an Android guest app, a </w:t>
-      </w:r>
-      <w:proofErr w:type="spellStart"/>
-      <w:r>
-        <w:t>FastAPI</w:t>
-      </w:r>
-      <w:proofErr w:type="spellEnd"/>
-      <w:r>
-        <w:t xml:space="preserve"> backend, and a web-based staff dashboard.</w:t>
+        <w:jc w:val="both"/>
+      </w:pPr>
+      <w:r>
+        <w:rPr>
+          <w:b/>
+          <w:bCs/>
+        </w:rPr>
+        <w:t>A Working Prototype</w:t>
+      </w:r>
+      <w:r>
+        <w:rPr>
+          <w:b/>
+          <w:bCs/>
+        </w:rPr>
+        <w:t>:</w:t>
+      </w:r>
+      <w:r>
+        <w:t> A complete, offline voice assistant running on a commodity Android device. The system handles the full request flow — voice input, intent classification, department routing, staff notification, and guest feedback — without any internet connection. It consists of an Android guest app, a backend server, and a web-based staff dashboard.</w:t>
       </w:r>
     </w:p>
     <w:p>
@@ -2502,16 +2699,30 @@
           <w:ilvl w:val="0"/>
           <w:numId w:val="3"/>
         </w:numPr>
-      </w:pPr>
-      <w:r>
-        <w:lastRenderedPageBreak/>
-        <w:t xml:space="preserve">A Hotel-Specific Intent Dataset: Approximately 5,000 labelled natural language examples across </w:t>
-      </w:r>
-      <w:r>
-        <w:t>most common</w:t>
-      </w:r>
-      <w:r>
-        <w:t xml:space="preserve"> hotel service request categories, representing the first publicly documentable dataset of this kind for Sri Lankan hospitality NLU.</w:t>
+        <w:jc w:val="both"/>
+      </w:pPr>
+      <w:r>
+        <w:rPr>
+          <w:b/>
+          <w:bCs/>
+        </w:rPr>
+        <w:t>A Hotel-Specific Intent Classification Dataset</w:t>
+      </w:r>
+      <w:r>
+        <w:rPr>
+          <w:b/>
+          <w:bCs/>
+        </w:rPr>
+        <w:t>:</w:t>
+      </w:r>
+      <w:r>
+        <w:t xml:space="preserve"> </w:t>
+      </w:r>
+      <w:r>
+        <w:t>A labelled dataset of natural language utterances covering the most common hotel room service request categories, designed to reflect realistic speech conditions</w:t>
+      </w:r>
+      <w:r>
+        <w:t>. To the best of the author's knowledge, this would be the first publicly documented intent dataset built specifically for hospitality room service.</w:t>
       </w:r>
     </w:p>
     <w:p>
@@ -2520,17 +2731,33 @@
           <w:ilvl w:val="0"/>
           <w:numId w:val="3"/>
         </w:numPr>
-      </w:pPr>
-      <w:r>
-        <w:t xml:space="preserve">A Fine-Tuned On-Device NLU Model: A </w:t>
-      </w:r>
-      <w:proofErr w:type="spellStart"/>
-      <w:r>
-        <w:t>MobileBERT</w:t>
-      </w:r>
-      <w:proofErr w:type="spellEnd"/>
-      <w:r>
-        <w:t xml:space="preserve"> model fine-tuned on hotel service data, achieving greater than 90% intent classification accuracy, converted to TensorFlow Lite format for on-device inference on commodity Android hardware.</w:t>
+        <w:jc w:val="both"/>
+      </w:pPr>
+      <w:r>
+        <w:rPr>
+          <w:b/>
+          <w:bCs/>
+        </w:rPr>
+        <w:t>A Fine-Tuned On-Device Intent Classification Model</w:t>
+      </w:r>
+      <w:r>
+        <w:rPr>
+          <w:b/>
+          <w:bCs/>
+        </w:rPr>
+        <w:t>:</w:t>
+      </w:r>
+      <w:r>
+        <w:t> </w:t>
+      </w:r>
+      <w:r>
+        <w:t xml:space="preserve">A small-scale language model fine-tuned on the hotel intent dataset and </w:t>
+      </w:r>
+      <w:r>
+        <w:t>optimized</w:t>
+      </w:r>
+      <w:r>
+        <w:t xml:space="preserve"> for on-device inference on commodity Android hardware. The model is expected to achieve greater than 90% intent classification accuracy under realistic speech recognition conditions.</w:t>
       </w:r>
     </w:p>
     <w:p>
@@ -2539,12 +2766,57 @@
           <w:ilvl w:val="0"/>
           <w:numId w:val="3"/>
         </w:numPr>
-      </w:pPr>
-      <w:r>
-        <w:t>P</w:t>
-      </w:r>
-      <w:r>
-        <w:t>erformance Evaluation: Benchmarked STT Word Error Rate on hotel-domain speech, end-to-end latency measurements, and cost-per-request comparison against commercial cloud-based voice assistant alternatives.</w:t>
+        <w:jc w:val="both"/>
+        <w:rPr>
+          <w:b/>
+          <w:bCs/>
+        </w:rPr>
+      </w:pPr>
+      <w:r>
+        <w:rPr>
+          <w:b/>
+          <w:bCs/>
+        </w:rPr>
+        <w:t>Performance Evaluation</w:t>
+      </w:r>
+    </w:p>
+    <w:p>
+      <w:pPr>
+        <w:pStyle w:val="ListParagraph"/>
+        <w:numPr>
+          <w:ilvl w:val="0"/>
+          <w:numId w:val="10"/>
+        </w:numPr>
+        <w:jc w:val="both"/>
+      </w:pPr>
+      <w:r>
+        <w:t>Intent classification accuracy under both clean text and speech-transcribed input conditions</w:t>
+      </w:r>
+    </w:p>
+    <w:p>
+      <w:pPr>
+        <w:pStyle w:val="ListParagraph"/>
+        <w:numPr>
+          <w:ilvl w:val="0"/>
+          <w:numId w:val="10"/>
+        </w:numPr>
+        <w:jc w:val="both"/>
+      </w:pPr>
+      <w:r>
+        <w:t>End-to-end latency measurements per pipeline stage</w:t>
+      </w:r>
+    </w:p>
+    <w:p>
+      <w:pPr>
+        <w:pStyle w:val="ListParagraph"/>
+        <w:numPr>
+          <w:ilvl w:val="0"/>
+          <w:numId w:val="10"/>
+        </w:numPr>
+        <w:jc w:val="both"/>
+      </w:pPr>
+      <w:r>
+        <w:t>Cost-per-request comparison against cloud-based voice assistant alternatives</w:t>
       </w:r>
     </w:p>
     <w:p>
@@ -2553,14 +2825,41 @@
           <w:ilvl w:val="0"/>
           <w:numId w:val="3"/>
         </w:numPr>
-      </w:pPr>
-      <w:r>
-        <w:t>A Privacy-Preserving Architecture: Demonstrated architectural proof that all guest voice data is processed locally on the Android device, with no audio or speech data transmitted to external servers, providing a GDPR-compatible deployment model for hotels serving international guests.</w:t>
-      </w:r>
-    </w:p>
-    <w:p/>
-    <w:p>
-      <w:pPr>
+        <w:jc w:val="both"/>
+      </w:pPr>
+      <w:r>
+        <w:rPr>
+          <w:b/>
+          <w:bCs/>
+        </w:rPr>
+        <w:t>A Privacy-Preserving Architecture</w:t>
+      </w:r>
+      <w:r>
+        <w:rPr>
+          <w:b/>
+          <w:bCs/>
+        </w:rPr>
+        <w:t>:</w:t>
+      </w:r>
+      <w:r>
+        <w:t xml:space="preserve"> All voice processing stays on the guest device no audio is ever transmitted outside the hotel network. This gives the system a structural privacy guarantee that goes beyond policy </w:t>
+      </w:r>
+      <w:r>
+        <w:t>promises and</w:t>
+      </w:r>
+      <w:r>
+        <w:t xml:space="preserve"> makes it GDPR-compatible for hotels serving international guests.</w:t>
+      </w:r>
+    </w:p>
+    <w:p>
+      <w:pPr>
+        <w:ind w:left="720"/>
+        <w:jc w:val="both"/>
+      </w:pPr>
+    </w:p>
+    <w:p>
+      <w:pPr>
+        <w:jc w:val="both"/>
         <w:rPr>
           <w:b/>
           <w:bCs/>
@@ -2579,65 +2878,59 @@
         <w:jc w:val="both"/>
       </w:pPr>
       <w:r>
-        <w:t xml:space="preserve">This research aims to address a critical gap at the intersection of edge AI, privacy-preserving computing, and hospitality technology by developing a low-cost, offline-capable voice assistant system tailored for hotel room service operations in Sri Lanka. By leveraging small-scale neural models </w:t>
+        <w:t>No existing system combines offline speech recognition, on-device intent classification, and a real-time hotel management backend into a single, affordable product. This project builds exactly that. By running all AI processing on the guest's device with no cloud dependency, the system avoids the recurring costs and privacy risks of commercial alternatives like Alexa for Hospitality.</w:t>
+      </w:r>
+    </w:p>
+    <w:p>
+      <w:pPr>
+        <w:jc w:val="both"/>
+      </w:pPr>
+      <w:r>
+        <w:lastRenderedPageBreak/>
+        <w:t>The research will contribute a hotel-specific intent dataset, a fine-tuned on-device intent classification model, and a complete working prototype deployable on commodity Android hardware. It will also investigate whether training the model on realistic speech-transcribed examples alongside clean text can address the accuracy challenges that on-device speech recognition introduces an area that no existing published work has explored in this specific offline hospitality context.</w:t>
+      </w:r>
+    </w:p>
+    <w:p>
+      <w:pPr>
+        <w:jc w:val="both"/>
+      </w:pPr>
+      <w:r>
+        <w:t xml:space="preserve">This is a realistic, deployable solution for hotels in developing economies that want to </w:t>
       </w:r>
       <w:proofErr w:type="spellStart"/>
       <w:r>
-        <w:t>Vosk</w:t>
+        <w:t>modernise</w:t>
       </w:r>
       <w:proofErr w:type="spellEnd"/>
       <w:r>
-        <w:t xml:space="preserve"> for on-device speech recognition and </w:t>
-      </w:r>
-      <w:proofErr w:type="spellStart"/>
-      <w:r>
-        <w:t>MobileBERT</w:t>
-      </w:r>
-      <w:proofErr w:type="spellEnd"/>
-      <w:r>
-        <w:t xml:space="preserve"> for intent classification running on commodity Android hardware, the system eliminates dependency on expensive cloud services and proprietary devices, while preserving guest privacy through local-only data processing.</w:t>
-      </w:r>
-    </w:p>
-    <w:p>
-      <w:pPr>
-        <w:jc w:val="both"/>
-      </w:pPr>
-      <w:r>
-        <w:t xml:space="preserve">The proposed system demonstrates that effective voice-based hotel service automation is achievable without cloud connectivity, using hardware costing a fraction of commercial alternatives. The real-time WebSocket architecture ensures seamless bidirectional communication between guest devices, the hotel management backend, and staff dashboards, enabling complete request lifecycle management including voice confirmation, cancellation, and service rating. This research offers a replicable, practically deployable model for hotels in developing economies seeking to </w:t>
-      </w:r>
-      <w:r>
-        <w:t>modernize</w:t>
-      </w:r>
-      <w:r>
-        <w:t xml:space="preserve"> guest services without </w:t>
-      </w:r>
-      <w:r>
-        <w:t>expensive</w:t>
-      </w:r>
-      <w:r>
-        <w:t xml:space="preserve"> infrastructure investments.</w:t>
-      </w:r>
-    </w:p>
-    <w:p/>
-    <w:p/>
-    <w:p/>
-    <w:p>
-      <w:pPr>
-        <w:rPr>
-          <w:b/>
-          <w:bCs/>
-        </w:rPr>
-      </w:pPr>
-      <w:r>
-        <w:rPr>
-          <w:b/>
-          <w:bCs/>
-        </w:rPr>
-        <w:lastRenderedPageBreak/>
+        <w:t xml:space="preserve"> guest services without expensive infrastructure or cloud subscriptions.</w:t>
+      </w:r>
+    </w:p>
+    <w:p>
+      <w:pPr>
+        <w:jc w:val="both"/>
+      </w:pPr>
+    </w:p>
+    <w:p>
+      <w:pPr>
+        <w:jc w:val="both"/>
+        <w:rPr>
+          <w:b/>
+          <w:bCs/>
+        </w:rPr>
+      </w:pPr>
+      <w:r>
+        <w:rPr>
+          <w:b/>
+          <w:bCs/>
+        </w:rPr>
         <w:t>References</w:t>
       </w:r>
     </w:p>
     <w:p>
+      <w:pPr>
+        <w:jc w:val="both"/>
+      </w:pPr>
       <w:r>
         <w:t>Alpha Cephei. (2020). </w:t>
       </w:r>
@@ -2660,7 +2953,7 @@
       <w:r>
         <w:t>. </w:t>
       </w:r>
-      <w:hyperlink r:id="rId8" w:history="1">
+      <w:hyperlink r:id="rId10" w:history="1">
         <w:r>
           <w:rPr>
             <w:rStyle w:val="Hyperlink"/>
@@ -2670,6 +2963,9 @@
       </w:hyperlink>
     </w:p>
     <w:p>
+      <w:pPr>
+        <w:jc w:val="both"/>
+      </w:pPr>
       <w:proofErr w:type="spellStart"/>
       <w:r>
         <w:t>Buhalis</w:t>
@@ -2698,6 +2994,9 @@
       </w:r>
     </w:p>
     <w:p>
+      <w:pPr>
+        <w:jc w:val="both"/>
+      </w:pPr>
       <w:proofErr w:type="spellStart"/>
       <w:r>
         <w:t>Buhalis</w:t>
@@ -2719,38 +3018,47 @@
           <w:i/>
           <w:iCs/>
         </w:rPr>
-        <w:t>Journal of Hospitality and Tourism Technology</w:t>
-      </w:r>
-      <w:r>
-        <w:t>, 13(3), 386–403.</w:t>
-      </w:r>
-    </w:p>
-    <w:p>
+        <w:t>Journal of Hospitality and Tourism Technology, 13</w:t>
+      </w:r>
+      <w:r>
+        <w:t>(3), 386–403.</w:t>
+      </w:r>
+    </w:p>
+    <w:p>
+      <w:pPr>
+        <w:jc w:val="both"/>
+      </w:pPr>
       <w:proofErr w:type="spellStart"/>
       <w:r>
         <w:t>Bujel</w:t>
       </w:r>
       <w:proofErr w:type="spellEnd"/>
       <w:r>
-        <w:t>, K., Laffy, J. &amp; Kochenderfer, M. (2021). Effectiveness of Pre-training for Few-shot Intent Classification. arXiv:2109.05782.</w:t>
-      </w:r>
-    </w:p>
-    <w:p>
-      <w:r>
-        <w:t>Bunk, T. et al. (2020). DIET: Dual Intent and Entity Transformer. </w:t>
+        <w:t>, K., Laffy, J. &amp; Kochenderfer, M. (2021). Effectiveness of Pre-training for Few-shot Intent Classification. </w:t>
       </w:r>
       <w:r>
         <w:rPr>
           <w:i/>
           <w:iCs/>
         </w:rPr>
-        <w:t>Rasa Technologies</w:t>
+        <w:t>arXiv:2109.05782</w:t>
       </w:r>
       <w:r>
         <w:t>.</w:t>
       </w:r>
     </w:p>
     <w:p>
+      <w:pPr>
+        <w:jc w:val="both"/>
+      </w:pPr>
+      <w:r>
+        <w:t>Bunk, T. et al. (2020). DIET: Dual Intent and Entity Transformer. Rasa Technologies.</w:t>
+      </w:r>
+    </w:p>
+    <w:p>
+      <w:pPr>
+        <w:jc w:val="both"/>
+      </w:pPr>
       <w:proofErr w:type="spellStart"/>
       <w:r>
         <w:t>Chantrapornchai</w:t>
@@ -2779,6 +3087,9 @@
       </w:r>
     </w:p>
     <w:p>
+      <w:pPr>
+        <w:jc w:val="both"/>
+      </w:pPr>
       <w:r>
         <w:t>Hwang, J. &amp; Erdem, M. (2025). "U" in User Experience (UX) Stands for the Frontline Employee: A Case Study of Voice Assistant Technology Use in Hotels. </w:t>
       </w:r>
@@ -2794,6 +3105,9 @@
       </w:r>
     </w:p>
     <w:p>
+      <w:pPr>
+        <w:jc w:val="both"/>
+      </w:pPr>
       <w:r>
         <w:t>Korkmaz, A. et al. (2025). Real-Time Speech-to-Text on Edge: A Prototype System for Ultra-Low Latency Communication with AI-Powered NLP. </w:t>
       </w:r>
@@ -2802,109 +3116,158 @@
           <w:i/>
           <w:iCs/>
         </w:rPr>
-        <w:t>Information</w:t>
-      </w:r>
-      <w:r>
-        <w:t>, 16(8), 685.</w:t>
-      </w:r>
-    </w:p>
-    <w:p>
-      <w:r>
-        <w:t>Larson, S. et al. (2022). A Survey of Intent Classification and Slot-Filling Datasets for Task-Oriented Dialog. arXiv:2207.13211.</w:t>
-      </w:r>
-    </w:p>
-    <w:p>
-      <w:r>
-        <w:t>Purdue University. (2018). Amazon Alexa Devices in Hotels Raise Privacy Concerns. Purdue University Newsroom.</w:t>
-      </w:r>
-    </w:p>
-    <w:p>
-      <w:r>
-        <w:t>Radford, A. et al. (2023). Robust Speech Recognition via Large-Scale Weak Supervision (Whisper). </w:t>
+        <w:t>Information, 16</w:t>
+      </w:r>
+      <w:r>
+        <w:t>(8), 685.</w:t>
+      </w:r>
+    </w:p>
+    <w:p>
+      <w:pPr>
+        <w:jc w:val="both"/>
+      </w:pPr>
+      <w:r>
+        <w:t>Larson, S. et al. (2022). A Survey of Intent Classification and Slot-Filling Datasets for Task-Oriented Dialog. </w:t>
       </w:r>
       <w:r>
         <w:rPr>
           <w:i/>
           <w:iCs/>
         </w:rPr>
-        <w:t>ICML 2023</w:t>
+        <w:t>arXiv:2207.13211</w:t>
       </w:r>
       <w:r>
         <w:t>.</w:t>
       </w:r>
     </w:p>
     <w:p>
-      <w:r>
-        <w:t xml:space="preserve">Sanh, V. et al. (2019). </w:t>
-      </w:r>
-      <w:proofErr w:type="spellStart"/>
-      <w:r>
-        <w:t>DistilBERT</w:t>
-      </w:r>
-      <w:proofErr w:type="spellEnd"/>
-      <w:r>
-        <w:t>, a Distilled Version of BERT: Smaller, Faster, Cheaper and Lighter. </w:t>
-      </w:r>
-      <w:proofErr w:type="spellStart"/>
+      <w:pPr>
+        <w:jc w:val="both"/>
+      </w:pPr>
+      <w:r>
+        <w:t>Purdue University. (2018). Amazon Alexa Devices in Hotels Raise Privacy Concerns. </w:t>
+      </w:r>
       <w:r>
         <w:rPr>
           <w:i/>
           <w:iCs/>
         </w:rPr>
-        <w:t>NeurIPS</w:t>
-      </w:r>
-      <w:proofErr w:type="spellEnd"/>
+        <w:t>Purdue University Newsroom</w:t>
+      </w:r>
+      <w:r>
+        <w:t>.</w:t>
+      </w:r>
+    </w:p>
+    <w:p>
+      <w:pPr>
+        <w:jc w:val="both"/>
+      </w:pPr>
+      <w:r>
+        <w:lastRenderedPageBreak/>
+        <w:t>Radford, A. et al. (2023). Robust Speech Recognition via Large-Scale Weak Supervision (Whisper). </w:t>
+      </w:r>
       <w:r>
         <w:rPr>
           <w:i/>
           <w:iCs/>
         </w:rPr>
-        <w:t xml:space="preserve"> 2019 Workshop</w:t>
+        <w:t>ICML 2023</w:t>
       </w:r>
       <w:r>
         <w:t>.</w:t>
       </w:r>
     </w:p>
     <w:p>
-      <w:r>
-        <w:t>Shi, W. et al. (2016). Edge Computing: Vision and Challenges. </w:t>
-      </w:r>
+      <w:pPr>
+        <w:jc w:val="both"/>
+      </w:pPr>
+      <w:r>
+        <w:t xml:space="preserve">Sanh, V. et al. (2019). </w:t>
+      </w:r>
+      <w:proofErr w:type="spellStart"/>
+      <w:r>
+        <w:t>DistilBERT</w:t>
+      </w:r>
+      <w:proofErr w:type="spellEnd"/>
+      <w:r>
+        <w:t>, a Distilled Version of BERT: Smaller, Faster, Cheaper and Lighter. </w:t>
+      </w:r>
+      <w:proofErr w:type="spellStart"/>
       <w:r>
         <w:rPr>
           <w:i/>
           <w:iCs/>
         </w:rPr>
-        <w:t>IEEE Internet of Things Journal</w:t>
-      </w:r>
-      <w:r>
-        <w:t>, 3(5), 637–646.</w:t>
-      </w:r>
-    </w:p>
-    <w:p>
-      <w:r>
-        <w:t xml:space="preserve">Sun, Z. et al. (2020). </w:t>
-      </w:r>
-      <w:proofErr w:type="spellStart"/>
-      <w:r>
-        <w:t>MobileBERT</w:t>
+        <w:t>NeurIPS</w:t>
       </w:r>
       <w:proofErr w:type="spellEnd"/>
-      <w:r>
-        <w:t>: a Compact Task-Agnostic BERT for Resource-Limited Devices. </w:t>
-      </w:r>
       <w:r>
         <w:rPr>
           <w:i/>
           <w:iCs/>
         </w:rPr>
+        <w:t xml:space="preserve"> 2019 Workshop</w:t>
+      </w:r>
+      <w:r>
+        <w:t>.</w:t>
+      </w:r>
+    </w:p>
+    <w:p>
+      <w:pPr>
+        <w:jc w:val="both"/>
+      </w:pPr>
+      <w:r>
+        <w:t>Shi, W. et al. (2016). Edge Computing: Vision and Challenges. </w:t>
+      </w:r>
+      <w:r>
+        <w:rPr>
+          <w:i/>
+          <w:iCs/>
+        </w:rPr>
+        <w:t>IEEE Internet of Things Journal, 3</w:t>
+      </w:r>
+      <w:r>
+        <w:t>(5), 637–646.</w:t>
+      </w:r>
+    </w:p>
+    <w:p>
+      <w:pPr>
+        <w:jc w:val="both"/>
+      </w:pPr>
+      <w:r>
+        <w:t xml:space="preserve">Sun, Z. et al. (2020). </w:t>
+      </w:r>
+      <w:proofErr w:type="spellStart"/>
+      <w:r>
+        <w:t>MobileBERT</w:t>
+      </w:r>
+      <w:proofErr w:type="spellEnd"/>
+      <w:r>
+        <w:t>: a Compact Task-Agnostic BERT for Resource-Limited Devices. </w:t>
+      </w:r>
+      <w:r>
+        <w:rPr>
+          <w:i/>
+          <w:iCs/>
+        </w:rPr>
         <w:t>ACL 2020</w:t>
       </w:r>
       <w:r>
         <w:t>.</w:t>
       </w:r>
     </w:p>
-    <w:p/>
+    <w:p>
+      <w:pPr>
+        <w:jc w:val="both"/>
+      </w:pPr>
+    </w:p>
+    <w:p>
+      <w:pPr>
+        <w:jc w:val="both"/>
+      </w:pPr>
+    </w:p>
     <w:sectPr>
+      <w:footerReference w:type="default" r:id="rId11"/>
       <w:pgSz w:w="12240" w:h="15840"/>
       <w:pgMar w:top="1440" w:right="1440" w:bottom="1440" w:left="1440" w:header="720" w:footer="720" w:gutter="0"/>
       <w:cols w:space="720"/>
@@ -2914,9 +3277,523 @@
 </w:document>
 </file>
 
+<file path=word/endnotes.xml><?xml version="1.0" encoding="utf-8"?>
+<w:endnotes xmlns:wpc="http://schemas.microsoft.com/office/word/2010/wordprocessingCanvas" xmlns:cx="http://schemas.microsoft.com/office/drawing/2014/chartex" xmlns:cx1="http://schemas.microsoft.com/office/drawing/2015/9/8/chartex" xmlns:cx2="http://schemas.microsoft.com/office/drawing/2015/10/21/chartex" xmlns:cx3="http://schemas.microsoft.com/office/drawing/2016/5/9/chartex" xmlns:cx4="http://schemas.microsoft.com/office/drawing/2016/5/10/chartex" xmlns:cx5="http://schemas.microsoft.com/office/drawing/2016/5/11/chartex" xmlns:cx6="http://schemas.microsoft.com/office/drawing/2016/5/12/chartex" xmlns:cx7="http://schemas.microsoft.com/office/drawing/2016/5/13/chartex" xmlns:cx8="http://schemas.microsoft.com/office/drawing/2016/5/14/chartex" xmlns:mc="http://schemas.openxmlformats.org/markup-compatibility/2006" xmlns:aink="http://schemas.microsoft.com/office/drawing/2016/ink" xmlns:am3d="http://schemas.microsoft.com/office/drawing/2017/model3d" xmlns:o="urn:schemas-microsoft-com:office:office" xmlns:oel="http://schemas.microsoft.com/office/2019/extlst" xmlns:r="http://schemas.openxmlformats.org/officeDocument/2006/relationships" xmlns:m="http://schemas.openxmlformats.org/officeDocument/2006/math" xmlns:v="urn:schemas-microsoft-com:vml" xmlns:wp14="http://schemas.microsoft.com/office/word/2010/wordprocessingDrawing" xmlns:wp="http://schemas.openxmlformats.org/drawingml/2006/wordprocessingDrawing" xmlns:w10="urn:schemas-microsoft-com:office:word" xmlns:w="http://schemas.openxmlformats.org/wordprocessingml/2006/main" xmlns:w14="http://schemas.microsoft.com/office/word/2010/wordml" xmlns:w15="http://schemas.microsoft.com/office/word/2012/wordml" xmlns:w16cex="http://schemas.microsoft.com/office/word/2018/wordml/cex" xmlns:w16cid="http://schemas.microsoft.com/office/word/2016/wordml/cid" xmlns:w16="http://schemas.microsoft.com/office/word/2018/wordml" xmlns:w16du="http://schemas.microsoft.com/office/word/2023/wordml/word16du" xmlns:w16sdtdh="http://schemas.microsoft.com/office/word/2020/wordml/sdtdatahash" xmlns:w16sdtfl="http://schemas.microsoft.com/office/word/2024/wordml/sdtformatlock" xmlns:w16se="http://schemas.microsoft.com/office/word/2015/wordml/symex" xmlns:wpg="http://schemas.microsoft.com/office/word/2010/wordprocessingGroup" xmlns:wpi="http://schemas.microsoft.com/office/word/2010/wordprocessingInk" xmlns:wne="http://schemas.microsoft.com/office/word/2006/wordml" xmlns:wps="http://schemas.microsoft.com/office/word/2010/wordprocessingShape" mc:Ignorable="w14 w15 w16se w16cid w16 w16cex w16sdtdh w16sdtfl w16du wp14">
+  <w:endnote w:type="separator" w:id="-1">
+    <w:p>
+      <w:pPr>
+        <w:spacing w:after="0" w:line="240" w:lineRule="auto"/>
+      </w:pPr>
+      <w:r>
+        <w:separator/>
+      </w:r>
+    </w:p>
+  </w:endnote>
+  <w:endnote w:type="continuationSeparator" w:id="0">
+    <w:p>
+      <w:pPr>
+        <w:spacing w:after="0" w:line="240" w:lineRule="auto"/>
+      </w:pPr>
+      <w:r>
+        <w:continuationSeparator/>
+      </w:r>
+    </w:p>
+  </w:endnote>
+</w:endnotes>
+</file>
+
+<file path=word/footer1.xml><?xml version="1.0" encoding="utf-8"?>
+<w:ftr xmlns:wpc="http://schemas.microsoft.com/office/word/2010/wordprocessingCanvas" xmlns:cx="http://schemas.microsoft.com/office/drawing/2014/chartex" xmlns:cx1="http://schemas.microsoft.com/office/drawing/2015/9/8/chartex" xmlns:cx2="http://schemas.microsoft.com/office/drawing/2015/10/21/chartex" xmlns:cx3="http://schemas.microsoft.com/office/drawing/2016/5/9/chartex" xmlns:cx4="http://schemas.microsoft.com/office/drawing/2016/5/10/chartex" xmlns:cx5="http://schemas.microsoft.com/office/drawing/2016/5/11/chartex" xmlns:cx6="http://schemas.microsoft.com/office/drawing/2016/5/12/chartex" xmlns:cx7="http://schemas.microsoft.com/office/drawing/2016/5/13/chartex" xmlns:cx8="http://schemas.microsoft.com/office/drawing/2016/5/14/chartex" xmlns:mc="http://schemas.openxmlformats.org/markup-compatibility/2006" xmlns:aink="http://schemas.microsoft.com/office/drawing/2016/ink" xmlns:am3d="http://schemas.microsoft.com/office/drawing/2017/model3d" xmlns:o="urn:schemas-microsoft-com:office:office" xmlns:oel="http://schemas.microsoft.com/office/2019/extlst" xmlns:r="http://schemas.openxmlformats.org/officeDocument/2006/relationships" xmlns:m="http://schemas.openxmlformats.org/officeDocument/2006/math" xmlns:v="urn:schemas-microsoft-com:vml" xmlns:wp14="http://schemas.microsoft.com/office/word/2010/wordprocessingDrawing" xmlns:wp="http://schemas.openxmlformats.org/drawingml/2006/wordprocessingDrawing" xmlns:w10="urn:schemas-microsoft-com:office:word" xmlns:w="http://schemas.openxmlformats.org/wordprocessingml/2006/main" xmlns:w14="http://schemas.microsoft.com/office/word/2010/wordml" xmlns:w15="http://schemas.microsoft.com/office/word/2012/wordml" xmlns:w16cex="http://schemas.microsoft.com/office/word/2018/wordml/cex" xmlns:w16cid="http://schemas.microsoft.com/office/word/2016/wordml/cid" xmlns:w16="http://schemas.microsoft.com/office/word/2018/wordml" xmlns:w16du="http://schemas.microsoft.com/office/word/2023/wordml/word16du" xmlns:w16sdtdh="http://schemas.microsoft.com/office/word/2020/wordml/sdtdatahash" xmlns:w16sdtfl="http://schemas.microsoft.com/office/word/2024/wordml/sdtformatlock" xmlns:w16se="http://schemas.microsoft.com/office/word/2015/wordml/symex" xmlns:wpg="http://schemas.microsoft.com/office/word/2010/wordprocessingGroup" xmlns:wpi="http://schemas.microsoft.com/office/word/2010/wordprocessingInk" xmlns:wne="http://schemas.microsoft.com/office/word/2006/wordml" xmlns:wps="http://schemas.microsoft.com/office/word/2010/wordprocessingShape" mc:Ignorable="w14 w15 w16se w16cid w16 w16cex w16sdtdh w16sdtfl w16du wp14">
+  <w:sdt>
+    <w:sdtPr>
+      <w:id w:val="-1378241931"/>
+      <w:docPartObj>
+        <w:docPartGallery w:val="Page Numbers (Bottom of Page)"/>
+        <w:docPartUnique/>
+      </w:docPartObj>
+    </w:sdtPr>
+    <w:sdtEndPr>
+      <w:rPr>
+        <w:noProof/>
+      </w:rPr>
+    </w:sdtEndPr>
+    <w:sdtContent>
+      <w:p>
+        <w:pPr>
+          <w:pStyle w:val="Footer"/>
+          <w:jc w:val="right"/>
+        </w:pPr>
+        <w:r>
+          <w:fldChar w:fldCharType="begin"/>
+        </w:r>
+        <w:r>
+          <w:instrText xml:space="preserve"> PAGE   \* MERGEFORMAT </w:instrText>
+        </w:r>
+        <w:r>
+          <w:fldChar w:fldCharType="separate"/>
+        </w:r>
+        <w:r>
+          <w:rPr>
+            <w:noProof/>
+          </w:rPr>
+          <w:t>2</w:t>
+        </w:r>
+        <w:r>
+          <w:rPr>
+            <w:noProof/>
+          </w:rPr>
+          <w:fldChar w:fldCharType="end"/>
+        </w:r>
+      </w:p>
+    </w:sdtContent>
+  </w:sdt>
+  <w:p>
+    <w:pPr>
+      <w:pStyle w:val="Footer"/>
+    </w:pPr>
+  </w:p>
+</w:ftr>
+</file>
+
+<file path=word/footnotes.xml><?xml version="1.0" encoding="utf-8"?>
+<w:footnotes xmlns:wpc="http://schemas.microsoft.com/office/word/2010/wordprocessingCanvas" xmlns:cx="http://schemas.microsoft.com/office/drawing/2014/chartex" xmlns:cx1="http://schemas.microsoft.com/office/drawing/2015/9/8/chartex" xmlns:cx2="http://schemas.microsoft.com/office/drawing/2015/10/21/chartex" xmlns:cx3="http://schemas.microsoft.com/office/drawing/2016/5/9/chartex" xmlns:cx4="http://schemas.microsoft.com/office/drawing/2016/5/10/chartex" xmlns:cx5="http://schemas.microsoft.com/office/drawing/2016/5/11/chartex" xmlns:cx6="http://schemas.microsoft.com/office/drawing/2016/5/12/chartex" xmlns:cx7="http://schemas.microsoft.com/office/drawing/2016/5/13/chartex" xmlns:cx8="http://schemas.microsoft.com/office/drawing/2016/5/14/chartex" xmlns:mc="http://schemas.openxmlformats.org/markup-compatibility/2006" xmlns:aink="http://schemas.microsoft.com/office/drawing/2016/ink" xmlns:am3d="http://schemas.microsoft.com/office/drawing/2017/model3d" xmlns:o="urn:schemas-microsoft-com:office:office" xmlns:oel="http://schemas.microsoft.com/office/2019/extlst" xmlns:r="http://schemas.openxmlformats.org/officeDocument/2006/relationships" xmlns:m="http://schemas.openxmlformats.org/officeDocument/2006/math" xmlns:v="urn:schemas-microsoft-com:vml" xmlns:wp14="http://schemas.microsoft.com/office/word/2010/wordprocessingDrawing" xmlns:wp="http://schemas.openxmlformats.org/drawingml/2006/wordprocessingDrawing" xmlns:w10="urn:schemas-microsoft-com:office:word" xmlns:w="http://schemas.openxmlformats.org/wordprocessingml/2006/main" xmlns:w14="http://schemas.microsoft.com/office/word/2010/wordml" xmlns:w15="http://schemas.microsoft.com/office/word/2012/wordml" xmlns:w16cex="http://schemas.microsoft.com/office/word/2018/wordml/cex" xmlns:w16cid="http://schemas.microsoft.com/office/word/2016/wordml/cid" xmlns:w16="http://schemas.microsoft.com/office/word/2018/wordml" xmlns:w16du="http://schemas.microsoft.com/office/word/2023/wordml/word16du" xmlns:w16sdtdh="http://schemas.microsoft.com/office/word/2020/wordml/sdtdatahash" xmlns:w16sdtfl="http://schemas.microsoft.com/office/word/2024/wordml/sdtformatlock" xmlns:w16se="http://schemas.microsoft.com/office/word/2015/wordml/symex" xmlns:wpg="http://schemas.microsoft.com/office/word/2010/wordprocessingGroup" xmlns:wpi="http://schemas.microsoft.com/office/word/2010/wordprocessingInk" xmlns:wne="http://schemas.microsoft.com/office/word/2006/wordml" xmlns:wps="http://schemas.microsoft.com/office/word/2010/wordprocessingShape" mc:Ignorable="w14 w15 w16se w16cid w16 w16cex w16sdtdh w16sdtfl w16du wp14">
+  <w:footnote w:type="separator" w:id="-1">
+    <w:p>
+      <w:pPr>
+        <w:spacing w:after="0" w:line="240" w:lineRule="auto"/>
+      </w:pPr>
+      <w:r>
+        <w:separator/>
+      </w:r>
+    </w:p>
+  </w:footnote>
+  <w:footnote w:type="continuationSeparator" w:id="0">
+    <w:p>
+      <w:pPr>
+        <w:spacing w:after="0" w:line="240" w:lineRule="auto"/>
+      </w:pPr>
+      <w:r>
+        <w:continuationSeparator/>
+      </w:r>
+    </w:p>
+  </w:footnote>
+</w:footnotes>
+</file>
+
 <file path=word/numbering.xml><?xml version="1.0" encoding="utf-8"?>
 <w:numbering xmlns:wpc="http://schemas.microsoft.com/office/word/2010/wordprocessingCanvas" xmlns:cx="http://schemas.microsoft.com/office/drawing/2014/chartex" xmlns:cx1="http://schemas.microsoft.com/office/drawing/2015/9/8/chartex" xmlns:cx2="http://schemas.microsoft.com/office/drawing/2015/10/21/chartex" xmlns:cx3="http://schemas.microsoft.com/office/drawing/2016/5/9/chartex" xmlns:cx4="http://schemas.microsoft.com/office/drawing/2016/5/10/chartex" xmlns:cx5="http://schemas.microsoft.com/office/drawing/2016/5/11/chartex" xmlns:cx6="http://schemas.microsoft.com/office/drawing/2016/5/12/chartex" xmlns:cx7="http://schemas.microsoft.com/office/drawing/2016/5/13/chartex" xmlns:cx8="http://schemas.microsoft.com/office/drawing/2016/5/14/chartex" xmlns:mc="http://schemas.openxmlformats.org/markup-compatibility/2006" xmlns:aink="http://schemas.microsoft.com/office/drawing/2016/ink" xmlns:am3d="http://schemas.microsoft.com/office/drawing/2017/model3d" xmlns:o="urn:schemas-microsoft-com:office:office" xmlns:oel="http://schemas.microsoft.com/office/2019/extlst" xmlns:r="http://schemas.openxmlformats.org/officeDocument/2006/relationships" xmlns:m="http://schemas.openxmlformats.org/officeDocument/2006/math" xmlns:v="urn:schemas-microsoft-com:vml" xmlns:wp14="http://schemas.microsoft.com/office/word/2010/wordprocessingDrawing" xmlns:wp="http://schemas.openxmlformats.org/drawingml/2006/wordprocessingDrawing" xmlns:w10="urn:schemas-microsoft-com:office:word" xmlns:w="http://schemas.openxmlformats.org/wordprocessingml/2006/main" xmlns:w14="http://schemas.microsoft.com/office/word/2010/wordml" xmlns:w15="http://schemas.microsoft.com/office/word/2012/wordml" xmlns:w16cex="http://schemas.microsoft.com/office/word/2018/wordml/cex" xmlns:w16cid="http://schemas.microsoft.com/office/word/2016/wordml/cid" xmlns:w16="http://schemas.microsoft.com/office/word/2018/wordml" xmlns:w16du="http://schemas.microsoft.com/office/word/2023/wordml/word16du" xmlns:w16sdtdh="http://schemas.microsoft.com/office/word/2020/wordml/sdtdatahash" xmlns:w16sdtfl="http://schemas.microsoft.com/office/word/2024/wordml/sdtformatlock" xmlns:w16se="http://schemas.microsoft.com/office/word/2015/wordml/symex" xmlns:wpg="http://schemas.microsoft.com/office/word/2010/wordprocessingGroup" xmlns:wpi="http://schemas.microsoft.com/office/word/2010/wordprocessingInk" xmlns:wne="http://schemas.microsoft.com/office/word/2006/wordml" xmlns:wps="http://schemas.microsoft.com/office/word/2010/wordprocessingShape" mc:Ignorable="w14 w15 w16se w16cid w16 w16cex w16sdtdh w16sdtfl w16du wp14">
   <w:abstractNum w:abstractNumId="0" w15:restartNumberingAfterBreak="0">
+    <w:nsid w:val="051F1E62"/>
+    <w:multiLevelType w:val="multilevel"/>
+    <w:tmpl w:val="B4000920"/>
+    <w:lvl w:ilvl="0">
+      <w:start w:val="1"/>
+      <w:numFmt w:val="bullet"/>
+      <w:lvlText w:val=""/>
+      <w:lvlJc w:val="left"/>
+      <w:pPr>
+        <w:tabs>
+          <w:tab w:val="num" w:pos="720"/>
+        </w:tabs>
+        <w:ind w:left="720" w:hanging="360"/>
+      </w:pPr>
+      <w:rPr>
+        <w:rFonts w:ascii="Symbol" w:hAnsi="Symbol" w:hint="default"/>
+        <w:sz w:val="20"/>
+      </w:rPr>
+    </w:lvl>
+    <w:lvl w:ilvl="1" w:tentative="1">
+      <w:start w:val="1"/>
+      <w:numFmt w:val="bullet"/>
+      <w:lvlText w:val="o"/>
+      <w:lvlJc w:val="left"/>
+      <w:pPr>
+        <w:tabs>
+          <w:tab w:val="num" w:pos="1440"/>
+        </w:tabs>
+        <w:ind w:left="1440" w:hanging="360"/>
+      </w:pPr>
+      <w:rPr>
+        <w:rFonts w:ascii="Courier New" w:hAnsi="Courier New" w:hint="default"/>
+        <w:sz w:val="20"/>
+      </w:rPr>
+    </w:lvl>
+    <w:lvl w:ilvl="2" w:tentative="1">
+      <w:start w:val="1"/>
+      <w:numFmt w:val="bullet"/>
+      <w:lvlText w:val=""/>
+      <w:lvlJc w:val="left"/>
+      <w:pPr>
+        <w:tabs>
+          <w:tab w:val="num" w:pos="2160"/>
+        </w:tabs>
+        <w:ind w:left="2160" w:hanging="360"/>
+      </w:pPr>
+      <w:rPr>
+        <w:rFonts w:ascii="Wingdings" w:hAnsi="Wingdings" w:hint="default"/>
+        <w:sz w:val="20"/>
+      </w:rPr>
+    </w:lvl>
+    <w:lvl w:ilvl="3" w:tentative="1">
+      <w:start w:val="1"/>
+      <w:numFmt w:val="bullet"/>
+      <w:lvlText w:val=""/>
+      <w:lvlJc w:val="left"/>
+      <w:pPr>
+        <w:tabs>
+          <w:tab w:val="num" w:pos="2880"/>
+        </w:tabs>
+        <w:ind w:left="2880" w:hanging="360"/>
+      </w:pPr>
+      <w:rPr>
+        <w:rFonts w:ascii="Wingdings" w:hAnsi="Wingdings" w:hint="default"/>
+        <w:sz w:val="20"/>
+      </w:rPr>
+    </w:lvl>
+    <w:lvl w:ilvl="4" w:tentative="1">
+      <w:start w:val="1"/>
+      <w:numFmt w:val="bullet"/>
+      <w:lvlText w:val=""/>
+      <w:lvlJc w:val="left"/>
+      <w:pPr>
+        <w:tabs>
+          <w:tab w:val="num" w:pos="3600"/>
+        </w:tabs>
+        <w:ind w:left="3600" w:hanging="360"/>
+      </w:pPr>
+      <w:rPr>
+        <w:rFonts w:ascii="Wingdings" w:hAnsi="Wingdings" w:hint="default"/>
+        <w:sz w:val="20"/>
+      </w:rPr>
+    </w:lvl>
+    <w:lvl w:ilvl="5" w:tentative="1">
+      <w:start w:val="1"/>
+      <w:numFmt w:val="bullet"/>
+      <w:lvlText w:val=""/>
+      <w:lvlJc w:val="left"/>
+      <w:pPr>
+        <w:tabs>
+          <w:tab w:val="num" w:pos="4320"/>
+        </w:tabs>
+        <w:ind w:left="4320" w:hanging="360"/>
+      </w:pPr>
+      <w:rPr>
+        <w:rFonts w:ascii="Wingdings" w:hAnsi="Wingdings" w:hint="default"/>
+        <w:sz w:val="20"/>
+      </w:rPr>
+    </w:lvl>
+    <w:lvl w:ilvl="6" w:tentative="1">
+      <w:start w:val="1"/>
+      <w:numFmt w:val="bullet"/>
+      <w:lvlText w:val=""/>
+      <w:lvlJc w:val="left"/>
+      <w:pPr>
+        <w:tabs>
+          <w:tab w:val="num" w:pos="5040"/>
+        </w:tabs>
+        <w:ind w:left="5040" w:hanging="360"/>
+      </w:pPr>
+      <w:rPr>
+        <w:rFonts w:ascii="Wingdings" w:hAnsi="Wingdings" w:hint="default"/>
+        <w:sz w:val="20"/>
+      </w:rPr>
+    </w:lvl>
+    <w:lvl w:ilvl="7" w:tentative="1">
+      <w:start w:val="1"/>
+      <w:numFmt w:val="bullet"/>
+      <w:lvlText w:val=""/>
+      <w:lvlJc w:val="left"/>
+      <w:pPr>
+        <w:tabs>
+          <w:tab w:val="num" w:pos="5760"/>
+        </w:tabs>
+        <w:ind w:left="5760" w:hanging="360"/>
+      </w:pPr>
+      <w:rPr>
+        <w:rFonts w:ascii="Wingdings" w:hAnsi="Wingdings" w:hint="default"/>
+        <w:sz w:val="20"/>
+      </w:rPr>
+    </w:lvl>
+    <w:lvl w:ilvl="8" w:tentative="1">
+      <w:start w:val="1"/>
+      <w:numFmt w:val="bullet"/>
+      <w:lvlText w:val=""/>
+      <w:lvlJc w:val="left"/>
+      <w:pPr>
+        <w:tabs>
+          <w:tab w:val="num" w:pos="6480"/>
+        </w:tabs>
+        <w:ind w:left="6480" w:hanging="360"/>
+      </w:pPr>
+      <w:rPr>
+        <w:rFonts w:ascii="Wingdings" w:hAnsi="Wingdings" w:hint="default"/>
+        <w:sz w:val="20"/>
+      </w:rPr>
+    </w:lvl>
+  </w:abstractNum>
+  <w:abstractNum w:abstractNumId="1" w15:restartNumberingAfterBreak="0">
+    <w:nsid w:val="08346889"/>
+    <w:multiLevelType w:val="multilevel"/>
+    <w:tmpl w:val="22EC17E4"/>
+    <w:lvl w:ilvl="0">
+      <w:start w:val="1"/>
+      <w:numFmt w:val="decimal"/>
+      <w:lvlText w:val="%1."/>
+      <w:lvlJc w:val="left"/>
+      <w:pPr>
+        <w:tabs>
+          <w:tab w:val="num" w:pos="720"/>
+        </w:tabs>
+        <w:ind w:left="720" w:hanging="360"/>
+      </w:pPr>
+    </w:lvl>
+    <w:lvl w:ilvl="1" w:tentative="1">
+      <w:start w:val="1"/>
+      <w:numFmt w:val="decimal"/>
+      <w:lvlText w:val="%2."/>
+      <w:lvlJc w:val="left"/>
+      <w:pPr>
+        <w:tabs>
+          <w:tab w:val="num" w:pos="1440"/>
+        </w:tabs>
+        <w:ind w:left="1440" w:hanging="360"/>
+      </w:pPr>
+    </w:lvl>
+    <w:lvl w:ilvl="2" w:tentative="1">
+      <w:start w:val="1"/>
+      <w:numFmt w:val="decimal"/>
+      <w:lvlText w:val="%3."/>
+      <w:lvlJc w:val="left"/>
+      <w:pPr>
+        <w:tabs>
+          <w:tab w:val="num" w:pos="2160"/>
+        </w:tabs>
+        <w:ind w:left="2160" w:hanging="360"/>
+      </w:pPr>
+    </w:lvl>
+    <w:lvl w:ilvl="3" w:tentative="1">
+      <w:start w:val="1"/>
+      <w:numFmt w:val="decimal"/>
+      <w:lvlText w:val="%4."/>
+      <w:lvlJc w:val="left"/>
+      <w:pPr>
+        <w:tabs>
+          <w:tab w:val="num" w:pos="2880"/>
+        </w:tabs>
+        <w:ind w:left="2880" w:hanging="360"/>
+      </w:pPr>
+    </w:lvl>
+    <w:lvl w:ilvl="4" w:tentative="1">
+      <w:start w:val="1"/>
+      <w:numFmt w:val="decimal"/>
+      <w:lvlText w:val="%5."/>
+      <w:lvlJc w:val="left"/>
+      <w:pPr>
+        <w:tabs>
+          <w:tab w:val="num" w:pos="3600"/>
+        </w:tabs>
+        <w:ind w:left="3600" w:hanging="360"/>
+      </w:pPr>
+    </w:lvl>
+    <w:lvl w:ilvl="5" w:tentative="1">
+      <w:start w:val="1"/>
+      <w:numFmt w:val="decimal"/>
+      <w:lvlText w:val="%6."/>
+      <w:lvlJc w:val="left"/>
+      <w:pPr>
+        <w:tabs>
+          <w:tab w:val="num" w:pos="4320"/>
+        </w:tabs>
+        <w:ind w:left="4320" w:hanging="360"/>
+      </w:pPr>
+    </w:lvl>
+    <w:lvl w:ilvl="6" w:tentative="1">
+      <w:start w:val="1"/>
+      <w:numFmt w:val="decimal"/>
+      <w:lvlText w:val="%7."/>
+      <w:lvlJc w:val="left"/>
+      <w:pPr>
+        <w:tabs>
+          <w:tab w:val="num" w:pos="5040"/>
+        </w:tabs>
+        <w:ind w:left="5040" w:hanging="360"/>
+      </w:pPr>
+    </w:lvl>
+    <w:lvl w:ilvl="7" w:tentative="1">
+      <w:start w:val="1"/>
+      <w:numFmt w:val="decimal"/>
+      <w:lvlText w:val="%8."/>
+      <w:lvlJc w:val="left"/>
+      <w:pPr>
+        <w:tabs>
+          <w:tab w:val="num" w:pos="5760"/>
+        </w:tabs>
+        <w:ind w:left="5760" w:hanging="360"/>
+      </w:pPr>
+    </w:lvl>
+    <w:lvl w:ilvl="8" w:tentative="1">
+      <w:start w:val="1"/>
+      <w:numFmt w:val="decimal"/>
+      <w:lvlText w:val="%9."/>
+      <w:lvlJc w:val="left"/>
+      <w:pPr>
+        <w:tabs>
+          <w:tab w:val="num" w:pos="6480"/>
+        </w:tabs>
+        <w:ind w:left="6480" w:hanging="360"/>
+      </w:pPr>
+    </w:lvl>
+  </w:abstractNum>
+  <w:abstractNum w:abstractNumId="2" w15:restartNumberingAfterBreak="0">
+    <w:nsid w:val="103A3F5F"/>
+    <w:multiLevelType w:val="multilevel"/>
+    <w:tmpl w:val="A65813E0"/>
+    <w:lvl w:ilvl="0">
+      <w:start w:val="1"/>
+      <w:numFmt w:val="bullet"/>
+      <w:lvlText w:val=""/>
+      <w:lvlJc w:val="left"/>
+      <w:pPr>
+        <w:tabs>
+          <w:tab w:val="num" w:pos="720"/>
+        </w:tabs>
+        <w:ind w:left="720" w:hanging="360"/>
+      </w:pPr>
+      <w:rPr>
+        <w:rFonts w:ascii="Symbol" w:hAnsi="Symbol" w:hint="default"/>
+        <w:sz w:val="20"/>
+      </w:rPr>
+    </w:lvl>
+    <w:lvl w:ilvl="1" w:tentative="1">
+      <w:start w:val="1"/>
+      <w:numFmt w:val="bullet"/>
+      <w:lvlText w:val="o"/>
+      <w:lvlJc w:val="left"/>
+      <w:pPr>
+        <w:tabs>
+          <w:tab w:val="num" w:pos="1440"/>
+        </w:tabs>
+        <w:ind w:left="1440" w:hanging="360"/>
+      </w:pPr>
+      <w:rPr>
+        <w:rFonts w:ascii="Courier New" w:hAnsi="Courier New" w:hint="default"/>
+        <w:sz w:val="20"/>
+      </w:rPr>
+    </w:lvl>
+    <w:lvl w:ilvl="2" w:tentative="1">
+      <w:start w:val="1"/>
+      <w:numFmt w:val="bullet"/>
+      <w:lvlText w:val=""/>
+      <w:lvlJc w:val="left"/>
+      <w:pPr>
+        <w:tabs>
+          <w:tab w:val="num" w:pos="2160"/>
+        </w:tabs>
+        <w:ind w:left="2160" w:hanging="360"/>
+      </w:pPr>
+      <w:rPr>
+        <w:rFonts w:ascii="Wingdings" w:hAnsi="Wingdings" w:hint="default"/>
+        <w:sz w:val="20"/>
+      </w:rPr>
+    </w:lvl>
+    <w:lvl w:ilvl="3" w:tentative="1">
+      <w:start w:val="1"/>
+      <w:numFmt w:val="bullet"/>
+      <w:lvlText w:val=""/>
+      <w:lvlJc w:val="left"/>
+      <w:pPr>
+        <w:tabs>
+          <w:tab w:val="num" w:pos="2880"/>
+        </w:tabs>
+        <w:ind w:left="2880" w:hanging="360"/>
+      </w:pPr>
+      <w:rPr>
+        <w:rFonts w:ascii="Wingdings" w:hAnsi="Wingdings" w:hint="default"/>
+        <w:sz w:val="20"/>
+      </w:rPr>
+    </w:lvl>
+    <w:lvl w:ilvl="4" w:tentative="1">
+      <w:start w:val="1"/>
+      <w:numFmt w:val="bullet"/>
+      <w:lvlText w:val=""/>
+      <w:lvlJc w:val="left"/>
+      <w:pPr>
+        <w:tabs>
+          <w:tab w:val="num" w:pos="3600"/>
+        </w:tabs>
+        <w:ind w:left="3600" w:hanging="360"/>
+      </w:pPr>
+      <w:rPr>
+        <w:rFonts w:ascii="Wingdings" w:hAnsi="Wingdings" w:hint="default"/>
+        <w:sz w:val="20"/>
+      </w:rPr>
+    </w:lvl>
+    <w:lvl w:ilvl="5" w:tentative="1">
+      <w:start w:val="1"/>
+      <w:numFmt w:val="bullet"/>
+      <w:lvlText w:val=""/>
+      <w:lvlJc w:val="left"/>
+      <w:pPr>
+        <w:tabs>
+          <w:tab w:val="num" w:pos="4320"/>
+        </w:tabs>
+        <w:ind w:left="4320" w:hanging="360"/>
+      </w:pPr>
+      <w:rPr>
+        <w:rFonts w:ascii="Wingdings" w:hAnsi="Wingdings" w:hint="default"/>
+        <w:sz w:val="20"/>
+      </w:rPr>
+    </w:lvl>
+    <w:lvl w:ilvl="6" w:tentative="1">
+      <w:start w:val="1"/>
+      <w:numFmt w:val="bullet"/>
+      <w:lvlText w:val=""/>
+      <w:lvlJc w:val="left"/>
+      <w:pPr>
+        <w:tabs>
+          <w:tab w:val="num" w:pos="5040"/>
+        </w:tabs>
+        <w:ind w:left="5040" w:hanging="360"/>
+      </w:pPr>
+      <w:rPr>
+        <w:rFonts w:ascii="Wingdings" w:hAnsi="Wingdings" w:hint="default"/>
+        <w:sz w:val="20"/>
+      </w:rPr>
+    </w:lvl>
+    <w:lvl w:ilvl="7" w:tentative="1">
+      <w:start w:val="1"/>
+      <w:numFmt w:val="bullet"/>
+      <w:lvlText w:val=""/>
+      <w:lvlJc w:val="left"/>
+      <w:pPr>
+        <w:tabs>
+          <w:tab w:val="num" w:pos="5760"/>
+        </w:tabs>
+        <w:ind w:left="5760" w:hanging="360"/>
+      </w:pPr>
+      <w:rPr>
+        <w:rFonts w:ascii="Wingdings" w:hAnsi="Wingdings" w:hint="default"/>
+        <w:sz w:val="20"/>
+      </w:rPr>
+    </w:lvl>
+    <w:lvl w:ilvl="8" w:tentative="1">
+      <w:start w:val="1"/>
+      <w:numFmt w:val="bullet"/>
+      <w:lvlText w:val=""/>
+      <w:lvlJc w:val="left"/>
+      <w:pPr>
+        <w:tabs>
+          <w:tab w:val="num" w:pos="6480"/>
+        </w:tabs>
+        <w:ind w:left="6480" w:hanging="360"/>
+      </w:pPr>
+      <w:rPr>
+        <w:rFonts w:ascii="Wingdings" w:hAnsi="Wingdings" w:hint="default"/>
+        <w:sz w:val="20"/>
+      </w:rPr>
+    </w:lvl>
+  </w:abstractNum>
+  <w:abstractNum w:abstractNumId="3" w15:restartNumberingAfterBreak="0">
     <w:nsid w:val="217255A6"/>
     <w:multiLevelType w:val="multilevel"/>
     <w:tmpl w:val="27C0777C"/>
@@ -3065,7 +3942,7 @@
       </w:rPr>
     </w:lvl>
   </w:abstractNum>
-  <w:abstractNum w:abstractNumId="1" w15:restartNumberingAfterBreak="0">
+  <w:abstractNum w:abstractNumId="4" w15:restartNumberingAfterBreak="0">
     <w:nsid w:val="3F05730D"/>
     <w:multiLevelType w:val="multilevel"/>
     <w:tmpl w:val="2DF212F0"/>
@@ -3178,7 +4055,120 @@
       </w:pPr>
     </w:lvl>
   </w:abstractNum>
-  <w:abstractNum w:abstractNumId="2" w15:restartNumberingAfterBreak="0">
+  <w:abstractNum w:abstractNumId="5" w15:restartNumberingAfterBreak="0">
+    <w:nsid w:val="5FE23D07"/>
+    <w:multiLevelType w:val="hybridMultilevel"/>
+    <w:tmpl w:val="0B40F45E"/>
+    <w:lvl w:ilvl="0" w:tplc="04090001">
+      <w:start w:val="1"/>
+      <w:numFmt w:val="bullet"/>
+      <w:lvlText w:val=""/>
+      <w:lvlJc w:val="left"/>
+      <w:pPr>
+        <w:ind w:left="1440" w:hanging="360"/>
+      </w:pPr>
+      <w:rPr>
+        <w:rFonts w:ascii="Symbol" w:hAnsi="Symbol" w:hint="default"/>
+      </w:rPr>
+    </w:lvl>
+    <w:lvl w:ilvl="1" w:tplc="04090003" w:tentative="1">
+      <w:start w:val="1"/>
+      <w:numFmt w:val="bullet"/>
+      <w:lvlText w:val="o"/>
+      <w:lvlJc w:val="left"/>
+      <w:pPr>
+        <w:ind w:left="2160" w:hanging="360"/>
+      </w:pPr>
+      <w:rPr>
+        <w:rFonts w:ascii="Courier New" w:hAnsi="Courier New" w:cs="Courier New" w:hint="default"/>
+      </w:rPr>
+    </w:lvl>
+    <w:lvl w:ilvl="2" w:tplc="04090005" w:tentative="1">
+      <w:start w:val="1"/>
+      <w:numFmt w:val="bullet"/>
+      <w:lvlText w:val=""/>
+      <w:lvlJc w:val="left"/>
+      <w:pPr>
+        <w:ind w:left="2880" w:hanging="360"/>
+      </w:pPr>
+      <w:rPr>
+        <w:rFonts w:ascii="Wingdings" w:hAnsi="Wingdings" w:hint="default"/>
+      </w:rPr>
+    </w:lvl>
+    <w:lvl w:ilvl="3" w:tplc="04090001" w:tentative="1">
+      <w:start w:val="1"/>
+      <w:numFmt w:val="bullet"/>
+      <w:lvlText w:val=""/>
+      <w:lvlJc w:val="left"/>
+      <w:pPr>
+        <w:ind w:left="3600" w:hanging="360"/>
+      </w:pPr>
+      <w:rPr>
+        <w:rFonts w:ascii="Symbol" w:hAnsi="Symbol" w:hint="default"/>
+      </w:rPr>
+    </w:lvl>
+    <w:lvl w:ilvl="4" w:tplc="04090003" w:tentative="1">
+      <w:start w:val="1"/>
+      <w:numFmt w:val="bullet"/>
+      <w:lvlText w:val="o"/>
+      <w:lvlJc w:val="left"/>
+      <w:pPr>
+        <w:ind w:left="4320" w:hanging="360"/>
+      </w:pPr>
+      <w:rPr>
+        <w:rFonts w:ascii="Courier New" w:hAnsi="Courier New" w:cs="Courier New" w:hint="default"/>
+      </w:rPr>
+    </w:lvl>
+    <w:lvl w:ilvl="5" w:tplc="04090005" w:tentative="1">
+      <w:start w:val="1"/>
+      <w:numFmt w:val="bullet"/>
+      <w:lvlText w:val=""/>
+      <w:lvlJc w:val="left"/>
+      <w:pPr>
+        <w:ind w:left="5040" w:hanging="360"/>
+      </w:pPr>
+      <w:rPr>
+        <w:rFonts w:ascii="Wingdings" w:hAnsi="Wingdings" w:hint="default"/>
+      </w:rPr>
+    </w:lvl>
+    <w:lvl w:ilvl="6" w:tplc="04090001" w:tentative="1">
+      <w:start w:val="1"/>
+      <w:numFmt w:val="bullet"/>
+      <w:lvlText w:val=""/>
+      <w:lvlJc w:val="left"/>
+      <w:pPr>
+        <w:ind w:left="5760" w:hanging="360"/>
+      </w:pPr>
+      <w:rPr>
+        <w:rFonts w:ascii="Symbol" w:hAnsi="Symbol" w:hint="default"/>
+      </w:rPr>
+    </w:lvl>
+    <w:lvl w:ilvl="7" w:tplc="04090003" w:tentative="1">
+      <w:start w:val="1"/>
+      <w:numFmt w:val="bullet"/>
+      <w:lvlText w:val="o"/>
+      <w:lvlJc w:val="left"/>
+      <w:pPr>
+        <w:ind w:left="6480" w:hanging="360"/>
+      </w:pPr>
+      <w:rPr>
+        <w:rFonts w:ascii="Courier New" w:hAnsi="Courier New" w:cs="Courier New" w:hint="default"/>
+      </w:rPr>
+    </w:lvl>
+    <w:lvl w:ilvl="8" w:tplc="04090005" w:tentative="1">
+      <w:start w:val="1"/>
+      <w:numFmt w:val="bullet"/>
+      <w:lvlText w:val=""/>
+      <w:lvlJc w:val="left"/>
+      <w:pPr>
+        <w:ind w:left="7200" w:hanging="360"/>
+      </w:pPr>
+      <w:rPr>
+        <w:rFonts w:ascii="Wingdings" w:hAnsi="Wingdings" w:hint="default"/>
+      </w:rPr>
+    </w:lvl>
+  </w:abstractNum>
+  <w:abstractNum w:abstractNumId="6" w15:restartNumberingAfterBreak="0">
     <w:nsid w:val="6DFD40AB"/>
     <w:multiLevelType w:val="multilevel"/>
     <w:tmpl w:val="67EAFC1A"/>
@@ -3189,9 +4179,9 @@
       <w:lvlJc w:val="left"/>
       <w:pPr>
         <w:tabs>
-          <w:tab w:val="num" w:pos="720"/>
-        </w:tabs>
-        <w:ind w:left="720" w:hanging="360"/>
+          <w:tab w:val="num" w:pos="1080"/>
+        </w:tabs>
+        <w:ind w:left="1080" w:hanging="360"/>
       </w:pPr>
       <w:rPr>
         <w:rFonts w:ascii="Symbol" w:hAnsi="Symbol" w:hint="default"/>
@@ -3205,9 +4195,9 @@
       <w:lvlJc w:val="left"/>
       <w:pPr>
         <w:tabs>
-          <w:tab w:val="num" w:pos="1440"/>
-        </w:tabs>
-        <w:ind w:left="1440" w:hanging="360"/>
+          <w:tab w:val="num" w:pos="1800"/>
+        </w:tabs>
+        <w:ind w:left="1800" w:hanging="360"/>
       </w:pPr>
       <w:rPr>
         <w:rFonts w:ascii="Courier New" w:hAnsi="Courier New" w:hint="default"/>
@@ -3221,9 +4211,9 @@
       <w:lvlJc w:val="left"/>
       <w:pPr>
         <w:tabs>
-          <w:tab w:val="num" w:pos="2160"/>
-        </w:tabs>
-        <w:ind w:left="2160" w:hanging="360"/>
+          <w:tab w:val="num" w:pos="2520"/>
+        </w:tabs>
+        <w:ind w:left="2520" w:hanging="360"/>
       </w:pPr>
       <w:rPr>
         <w:rFonts w:ascii="Wingdings" w:hAnsi="Wingdings" w:hint="default"/>
@@ -3237,9 +4227,9 @@
       <w:lvlJc w:val="left"/>
       <w:pPr>
         <w:tabs>
-          <w:tab w:val="num" w:pos="2880"/>
-        </w:tabs>
-        <w:ind w:left="2880" w:hanging="360"/>
+          <w:tab w:val="num" w:pos="3240"/>
+        </w:tabs>
+        <w:ind w:left="3240" w:hanging="360"/>
       </w:pPr>
       <w:rPr>
         <w:rFonts w:ascii="Wingdings" w:hAnsi="Wingdings" w:hint="default"/>
@@ -3253,9 +4243,9 @@
       <w:lvlJc w:val="left"/>
       <w:pPr>
         <w:tabs>
-          <w:tab w:val="num" w:pos="3600"/>
-        </w:tabs>
-        <w:ind w:left="3600" w:hanging="360"/>
+          <w:tab w:val="num" w:pos="3960"/>
+        </w:tabs>
+        <w:ind w:left="3960" w:hanging="360"/>
       </w:pPr>
       <w:rPr>
         <w:rFonts w:ascii="Wingdings" w:hAnsi="Wingdings" w:hint="default"/>
@@ -3269,9 +4259,9 @@
       <w:lvlJc w:val="left"/>
       <w:pPr>
         <w:tabs>
-          <w:tab w:val="num" w:pos="4320"/>
-        </w:tabs>
-        <w:ind w:left="4320" w:hanging="360"/>
+          <w:tab w:val="num" w:pos="4680"/>
+        </w:tabs>
+        <w:ind w:left="4680" w:hanging="360"/>
       </w:pPr>
       <w:rPr>
         <w:rFonts w:ascii="Wingdings" w:hAnsi="Wingdings" w:hint="default"/>
@@ -3285,9 +4275,9 @@
       <w:lvlJc w:val="left"/>
       <w:pPr>
         <w:tabs>
-          <w:tab w:val="num" w:pos="5040"/>
-        </w:tabs>
-        <w:ind w:left="5040" w:hanging="360"/>
+          <w:tab w:val="num" w:pos="5400"/>
+        </w:tabs>
+        <w:ind w:left="5400" w:hanging="360"/>
       </w:pPr>
       <w:rPr>
         <w:rFonts w:ascii="Wingdings" w:hAnsi="Wingdings" w:hint="default"/>
@@ -3301,9 +4291,9 @@
       <w:lvlJc w:val="left"/>
       <w:pPr>
         <w:tabs>
-          <w:tab w:val="num" w:pos="5760"/>
-        </w:tabs>
-        <w:ind w:left="5760" w:hanging="360"/>
+          <w:tab w:val="num" w:pos="6120"/>
+        </w:tabs>
+        <w:ind w:left="6120" w:hanging="360"/>
       </w:pPr>
       <w:rPr>
         <w:rFonts w:ascii="Wingdings" w:hAnsi="Wingdings" w:hint="default"/>
@@ -3317,9 +4307,9 @@
       <w:lvlJc w:val="left"/>
       <w:pPr>
         <w:tabs>
-          <w:tab w:val="num" w:pos="6480"/>
-        </w:tabs>
-        <w:ind w:left="6480" w:hanging="360"/>
+          <w:tab w:val="num" w:pos="6840"/>
+        </w:tabs>
+        <w:ind w:left="6840" w:hanging="360"/>
       </w:pPr>
       <w:rPr>
         <w:rFonts w:ascii="Wingdings" w:hAnsi="Wingdings" w:hint="default"/>
@@ -3327,14 +4317,419 @@
       </w:rPr>
     </w:lvl>
   </w:abstractNum>
+  <w:abstractNum w:abstractNumId="7" w15:restartNumberingAfterBreak="0">
+    <w:nsid w:val="705537A7"/>
+    <w:multiLevelType w:val="hybridMultilevel"/>
+    <w:tmpl w:val="8E7EDE9A"/>
+    <w:lvl w:ilvl="0" w:tplc="0409000F">
+      <w:start w:val="1"/>
+      <w:numFmt w:val="decimal"/>
+      <w:lvlText w:val="%1."/>
+      <w:lvlJc w:val="left"/>
+      <w:pPr>
+        <w:ind w:left="720" w:hanging="360"/>
+      </w:pPr>
+    </w:lvl>
+    <w:lvl w:ilvl="1" w:tplc="04090019" w:tentative="1">
+      <w:start w:val="1"/>
+      <w:numFmt w:val="lowerLetter"/>
+      <w:lvlText w:val="%2."/>
+      <w:lvlJc w:val="left"/>
+      <w:pPr>
+        <w:ind w:left="1440" w:hanging="360"/>
+      </w:pPr>
+    </w:lvl>
+    <w:lvl w:ilvl="2" w:tplc="0409001B" w:tentative="1">
+      <w:start w:val="1"/>
+      <w:numFmt w:val="lowerRoman"/>
+      <w:lvlText w:val="%3."/>
+      <w:lvlJc w:val="right"/>
+      <w:pPr>
+        <w:ind w:left="2160" w:hanging="180"/>
+      </w:pPr>
+    </w:lvl>
+    <w:lvl w:ilvl="3" w:tplc="0409000F" w:tentative="1">
+      <w:start w:val="1"/>
+      <w:numFmt w:val="decimal"/>
+      <w:lvlText w:val="%4."/>
+      <w:lvlJc w:val="left"/>
+      <w:pPr>
+        <w:ind w:left="2880" w:hanging="360"/>
+      </w:pPr>
+    </w:lvl>
+    <w:lvl w:ilvl="4" w:tplc="04090019" w:tentative="1">
+      <w:start w:val="1"/>
+      <w:numFmt w:val="lowerLetter"/>
+      <w:lvlText w:val="%5."/>
+      <w:lvlJc w:val="left"/>
+      <w:pPr>
+        <w:ind w:left="3600" w:hanging="360"/>
+      </w:pPr>
+    </w:lvl>
+    <w:lvl w:ilvl="5" w:tplc="0409001B" w:tentative="1">
+      <w:start w:val="1"/>
+      <w:numFmt w:val="lowerRoman"/>
+      <w:lvlText w:val="%6."/>
+      <w:lvlJc w:val="right"/>
+      <w:pPr>
+        <w:ind w:left="4320" w:hanging="180"/>
+      </w:pPr>
+    </w:lvl>
+    <w:lvl w:ilvl="6" w:tplc="0409000F" w:tentative="1">
+      <w:start w:val="1"/>
+      <w:numFmt w:val="decimal"/>
+      <w:lvlText w:val="%7."/>
+      <w:lvlJc w:val="left"/>
+      <w:pPr>
+        <w:ind w:left="5040" w:hanging="360"/>
+      </w:pPr>
+    </w:lvl>
+    <w:lvl w:ilvl="7" w:tplc="04090019" w:tentative="1">
+      <w:start w:val="1"/>
+      <w:numFmt w:val="lowerLetter"/>
+      <w:lvlText w:val="%8."/>
+      <w:lvlJc w:val="left"/>
+      <w:pPr>
+        <w:ind w:left="5760" w:hanging="360"/>
+      </w:pPr>
+    </w:lvl>
+    <w:lvl w:ilvl="8" w:tplc="0409001B" w:tentative="1">
+      <w:start w:val="1"/>
+      <w:numFmt w:val="lowerRoman"/>
+      <w:lvlText w:val="%9."/>
+      <w:lvlJc w:val="right"/>
+      <w:pPr>
+        <w:ind w:left="6480" w:hanging="180"/>
+      </w:pPr>
+    </w:lvl>
+  </w:abstractNum>
+  <w:abstractNum w:abstractNumId="8" w15:restartNumberingAfterBreak="0">
+    <w:nsid w:val="75702AA1"/>
+    <w:multiLevelType w:val="multilevel"/>
+    <w:tmpl w:val="31948778"/>
+    <w:lvl w:ilvl="0">
+      <w:start w:val="1"/>
+      <w:numFmt w:val="bullet"/>
+      <w:lvlText w:val=""/>
+      <w:lvlJc w:val="left"/>
+      <w:pPr>
+        <w:tabs>
+          <w:tab w:val="num" w:pos="720"/>
+        </w:tabs>
+        <w:ind w:left="720" w:hanging="360"/>
+      </w:pPr>
+      <w:rPr>
+        <w:rFonts w:ascii="Symbol" w:hAnsi="Symbol" w:hint="default"/>
+        <w:sz w:val="20"/>
+      </w:rPr>
+    </w:lvl>
+    <w:lvl w:ilvl="1" w:tentative="1">
+      <w:start w:val="1"/>
+      <w:numFmt w:val="bullet"/>
+      <w:lvlText w:val="o"/>
+      <w:lvlJc w:val="left"/>
+      <w:pPr>
+        <w:tabs>
+          <w:tab w:val="num" w:pos="1440"/>
+        </w:tabs>
+        <w:ind w:left="1440" w:hanging="360"/>
+      </w:pPr>
+      <w:rPr>
+        <w:rFonts w:ascii="Courier New" w:hAnsi="Courier New" w:hint="default"/>
+        <w:sz w:val="20"/>
+      </w:rPr>
+    </w:lvl>
+    <w:lvl w:ilvl="2" w:tentative="1">
+      <w:start w:val="1"/>
+      <w:numFmt w:val="bullet"/>
+      <w:lvlText w:val=""/>
+      <w:lvlJc w:val="left"/>
+      <w:pPr>
+        <w:tabs>
+          <w:tab w:val="num" w:pos="2160"/>
+        </w:tabs>
+        <w:ind w:left="2160" w:hanging="360"/>
+      </w:pPr>
+      <w:rPr>
+        <w:rFonts w:ascii="Wingdings" w:hAnsi="Wingdings" w:hint="default"/>
+        <w:sz w:val="20"/>
+      </w:rPr>
+    </w:lvl>
+    <w:lvl w:ilvl="3" w:tentative="1">
+      <w:start w:val="1"/>
+      <w:numFmt w:val="bullet"/>
+      <w:lvlText w:val=""/>
+      <w:lvlJc w:val="left"/>
+      <w:pPr>
+        <w:tabs>
+          <w:tab w:val="num" w:pos="2880"/>
+        </w:tabs>
+        <w:ind w:left="2880" w:hanging="360"/>
+      </w:pPr>
+      <w:rPr>
+        <w:rFonts w:ascii="Wingdings" w:hAnsi="Wingdings" w:hint="default"/>
+        <w:sz w:val="20"/>
+      </w:rPr>
+    </w:lvl>
+    <w:lvl w:ilvl="4" w:tentative="1">
+      <w:start w:val="1"/>
+      <w:numFmt w:val="bullet"/>
+      <w:lvlText w:val=""/>
+      <w:lvlJc w:val="left"/>
+      <w:pPr>
+        <w:tabs>
+          <w:tab w:val="num" w:pos="3600"/>
+        </w:tabs>
+        <w:ind w:left="3600" w:hanging="360"/>
+      </w:pPr>
+      <w:rPr>
+        <w:rFonts w:ascii="Wingdings" w:hAnsi="Wingdings" w:hint="default"/>
+        <w:sz w:val="20"/>
+      </w:rPr>
+    </w:lvl>
+    <w:lvl w:ilvl="5" w:tentative="1">
+      <w:start w:val="1"/>
+      <w:numFmt w:val="bullet"/>
+      <w:lvlText w:val=""/>
+      <w:lvlJc w:val="left"/>
+      <w:pPr>
+        <w:tabs>
+          <w:tab w:val="num" w:pos="4320"/>
+        </w:tabs>
+        <w:ind w:left="4320" w:hanging="360"/>
+      </w:pPr>
+      <w:rPr>
+        <w:rFonts w:ascii="Wingdings" w:hAnsi="Wingdings" w:hint="default"/>
+        <w:sz w:val="20"/>
+      </w:rPr>
+    </w:lvl>
+    <w:lvl w:ilvl="6" w:tentative="1">
+      <w:start w:val="1"/>
+      <w:numFmt w:val="bullet"/>
+      <w:lvlText w:val=""/>
+      <w:lvlJc w:val="left"/>
+      <w:pPr>
+        <w:tabs>
+          <w:tab w:val="num" w:pos="5040"/>
+        </w:tabs>
+        <w:ind w:left="5040" w:hanging="360"/>
+      </w:pPr>
+      <w:rPr>
+        <w:rFonts w:ascii="Wingdings" w:hAnsi="Wingdings" w:hint="default"/>
+        <w:sz w:val="20"/>
+      </w:rPr>
+    </w:lvl>
+    <w:lvl w:ilvl="7" w:tentative="1">
+      <w:start w:val="1"/>
+      <w:numFmt w:val="bullet"/>
+      <w:lvlText w:val=""/>
+      <w:lvlJc w:val="left"/>
+      <w:pPr>
+        <w:tabs>
+          <w:tab w:val="num" w:pos="5760"/>
+        </w:tabs>
+        <w:ind w:left="5760" w:hanging="360"/>
+      </w:pPr>
+      <w:rPr>
+        <w:rFonts w:ascii="Wingdings" w:hAnsi="Wingdings" w:hint="default"/>
+        <w:sz w:val="20"/>
+      </w:rPr>
+    </w:lvl>
+    <w:lvl w:ilvl="8" w:tentative="1">
+      <w:start w:val="1"/>
+      <w:numFmt w:val="bullet"/>
+      <w:lvlText w:val=""/>
+      <w:lvlJc w:val="left"/>
+      <w:pPr>
+        <w:tabs>
+          <w:tab w:val="num" w:pos="6480"/>
+        </w:tabs>
+        <w:ind w:left="6480" w:hanging="360"/>
+      </w:pPr>
+      <w:rPr>
+        <w:rFonts w:ascii="Wingdings" w:hAnsi="Wingdings" w:hint="default"/>
+        <w:sz w:val="20"/>
+      </w:rPr>
+    </w:lvl>
+  </w:abstractNum>
+  <w:abstractNum w:abstractNumId="9" w15:restartNumberingAfterBreak="0">
+    <w:nsid w:val="7C8134C7"/>
+    <w:multiLevelType w:val="multilevel"/>
+    <w:tmpl w:val="D9702F4E"/>
+    <w:lvl w:ilvl="0">
+      <w:start w:val="1"/>
+      <w:numFmt w:val="bullet"/>
+      <w:lvlText w:val=""/>
+      <w:lvlJc w:val="left"/>
+      <w:pPr>
+        <w:tabs>
+          <w:tab w:val="num" w:pos="720"/>
+        </w:tabs>
+        <w:ind w:left="720" w:hanging="360"/>
+      </w:pPr>
+      <w:rPr>
+        <w:rFonts w:ascii="Symbol" w:hAnsi="Symbol" w:hint="default"/>
+        <w:sz w:val="20"/>
+      </w:rPr>
+    </w:lvl>
+    <w:lvl w:ilvl="1" w:tentative="1">
+      <w:start w:val="1"/>
+      <w:numFmt w:val="bullet"/>
+      <w:lvlText w:val="o"/>
+      <w:lvlJc w:val="left"/>
+      <w:pPr>
+        <w:tabs>
+          <w:tab w:val="num" w:pos="1440"/>
+        </w:tabs>
+        <w:ind w:left="1440" w:hanging="360"/>
+      </w:pPr>
+      <w:rPr>
+        <w:rFonts w:ascii="Courier New" w:hAnsi="Courier New" w:hint="default"/>
+        <w:sz w:val="20"/>
+      </w:rPr>
+    </w:lvl>
+    <w:lvl w:ilvl="2" w:tentative="1">
+      <w:start w:val="1"/>
+      <w:numFmt w:val="bullet"/>
+      <w:lvlText w:val=""/>
+      <w:lvlJc w:val="left"/>
+      <w:pPr>
+        <w:tabs>
+          <w:tab w:val="num" w:pos="2160"/>
+        </w:tabs>
+        <w:ind w:left="2160" w:hanging="360"/>
+      </w:pPr>
+      <w:rPr>
+        <w:rFonts w:ascii="Wingdings" w:hAnsi="Wingdings" w:hint="default"/>
+        <w:sz w:val="20"/>
+      </w:rPr>
+    </w:lvl>
+    <w:lvl w:ilvl="3" w:tentative="1">
+      <w:start w:val="1"/>
+      <w:numFmt w:val="bullet"/>
+      <w:lvlText w:val=""/>
+      <w:lvlJc w:val="left"/>
+      <w:pPr>
+        <w:tabs>
+          <w:tab w:val="num" w:pos="2880"/>
+        </w:tabs>
+        <w:ind w:left="2880" w:hanging="360"/>
+      </w:pPr>
+      <w:rPr>
+        <w:rFonts w:ascii="Wingdings" w:hAnsi="Wingdings" w:hint="default"/>
+        <w:sz w:val="20"/>
+      </w:rPr>
+    </w:lvl>
+    <w:lvl w:ilvl="4" w:tentative="1">
+      <w:start w:val="1"/>
+      <w:numFmt w:val="bullet"/>
+      <w:lvlText w:val=""/>
+      <w:lvlJc w:val="left"/>
+      <w:pPr>
+        <w:tabs>
+          <w:tab w:val="num" w:pos="3600"/>
+        </w:tabs>
+        <w:ind w:left="3600" w:hanging="360"/>
+      </w:pPr>
+      <w:rPr>
+        <w:rFonts w:ascii="Wingdings" w:hAnsi="Wingdings" w:hint="default"/>
+        <w:sz w:val="20"/>
+      </w:rPr>
+    </w:lvl>
+    <w:lvl w:ilvl="5" w:tentative="1">
+      <w:start w:val="1"/>
+      <w:numFmt w:val="bullet"/>
+      <w:lvlText w:val=""/>
+      <w:lvlJc w:val="left"/>
+      <w:pPr>
+        <w:tabs>
+          <w:tab w:val="num" w:pos="4320"/>
+        </w:tabs>
+        <w:ind w:left="4320" w:hanging="360"/>
+      </w:pPr>
+      <w:rPr>
+        <w:rFonts w:ascii="Wingdings" w:hAnsi="Wingdings" w:hint="default"/>
+        <w:sz w:val="20"/>
+      </w:rPr>
+    </w:lvl>
+    <w:lvl w:ilvl="6" w:tentative="1">
+      <w:start w:val="1"/>
+      <w:numFmt w:val="bullet"/>
+      <w:lvlText w:val=""/>
+      <w:lvlJc w:val="left"/>
+      <w:pPr>
+        <w:tabs>
+          <w:tab w:val="num" w:pos="5040"/>
+        </w:tabs>
+        <w:ind w:left="5040" w:hanging="360"/>
+      </w:pPr>
+      <w:rPr>
+        <w:rFonts w:ascii="Wingdings" w:hAnsi="Wingdings" w:hint="default"/>
+        <w:sz w:val="20"/>
+      </w:rPr>
+    </w:lvl>
+    <w:lvl w:ilvl="7" w:tentative="1">
+      <w:start w:val="1"/>
+      <w:numFmt w:val="bullet"/>
+      <w:lvlText w:val=""/>
+      <w:lvlJc w:val="left"/>
+      <w:pPr>
+        <w:tabs>
+          <w:tab w:val="num" w:pos="5760"/>
+        </w:tabs>
+        <w:ind w:left="5760" w:hanging="360"/>
+      </w:pPr>
+      <w:rPr>
+        <w:rFonts w:ascii="Wingdings" w:hAnsi="Wingdings" w:hint="default"/>
+        <w:sz w:val="20"/>
+      </w:rPr>
+    </w:lvl>
+    <w:lvl w:ilvl="8" w:tentative="1">
+      <w:start w:val="1"/>
+      <w:numFmt w:val="bullet"/>
+      <w:lvlText w:val=""/>
+      <w:lvlJc w:val="left"/>
+      <w:pPr>
+        <w:tabs>
+          <w:tab w:val="num" w:pos="6480"/>
+        </w:tabs>
+        <w:ind w:left="6480" w:hanging="360"/>
+      </w:pPr>
+      <w:rPr>
+        <w:rFonts w:ascii="Wingdings" w:hAnsi="Wingdings" w:hint="default"/>
+        <w:sz w:val="20"/>
+      </w:rPr>
+    </w:lvl>
+  </w:abstractNum>
   <w:num w:numId="1" w16cid:durableId="761102122">
+    <w:abstractNumId w:val="3"/>
+  </w:num>
+  <w:num w:numId="2" w16cid:durableId="322666270">
+    <w:abstractNumId w:val="6"/>
+  </w:num>
+  <w:num w:numId="3" w16cid:durableId="1848053028">
+    <w:abstractNumId w:val="4"/>
+  </w:num>
+  <w:num w:numId="4" w16cid:durableId="70010896">
+    <w:abstractNumId w:val="1"/>
+  </w:num>
+  <w:num w:numId="5" w16cid:durableId="1069884237">
+    <w:abstractNumId w:val="8"/>
+  </w:num>
+  <w:num w:numId="6" w16cid:durableId="885995366">
     <w:abstractNumId w:val="0"/>
   </w:num>
-  <w:num w:numId="2" w16cid:durableId="322666270">
+  <w:num w:numId="7" w16cid:durableId="446238994">
+    <w:abstractNumId w:val="9"/>
+  </w:num>
+  <w:num w:numId="8" w16cid:durableId="2089764150">
+    <w:abstractNumId w:val="7"/>
+  </w:num>
+  <w:num w:numId="9" w16cid:durableId="2066709273">
     <w:abstractNumId w:val="2"/>
   </w:num>
-  <w:num w:numId="3" w16cid:durableId="1848053028">
-    <w:abstractNumId w:val="1"/>
+  <w:num w:numId="10" w16cid:durableId="523789023">
+    <w:abstractNumId w:val="5"/>
   </w:num>
 </w:numbering>
 </file>
@@ -3925,7 +5320,6 @@
   <w:style w:type="character" w:default="1" w:styleId="DefaultParagraphFont">
     <w:name w:val="Default Paragraph Font"/>
     <w:uiPriority w:val="1"/>
-    <w:semiHidden/>
     <w:unhideWhenUsed/>
   </w:style>
   <w:style w:type="table" w:default="1" w:styleId="TableNormal">
@@ -4526,7 +5920,6 @@
     <w:basedOn w:val="Normal"/>
     <w:link w:val="HeaderChar"/>
     <w:uiPriority w:val="99"/>
-    <w:semiHidden/>
     <w:unhideWhenUsed/>
     <w:rsid w:val="00937D3C"/>
     <w:pPr>
@@ -4549,7 +5942,6 @@
     <w:basedOn w:val="DefaultParagraphFont"/>
     <w:link w:val="Header"/>
     <w:uiPriority w:val="99"/>
-    <w:semiHidden/>
     <w:rsid w:val="00937D3C"/>
     <w:rPr>
       <w:rFonts w:ascii="Arial" w:eastAsia="Times New Roman" w:hAnsi="Arial" w:cs="Times New Roman"/>
@@ -4564,7 +5956,6 @@
     <w:basedOn w:val="Normal"/>
     <w:link w:val="FooterChar"/>
     <w:uiPriority w:val="99"/>
-    <w:semiHidden/>
     <w:unhideWhenUsed/>
     <w:rsid w:val="00937D3C"/>
     <w:pPr>
@@ -4587,7 +5978,6 @@
     <w:basedOn w:val="DefaultParagraphFont"/>
     <w:link w:val="Footer"/>
     <w:uiPriority w:val="99"/>
-    <w:semiHidden/>
     <w:rsid w:val="00937D3C"/>
     <w:rPr>
       <w:rFonts w:ascii="Arial" w:eastAsia="Times New Roman" w:hAnsi="Arial" w:cs="Times New Roman"/>
@@ -4797,8 +6187,6 @@
   <w:style w:type="paragraph" w:customStyle="1" w:styleId="code-line">
     <w:name w:val="code-line"/>
     <w:basedOn w:val="Normal"/>
-    <w:uiPriority w:val="99"/>
-    <w:semiHidden/>
     <w:rsid w:val="00937D3C"/>
     <w:pPr>
       <w:spacing w:before="100" w:beforeAutospacing="1" w:after="100" w:afterAutospacing="1" w:line="240" w:lineRule="auto"/>

</xml_diff>

<commit_message>
Project report modifyied. Individual chapters modified.
</commit_message>
<xml_diff>
--- a/documents/Research Proposal.docx
+++ b/documents/Research Proposal.docx
@@ -14,54 +14,834 @@
       </w:pPr>
       <w:bookmarkStart w:id="0" w:name="_Toc128649600"/>
       <w:bookmarkStart w:id="1" w:name="_Toc223942136"/>
-      <w:r>
+    </w:p>
+    <w:p>
+      <w:pPr>
+        <w:jc w:val="center"/>
         <w:rPr>
           <w:b/>
           <w:bCs/>
           <w:sz w:val="44"/>
           <w:szCs w:val="44"/>
         </w:rPr>
-        <w:t>Low-Cost Offline Voice Assistant for</w:t>
-      </w:r>
-    </w:p>
-    <w:p>
-      <w:pPr>
-        <w:jc w:val="center"/>
-        <w:rPr>
-          <w:b/>
-          <w:bCs/>
+      </w:pPr>
+      <w:r>
+        <w:rPr>
+          <w:b/>
+          <w:bCs/>
+          <w:noProof/>
           <w:sz w:val="44"/>
           <w:szCs w:val="44"/>
         </w:rPr>
-      </w:pPr>
-      <w:r>
+        <w:drawing>
+          <wp:anchor distT="0" distB="0" distL="114300" distR="114300" simplePos="0" relativeHeight="251659264" behindDoc="1" locked="0" layoutInCell="1" allowOverlap="1" wp14:anchorId="2F0F252B" wp14:editId="259A4E0A">
+            <wp:simplePos x="0" y="0"/>
+            <wp:positionH relativeFrom="column">
+              <wp:posOffset>450850</wp:posOffset>
+            </wp:positionH>
+            <wp:positionV relativeFrom="paragraph">
+              <wp:posOffset>360680</wp:posOffset>
+            </wp:positionV>
+            <wp:extent cx="1711325" cy="1176655"/>
+            <wp:effectExtent l="0" t="0" r="3175" b="4445"/>
+            <wp:wrapTight wrapText="bothSides">
+              <wp:wrapPolygon edited="0">
+                <wp:start x="0" y="0"/>
+                <wp:lineTo x="0" y="21332"/>
+                <wp:lineTo x="21400" y="21332"/>
+                <wp:lineTo x="21400" y="0"/>
+                <wp:lineTo x="0" y="0"/>
+              </wp:wrapPolygon>
+            </wp:wrapTight>
+            <wp:docPr id="58777080" name="Picture 1"/>
+            <wp:cNvGraphicFramePr>
+              <a:graphicFrameLocks xmlns:a="http://schemas.openxmlformats.org/drawingml/2006/main" noChangeAspect="1"/>
+            </wp:cNvGraphicFramePr>
+            <a:graphic xmlns:a="http://schemas.openxmlformats.org/drawingml/2006/main">
+              <a:graphicData uri="http://schemas.openxmlformats.org/drawingml/2006/picture">
+                <pic:pic xmlns:pic="http://schemas.openxmlformats.org/drawingml/2006/picture">
+                  <pic:nvPicPr>
+                    <pic:cNvPr id="0" name="Picture 1"/>
+                    <pic:cNvPicPr>
+                      <a:picLocks noChangeAspect="1" noChangeArrowheads="1"/>
+                    </pic:cNvPicPr>
+                  </pic:nvPicPr>
+                  <pic:blipFill>
+                    <a:blip r:embed="rId8">
+                      <a:extLst>
+                        <a:ext uri="{28A0092B-C50C-407E-A947-70E740481C1C}">
+                          <a14:useLocalDpi xmlns:a14="http://schemas.microsoft.com/office/drawing/2010/main" val="0"/>
+                        </a:ext>
+                      </a:extLst>
+                    </a:blip>
+                    <a:srcRect/>
+                    <a:stretch>
+                      <a:fillRect/>
+                    </a:stretch>
+                  </pic:blipFill>
+                  <pic:spPr bwMode="auto">
+                    <a:xfrm>
+                      <a:off x="0" y="0"/>
+                      <a:ext cx="1711325" cy="1176655"/>
+                    </a:xfrm>
+                    <a:prstGeom prst="rect">
+                      <a:avLst/>
+                    </a:prstGeom>
+                    <a:noFill/>
+                    <a:ln>
+                      <a:noFill/>
+                    </a:ln>
+                  </pic:spPr>
+                </pic:pic>
+              </a:graphicData>
+            </a:graphic>
+            <wp14:sizeRelH relativeFrom="margin">
+              <wp14:pctWidth>0</wp14:pctWidth>
+            </wp14:sizeRelH>
+            <wp14:sizeRelV relativeFrom="margin">
+              <wp14:pctHeight>0</wp14:pctHeight>
+            </wp14:sizeRelV>
+          </wp:anchor>
+        </w:drawing>
+      </w:r>
+    </w:p>
+    <w:p>
+      <w:pPr>
+        <w:jc w:val="center"/>
         <w:rPr>
           <w:b/>
           <w:bCs/>
           <w:sz w:val="44"/>
           <w:szCs w:val="44"/>
         </w:rPr>
-        <w:t>Hospitality Services in Sri Lanka Using</w:t>
-      </w:r>
-    </w:p>
-    <w:p>
-      <w:pPr>
-        <w:jc w:val="center"/>
-        <w:rPr>
-          <w:b/>
-          <w:bCs/>
+      </w:pPr>
+      <w:r>
+        <w:rPr>
+          <w:b/>
+          <w:bCs/>
+          <w:noProof/>
           <w:sz w:val="44"/>
           <w:szCs w:val="44"/>
         </w:rPr>
-      </w:pPr>
-      <w:r>
+        <w:drawing>
+          <wp:anchor distT="0" distB="0" distL="114300" distR="114300" simplePos="0" relativeHeight="251660288" behindDoc="1" locked="0" layoutInCell="1" allowOverlap="1" wp14:anchorId="0F466FFE" wp14:editId="3202645D">
+            <wp:simplePos x="0" y="0"/>
+            <wp:positionH relativeFrom="column">
+              <wp:posOffset>3324860</wp:posOffset>
+            </wp:positionH>
+            <wp:positionV relativeFrom="paragraph">
+              <wp:posOffset>245110</wp:posOffset>
+            </wp:positionV>
+            <wp:extent cx="2143760" cy="581025"/>
+            <wp:effectExtent l="0" t="0" r="8890" b="9525"/>
+            <wp:wrapTight wrapText="bothSides">
+              <wp:wrapPolygon edited="0">
+                <wp:start x="0" y="0"/>
+                <wp:lineTo x="0" y="21246"/>
+                <wp:lineTo x="21498" y="21246"/>
+                <wp:lineTo x="21498" y="0"/>
+                <wp:lineTo x="0" y="0"/>
+              </wp:wrapPolygon>
+            </wp:wrapTight>
+            <wp:docPr id="1740154458" name="Picture 2"/>
+            <wp:cNvGraphicFramePr>
+              <a:graphicFrameLocks xmlns:a="http://schemas.openxmlformats.org/drawingml/2006/main" noChangeAspect="1"/>
+            </wp:cNvGraphicFramePr>
+            <a:graphic xmlns:a="http://schemas.openxmlformats.org/drawingml/2006/main">
+              <a:graphicData uri="http://schemas.openxmlformats.org/drawingml/2006/picture">
+                <pic:pic xmlns:pic="http://schemas.openxmlformats.org/drawingml/2006/picture">
+                  <pic:nvPicPr>
+                    <pic:cNvPr id="0" name="Picture 2"/>
+                    <pic:cNvPicPr>
+                      <a:picLocks noChangeAspect="1" noChangeArrowheads="1"/>
+                    </pic:cNvPicPr>
+                  </pic:nvPicPr>
+                  <pic:blipFill>
+                    <a:blip r:embed="rId9">
+                      <a:extLst>
+                        <a:ext uri="{28A0092B-C50C-407E-A947-70E740481C1C}">
+                          <a14:useLocalDpi xmlns:a14="http://schemas.microsoft.com/office/drawing/2010/main" val="0"/>
+                        </a:ext>
+                      </a:extLst>
+                    </a:blip>
+                    <a:srcRect/>
+                    <a:stretch>
+                      <a:fillRect/>
+                    </a:stretch>
+                  </pic:blipFill>
+                  <pic:spPr bwMode="auto">
+                    <a:xfrm>
+                      <a:off x="0" y="0"/>
+                      <a:ext cx="2143760" cy="581025"/>
+                    </a:xfrm>
+                    <a:prstGeom prst="rect">
+                      <a:avLst/>
+                    </a:prstGeom>
+                    <a:noFill/>
+                    <a:ln>
+                      <a:noFill/>
+                    </a:ln>
+                  </pic:spPr>
+                </pic:pic>
+              </a:graphicData>
+            </a:graphic>
+            <wp14:sizeRelH relativeFrom="margin">
+              <wp14:pctWidth>0</wp14:pctWidth>
+            </wp14:sizeRelH>
+            <wp14:sizeRelV relativeFrom="margin">
+              <wp14:pctHeight>0</wp14:pctHeight>
+            </wp14:sizeRelV>
+          </wp:anchor>
+        </w:drawing>
+      </w:r>
+    </w:p>
+    <w:p>
+      <w:pPr>
+        <w:jc w:val="center"/>
         <w:rPr>
           <w:b/>
           <w:bCs/>
           <w:sz w:val="44"/>
           <w:szCs w:val="44"/>
         </w:rPr>
-        <w:t>Small-Scale Neural Models</w:t>
+      </w:pPr>
+    </w:p>
+    <w:p>
+      <w:pPr>
+        <w:jc w:val="center"/>
+        <w:rPr>
+          <w:b/>
+          <w:bCs/>
+          <w:sz w:val="44"/>
+          <w:szCs w:val="44"/>
+        </w:rPr>
+      </w:pPr>
+    </w:p>
+    <w:p>
+      <w:pPr>
+        <w:jc w:val="center"/>
+        <w:rPr>
+          <w:b/>
+          <w:bCs/>
+          <w:sz w:val="44"/>
+          <w:szCs w:val="44"/>
+        </w:rPr>
+      </w:pPr>
+    </w:p>
+    <w:p>
+      <w:pPr>
+        <w:jc w:val="center"/>
+        <w:rPr>
+          <w:b/>
+          <w:bCs/>
+          <w:sz w:val="44"/>
+          <w:szCs w:val="44"/>
+        </w:rPr>
+      </w:pPr>
+    </w:p>
+    <w:tbl>
+      <w:tblPr>
+        <w:tblStyle w:val="ListTable5Dark-Accent1"/>
+        <w:tblW w:w="0" w:type="auto"/>
+        <w:shd w:val="clear" w:color="auto" w:fill="0B769F" w:themeFill="accent4" w:themeFillShade="BF"/>
+        <w:tblLayout w:type="fixed"/>
+        <w:tblLook w:val="0000" w:firstRow="0" w:lastRow="0" w:firstColumn="0" w:lastColumn="0" w:noHBand="0" w:noVBand="0"/>
+      </w:tblPr>
+      <w:tblGrid>
+        <w:gridCol w:w="3703"/>
+        <w:gridCol w:w="5135"/>
+      </w:tblGrid>
+      <w:tr>
+        <w:trPr>
+          <w:cnfStyle w:val="000000100000" w:firstRow="0" w:lastRow="0" w:firstColumn="0" w:lastColumn="0" w:oddVBand="0" w:evenVBand="0" w:oddHBand="1" w:evenHBand="0" w:firstRowFirstColumn="0" w:firstRowLastColumn="0" w:lastRowFirstColumn="0" w:lastRowLastColumn="0"/>
+          <w:trHeight w:val="136"/>
+        </w:trPr>
+        <w:tc>
+          <w:tcPr>
+            <w:cnfStyle w:val="000010000000" w:firstRow="0" w:lastRow="0" w:firstColumn="0" w:lastColumn="0" w:oddVBand="1" w:evenVBand="0" w:oddHBand="0" w:evenHBand="0" w:firstRowFirstColumn="0" w:firstRowLastColumn="0" w:lastRowFirstColumn="0" w:lastRowLastColumn="0"/>
+            <w:tcW w:w="3703" w:type="dxa"/>
+            <w:shd w:val="clear" w:color="auto" w:fill="0B769F" w:themeFill="accent4" w:themeFillShade="BF"/>
+          </w:tcPr>
+          <w:p>
+            <w:pPr>
+              <w:spacing w:after="160" w:line="278" w:lineRule="auto"/>
+              <w:jc w:val="both"/>
+              <w:rPr>
+                <w:b/>
+                <w:bCs/>
+              </w:rPr>
+            </w:pPr>
+            <w:r>
+              <w:rPr>
+                <w:b/>
+                <w:bCs/>
+              </w:rPr>
+              <w:t xml:space="preserve">Module </w:t>
+            </w:r>
+          </w:p>
+        </w:tc>
+        <w:tc>
+          <w:tcPr>
+            <w:cnfStyle w:val="000001000000" w:firstRow="0" w:lastRow="0" w:firstColumn="0" w:lastColumn="0" w:oddVBand="0" w:evenVBand="1" w:oddHBand="0" w:evenHBand="0" w:firstRowFirstColumn="0" w:firstRowLastColumn="0" w:lastRowFirstColumn="0" w:lastRowLastColumn="0"/>
+            <w:tcW w:w="5135" w:type="dxa"/>
+            <w:shd w:val="clear" w:color="auto" w:fill="0B769F" w:themeFill="accent4" w:themeFillShade="BF"/>
+          </w:tcPr>
+          <w:p>
+            <w:pPr>
+              <w:spacing w:after="160" w:line="278" w:lineRule="auto"/>
+              <w:jc w:val="both"/>
+              <w:rPr>
+                <w:b/>
+                <w:bCs/>
+              </w:rPr>
+            </w:pPr>
+            <w:r>
+              <w:rPr>
+                <w:b/>
+                <w:bCs/>
+              </w:rPr>
+              <w:t xml:space="preserve">Data Science Project (Research) </w:t>
+            </w:r>
+          </w:p>
+        </w:tc>
+      </w:tr>
+      <w:tr>
+        <w:trPr>
+          <w:trHeight w:val="136"/>
+        </w:trPr>
+        <w:tc>
+          <w:tcPr>
+            <w:cnfStyle w:val="000010000000" w:firstRow="0" w:lastRow="0" w:firstColumn="0" w:lastColumn="0" w:oddVBand="1" w:evenVBand="0" w:oddHBand="0" w:evenHBand="0" w:firstRowFirstColumn="0" w:firstRowLastColumn="0" w:lastRowFirstColumn="0" w:lastRowLastColumn="0"/>
+            <w:tcW w:w="3703" w:type="dxa"/>
+            <w:shd w:val="clear" w:color="auto" w:fill="0B769F" w:themeFill="accent4" w:themeFillShade="BF"/>
+          </w:tcPr>
+          <w:p>
+            <w:pPr>
+              <w:spacing w:after="160" w:line="278" w:lineRule="auto"/>
+              <w:jc w:val="both"/>
+              <w:rPr>
+                <w:b/>
+                <w:bCs/>
+              </w:rPr>
+            </w:pPr>
+            <w:r>
+              <w:rPr>
+                <w:b/>
+                <w:bCs/>
+              </w:rPr>
+              <w:t xml:space="preserve">Code </w:t>
+            </w:r>
+          </w:p>
+        </w:tc>
+        <w:tc>
+          <w:tcPr>
+            <w:cnfStyle w:val="000001000000" w:firstRow="0" w:lastRow="0" w:firstColumn="0" w:lastColumn="0" w:oddVBand="0" w:evenVBand="1" w:oddHBand="0" w:evenHBand="0" w:firstRowFirstColumn="0" w:firstRowLastColumn="0" w:lastRowFirstColumn="0" w:lastRowLastColumn="0"/>
+            <w:tcW w:w="5135" w:type="dxa"/>
+            <w:shd w:val="clear" w:color="auto" w:fill="0B769F" w:themeFill="accent4" w:themeFillShade="BF"/>
+          </w:tcPr>
+          <w:p>
+            <w:pPr>
+              <w:spacing w:after="160" w:line="278" w:lineRule="auto"/>
+              <w:jc w:val="both"/>
+              <w:rPr>
+                <w:b/>
+                <w:bCs/>
+              </w:rPr>
+            </w:pPr>
+            <w:r>
+              <w:rPr>
+                <w:b/>
+                <w:bCs/>
+              </w:rPr>
+              <w:t xml:space="preserve">NIB7150CEM </w:t>
+            </w:r>
+          </w:p>
+        </w:tc>
+      </w:tr>
+      <w:tr>
+        <w:trPr>
+          <w:cnfStyle w:val="000000100000" w:firstRow="0" w:lastRow="0" w:firstColumn="0" w:lastColumn="0" w:oddVBand="0" w:evenVBand="0" w:oddHBand="1" w:evenHBand="0" w:firstRowFirstColumn="0" w:firstRowLastColumn="0" w:lastRowFirstColumn="0" w:lastRowLastColumn="0"/>
+          <w:trHeight w:val="136"/>
+        </w:trPr>
+        <w:tc>
+          <w:tcPr>
+            <w:cnfStyle w:val="000010000000" w:firstRow="0" w:lastRow="0" w:firstColumn="0" w:lastColumn="0" w:oddVBand="1" w:evenVBand="0" w:oddHBand="0" w:evenHBand="0" w:firstRowFirstColumn="0" w:firstRowLastColumn="0" w:lastRowFirstColumn="0" w:lastRowLastColumn="0"/>
+            <w:tcW w:w="3703" w:type="dxa"/>
+            <w:shd w:val="clear" w:color="auto" w:fill="0B769F" w:themeFill="accent4" w:themeFillShade="BF"/>
+          </w:tcPr>
+          <w:p>
+            <w:pPr>
+              <w:spacing w:after="160" w:line="278" w:lineRule="auto"/>
+              <w:jc w:val="both"/>
+              <w:rPr>
+                <w:b/>
+                <w:bCs/>
+              </w:rPr>
+            </w:pPr>
+            <w:r>
+              <w:rPr>
+                <w:b/>
+                <w:bCs/>
+              </w:rPr>
+              <w:t xml:space="preserve">Submission </w:t>
+            </w:r>
+          </w:p>
+        </w:tc>
+        <w:tc>
+          <w:tcPr>
+            <w:cnfStyle w:val="000001000000" w:firstRow="0" w:lastRow="0" w:firstColumn="0" w:lastColumn="0" w:oddVBand="0" w:evenVBand="1" w:oddHBand="0" w:evenHBand="0" w:firstRowFirstColumn="0" w:firstRowLastColumn="0" w:lastRowFirstColumn="0" w:lastRowLastColumn="0"/>
+            <w:tcW w:w="5135" w:type="dxa"/>
+            <w:shd w:val="clear" w:color="auto" w:fill="0B769F" w:themeFill="accent4" w:themeFillShade="BF"/>
+          </w:tcPr>
+          <w:p>
+            <w:pPr>
+              <w:spacing w:after="160" w:line="278" w:lineRule="auto"/>
+              <w:jc w:val="both"/>
+              <w:rPr>
+                <w:b/>
+                <w:bCs/>
+              </w:rPr>
+            </w:pPr>
+            <w:r>
+              <w:rPr>
+                <w:b/>
+                <w:bCs/>
+              </w:rPr>
+              <w:t xml:space="preserve">Research Proposal </w:t>
+            </w:r>
+          </w:p>
+        </w:tc>
+      </w:tr>
+      <w:tr>
+        <w:trPr>
+          <w:trHeight w:val="136"/>
+        </w:trPr>
+        <w:tc>
+          <w:tcPr>
+            <w:cnfStyle w:val="000010000000" w:firstRow="0" w:lastRow="0" w:firstColumn="0" w:lastColumn="0" w:oddVBand="1" w:evenVBand="0" w:oddHBand="0" w:evenHBand="0" w:firstRowFirstColumn="0" w:firstRowLastColumn="0" w:lastRowFirstColumn="0" w:lastRowLastColumn="0"/>
+            <w:tcW w:w="3703" w:type="dxa"/>
+            <w:shd w:val="clear" w:color="auto" w:fill="0B769F" w:themeFill="accent4" w:themeFillShade="BF"/>
+          </w:tcPr>
+          <w:p>
+            <w:pPr>
+              <w:spacing w:after="160" w:line="278" w:lineRule="auto"/>
+              <w:jc w:val="both"/>
+              <w:rPr>
+                <w:b/>
+                <w:bCs/>
+              </w:rPr>
+            </w:pPr>
+            <w:r>
+              <w:rPr>
+                <w:b/>
+                <w:bCs/>
+              </w:rPr>
+              <w:t xml:space="preserve">Student Name </w:t>
+            </w:r>
+          </w:p>
+        </w:tc>
+        <w:tc>
+          <w:tcPr>
+            <w:cnfStyle w:val="000001000000" w:firstRow="0" w:lastRow="0" w:firstColumn="0" w:lastColumn="0" w:oddVBand="0" w:evenVBand="1" w:oddHBand="0" w:evenHBand="0" w:firstRowFirstColumn="0" w:firstRowLastColumn="0" w:lastRowFirstColumn="0" w:lastRowLastColumn="0"/>
+            <w:tcW w:w="5135" w:type="dxa"/>
+            <w:shd w:val="clear" w:color="auto" w:fill="0B769F" w:themeFill="accent4" w:themeFillShade="BF"/>
+          </w:tcPr>
+          <w:p>
+            <w:pPr>
+              <w:spacing w:after="160" w:line="278" w:lineRule="auto"/>
+              <w:jc w:val="both"/>
+              <w:rPr>
+                <w:b/>
+                <w:bCs/>
+              </w:rPr>
+            </w:pPr>
+            <w:r>
+              <w:rPr>
+                <w:b/>
+                <w:bCs/>
+              </w:rPr>
+              <w:t>M. D. P. Wijesuriya</w:t>
+            </w:r>
+          </w:p>
+        </w:tc>
+      </w:tr>
+      <w:tr>
+        <w:trPr>
+          <w:cnfStyle w:val="000000100000" w:firstRow="0" w:lastRow="0" w:firstColumn="0" w:lastColumn="0" w:oddVBand="0" w:evenVBand="0" w:oddHBand="1" w:evenHBand="0" w:firstRowFirstColumn="0" w:firstRowLastColumn="0" w:lastRowFirstColumn="0" w:lastRowLastColumn="0"/>
+          <w:trHeight w:val="136"/>
+        </w:trPr>
+        <w:tc>
+          <w:tcPr>
+            <w:cnfStyle w:val="000010000000" w:firstRow="0" w:lastRow="0" w:firstColumn="0" w:lastColumn="0" w:oddVBand="1" w:evenVBand="0" w:oddHBand="0" w:evenHBand="0" w:firstRowFirstColumn="0" w:firstRowLastColumn="0" w:lastRowFirstColumn="0" w:lastRowLastColumn="0"/>
+            <w:tcW w:w="3703" w:type="dxa"/>
+            <w:shd w:val="clear" w:color="auto" w:fill="0B769F" w:themeFill="accent4" w:themeFillShade="BF"/>
+          </w:tcPr>
+          <w:p>
+            <w:pPr>
+              <w:spacing w:after="160" w:line="278" w:lineRule="auto"/>
+              <w:jc w:val="both"/>
+              <w:rPr>
+                <w:b/>
+                <w:bCs/>
+              </w:rPr>
+            </w:pPr>
+            <w:r>
+              <w:rPr>
+                <w:b/>
+                <w:bCs/>
+              </w:rPr>
+              <w:t xml:space="preserve">Student ID </w:t>
+            </w:r>
+          </w:p>
+        </w:tc>
+        <w:tc>
+          <w:tcPr>
+            <w:cnfStyle w:val="000001000000" w:firstRow="0" w:lastRow="0" w:firstColumn="0" w:lastColumn="0" w:oddVBand="0" w:evenVBand="1" w:oddHBand="0" w:evenHBand="0" w:firstRowFirstColumn="0" w:firstRowLastColumn="0" w:lastRowFirstColumn="0" w:lastRowLastColumn="0"/>
+            <w:tcW w:w="5135" w:type="dxa"/>
+            <w:shd w:val="clear" w:color="auto" w:fill="0B769F" w:themeFill="accent4" w:themeFillShade="BF"/>
+          </w:tcPr>
+          <w:p>
+            <w:pPr>
+              <w:spacing w:after="160" w:line="278" w:lineRule="auto"/>
+              <w:jc w:val="both"/>
+              <w:rPr>
+                <w:b/>
+                <w:bCs/>
+              </w:rPr>
+            </w:pPr>
+            <w:r>
+              <w:rPr>
+                <w:b/>
+                <w:bCs/>
+              </w:rPr>
+              <w:t xml:space="preserve">COMScDS241P-002 </w:t>
+            </w:r>
+          </w:p>
+        </w:tc>
+      </w:tr>
+      <w:tr>
+        <w:trPr>
+          <w:trHeight w:val="136"/>
+        </w:trPr>
+        <w:tc>
+          <w:tcPr>
+            <w:cnfStyle w:val="000010000000" w:firstRow="0" w:lastRow="0" w:firstColumn="0" w:lastColumn="0" w:oddVBand="1" w:evenVBand="0" w:oddHBand="0" w:evenHBand="0" w:firstRowFirstColumn="0" w:firstRowLastColumn="0" w:lastRowFirstColumn="0" w:lastRowLastColumn="0"/>
+            <w:tcW w:w="3703" w:type="dxa"/>
+            <w:shd w:val="clear" w:color="auto" w:fill="0B769F" w:themeFill="accent4" w:themeFillShade="BF"/>
+          </w:tcPr>
+          <w:p>
+            <w:pPr>
+              <w:spacing w:after="160" w:line="278" w:lineRule="auto"/>
+              <w:jc w:val="both"/>
+              <w:rPr>
+                <w:b/>
+                <w:bCs/>
+              </w:rPr>
+            </w:pPr>
+            <w:r>
+              <w:rPr>
+                <w:b/>
+                <w:bCs/>
+              </w:rPr>
+              <w:t xml:space="preserve">Email </w:t>
+            </w:r>
+          </w:p>
+        </w:tc>
+        <w:tc>
+          <w:tcPr>
+            <w:cnfStyle w:val="000001000000" w:firstRow="0" w:lastRow="0" w:firstColumn="0" w:lastColumn="0" w:oddVBand="0" w:evenVBand="1" w:oddHBand="0" w:evenHBand="0" w:firstRowFirstColumn="0" w:firstRowLastColumn="0" w:lastRowFirstColumn="0" w:lastRowLastColumn="0"/>
+            <w:tcW w:w="5135" w:type="dxa"/>
+            <w:shd w:val="clear" w:color="auto" w:fill="0B769F" w:themeFill="accent4" w:themeFillShade="BF"/>
+          </w:tcPr>
+          <w:p>
+            <w:pPr>
+              <w:spacing w:after="160" w:line="278" w:lineRule="auto"/>
+              <w:jc w:val="both"/>
+              <w:rPr>
+                <w:b/>
+                <w:bCs/>
+              </w:rPr>
+            </w:pPr>
+            <w:r>
+              <w:rPr>
+                <w:b/>
+                <w:bCs/>
+              </w:rPr>
+              <w:t xml:space="preserve">COMScDS241P-002@student.nibm.lk </w:t>
+            </w:r>
+          </w:p>
+        </w:tc>
+      </w:tr>
+      <w:tr>
+        <w:trPr>
+          <w:cnfStyle w:val="000000100000" w:firstRow="0" w:lastRow="0" w:firstColumn="0" w:lastColumn="0" w:oddVBand="0" w:evenVBand="0" w:oddHBand="1" w:evenHBand="0" w:firstRowFirstColumn="0" w:firstRowLastColumn="0" w:lastRowFirstColumn="0" w:lastRowLastColumn="0"/>
+          <w:trHeight w:val="136"/>
+        </w:trPr>
+        <w:tc>
+          <w:tcPr>
+            <w:cnfStyle w:val="000010000000" w:firstRow="0" w:lastRow="0" w:firstColumn="0" w:lastColumn="0" w:oddVBand="1" w:evenVBand="0" w:oddHBand="0" w:evenHBand="0" w:firstRowFirstColumn="0" w:firstRowLastColumn="0" w:lastRowFirstColumn="0" w:lastRowLastColumn="0"/>
+            <w:tcW w:w="3703" w:type="dxa"/>
+            <w:shd w:val="clear" w:color="auto" w:fill="0B769F" w:themeFill="accent4" w:themeFillShade="BF"/>
+          </w:tcPr>
+          <w:p>
+            <w:pPr>
+              <w:spacing w:after="160" w:line="278" w:lineRule="auto"/>
+              <w:jc w:val="both"/>
+              <w:rPr>
+                <w:b/>
+                <w:bCs/>
+              </w:rPr>
+            </w:pPr>
+            <w:r>
+              <w:rPr>
+                <w:b/>
+                <w:bCs/>
+              </w:rPr>
+              <w:t>Supervisor</w:t>
+            </w:r>
+          </w:p>
+        </w:tc>
+        <w:tc>
+          <w:tcPr>
+            <w:cnfStyle w:val="000001000000" w:firstRow="0" w:lastRow="0" w:firstColumn="0" w:lastColumn="0" w:oddVBand="0" w:evenVBand="1" w:oddHBand="0" w:evenHBand="0" w:firstRowFirstColumn="0" w:firstRowLastColumn="0" w:lastRowFirstColumn="0" w:lastRowLastColumn="0"/>
+            <w:tcW w:w="5135" w:type="dxa"/>
+            <w:shd w:val="clear" w:color="auto" w:fill="0B769F" w:themeFill="accent4" w:themeFillShade="BF"/>
+          </w:tcPr>
+          <w:p>
+            <w:pPr>
+              <w:spacing w:after="160" w:line="278" w:lineRule="auto"/>
+              <w:jc w:val="both"/>
+              <w:rPr>
+                <w:b/>
+                <w:bCs/>
+              </w:rPr>
+            </w:pPr>
+            <w:r>
+              <w:rPr>
+                <w:b/>
+                <w:bCs/>
+              </w:rPr>
+              <w:t xml:space="preserve">Mr. </w:t>
+            </w:r>
+            <w:proofErr w:type="spellStart"/>
+            <w:r>
+              <w:rPr>
+                <w:b/>
+                <w:bCs/>
+              </w:rPr>
+              <w:t>Dumira</w:t>
+            </w:r>
+            <w:proofErr w:type="spellEnd"/>
+            <w:r>
+              <w:rPr>
+                <w:b/>
+                <w:bCs/>
+              </w:rPr>
+              <w:t xml:space="preserve"> Athukorala</w:t>
+            </w:r>
+          </w:p>
+        </w:tc>
+      </w:tr>
+    </w:tbl>
+    <w:p>
+      <w:pPr>
+        <w:jc w:val="center"/>
+        <w:rPr>
+          <w:b/>
+          <w:bCs/>
+          <w:sz w:val="44"/>
+          <w:szCs w:val="44"/>
+        </w:rPr>
+      </w:pPr>
+    </w:p>
+    <w:p>
+      <w:pPr>
+        <w:jc w:val="center"/>
+        <w:rPr>
+          <w:b/>
+          <w:bCs/>
+          <w:sz w:val="44"/>
+          <w:szCs w:val="44"/>
+        </w:rPr>
+      </w:pPr>
+    </w:p>
+    <w:p>
+      <w:pPr>
+        <w:jc w:val="center"/>
+        <w:rPr>
+          <w:b/>
+          <w:bCs/>
+          <w:sz w:val="44"/>
+          <w:szCs w:val="44"/>
+        </w:rPr>
+      </w:pPr>
+    </w:p>
+    <w:p>
+      <w:pPr>
+        <w:jc w:val="center"/>
+        <w:rPr>
+          <w:i/>
+          <w:iCs/>
+        </w:rPr>
+      </w:pPr>
+      <w:r>
+        <w:rPr>
+          <w:b/>
+          <w:bCs/>
+        </w:rPr>
+        <w:t xml:space="preserve"> </w:t>
+      </w:r>
+      <w:r>
+        <w:rPr>
+          <w:i/>
+          <w:iCs/>
+        </w:rPr>
+        <w:t xml:space="preserve">MSc Data Science </w:t>
+      </w:r>
+    </w:p>
+    <w:p>
+      <w:pPr>
+        <w:jc w:val="center"/>
+        <w:rPr>
+          <w:i/>
+          <w:iCs/>
+        </w:rPr>
+      </w:pPr>
+      <w:r>
+        <w:rPr>
+          <w:i/>
+          <w:iCs/>
+        </w:rPr>
+        <w:t>Coventry University UK</w:t>
+      </w:r>
+    </w:p>
+    <w:p>
+      <w:pPr>
+        <w:jc w:val="center"/>
+        <w:rPr>
+          <w:b/>
+          <w:bCs/>
+          <w:i/>
+          <w:iCs/>
+          <w:sz w:val="28"/>
+          <w:szCs w:val="28"/>
+        </w:rPr>
+      </w:pPr>
+      <w:r>
+        <w:rPr>
+          <w:b/>
+          <w:bCs/>
+          <w:i/>
+          <w:iCs/>
+          <w:sz w:val="28"/>
+          <w:szCs w:val="28"/>
+        </w:rPr>
+        <w:lastRenderedPageBreak/>
+        <w:t>Low-Cost Offline Voice Assistant for Hospitality Services in Sri Lanka Using Small-Scale Neural Models</w:t>
+      </w:r>
+    </w:p>
+    <w:p>
+      <w:pPr>
+        <w:jc w:val="both"/>
+        <w:rPr>
+          <w:b/>
+          <w:bCs/>
+        </w:rPr>
+      </w:pPr>
+    </w:p>
+    <w:p>
+      <w:pPr>
+        <w:jc w:val="both"/>
+        <w:rPr>
+          <w:b/>
+          <w:bCs/>
+        </w:rPr>
+      </w:pPr>
+      <w:r>
+        <w:rPr>
+          <w:b/>
+          <w:bCs/>
+        </w:rPr>
+        <w:t>Introduction</w:t>
+      </w:r>
+    </w:p>
+    <w:p>
+      <w:pPr>
+        <w:jc w:val="both"/>
+      </w:pPr>
+      <w:r>
+        <w:t>Sri Lanka's hospitality industry is a major part of the national economy, and hotels are always looking for ways to improve the guest experience while keeping costs down. The most common way guests request room services today</w:t>
+      </w:r>
+      <w:r>
+        <w:t>,</w:t>
+      </w:r>
+      <w:r>
+        <w:t xml:space="preserve"> calling the front desk or filling in a paper form is slow and unreliable. Requests get delayed, staff miss things, and there is no easy way to track what was asked for or when.</w:t>
+      </w:r>
+    </w:p>
+    <w:p>
+      <w:pPr>
+        <w:jc w:val="both"/>
+      </w:pPr>
+      <w:r>
+        <w:t xml:space="preserve">Systems like Amazon Alexa for Hospitality and Google Nest Hub have tried to solve this with voice assistants. But these products depend on cloud servers, </w:t>
+      </w:r>
+      <w:proofErr w:type="gramStart"/>
+      <w:r>
+        <w:t>need</w:t>
+      </w:r>
+      <w:proofErr w:type="gramEnd"/>
+      <w:r>
+        <w:t xml:space="preserve"> a reliable internet connection, and send guest voice data to third-party servers. That raises privacy concerns. They also cost a lot to run hardware, licensing, and API fees add up quickly. For most hotels in Sri Lanka, that kind of investment simply is not practical.</w:t>
+      </w:r>
+    </w:p>
+    <w:p>
+      <w:pPr>
+        <w:jc w:val="both"/>
+      </w:pPr>
+      <w:r>
+        <w:t xml:space="preserve">This research builds a voice assistant designed specifically for hotel room service. It runs entirely on a standard </w:t>
+      </w:r>
+      <w:r>
+        <w:t>commodity</w:t>
+      </w:r>
+      <w:r>
+        <w:t xml:space="preserve"> </w:t>
+      </w:r>
+      <w:r>
+        <w:t xml:space="preserve">mobile </w:t>
+      </w:r>
+      <w:r>
+        <w:t>device</w:t>
+      </w:r>
+      <w:r>
+        <w:t xml:space="preserve"> </w:t>
+      </w:r>
+      <w:r>
+        <w:t xml:space="preserve">which </w:t>
+      </w:r>
+      <w:r>
+        <w:t>provides</w:t>
+      </w:r>
+      <w:r>
+        <w:t xml:space="preserve"> speech-to-text (STT), intent classification, and text-to-speech (TTS) capabilities operating entirely on-device </w:t>
+      </w:r>
+      <w:r>
+        <w:t>w</w:t>
+      </w:r>
+      <w:r>
+        <w:t>ithin a local network</w:t>
+      </w:r>
+      <w:r>
+        <w:t xml:space="preserve">. No internet is needed. No guest data leaves the building. Guests </w:t>
+      </w:r>
+      <w:proofErr w:type="gramStart"/>
+      <w:r>
+        <w:t>speak</w:t>
+      </w:r>
+      <w:proofErr w:type="gramEnd"/>
+      <w:r>
+        <w:t xml:space="preserve"> their request, the device understands it, routes it to the right department, and staff can see and manage all requests on a web dashboard in real time.</w:t>
       </w:r>
     </w:p>
     <w:p>
@@ -73,22 +853,56 @@
           <w:lang w:val="en-GB"/>
         </w:rPr>
       </w:pPr>
-      <w:r>
-        <w:rPr>
-          <w:b/>
-          <w:bCs/>
-          <w:lang w:val="en-GB"/>
-        </w:rPr>
-        <w:br w:type="page"/>
-      </w:r>
-    </w:p>
-    <w:p>
-      <w:pPr>
-        <w:jc w:val="both"/>
-        <w:rPr>
-          <w:b/>
-          <w:bCs/>
-        </w:rPr>
+    </w:p>
+    <w:p>
+      <w:pPr>
+        <w:jc w:val="both"/>
+        <w:rPr>
+          <w:b/>
+          <w:bCs/>
+        </w:rPr>
+      </w:pPr>
+      <w:r>
+        <w:rPr>
+          <w:b/>
+          <w:bCs/>
+        </w:rPr>
+        <w:t>Problem Statement</w:t>
+      </w:r>
+    </w:p>
+    <w:p>
+      <w:pPr>
+        <w:jc w:val="both"/>
+      </w:pPr>
+      <w:r>
+        <w:t>Hotels in Sri Lanka handle guest room service requests through phone calls, paper forms, or basic digital systems. Even where some digitization exists, the process remains largely manual</w:t>
+      </w:r>
+      <w:r>
+        <w:t>,</w:t>
+      </w:r>
+      <w:r>
+        <w:t xml:space="preserve"> staff still take requests by hand, there is no real-time tracking, and missed or delayed requests are common. Language barriers make it worse.</w:t>
+      </w:r>
+    </w:p>
+    <w:p>
+      <w:pPr>
+        <w:jc w:val="both"/>
+      </w:pPr>
+      <w:r>
+        <w:t>Commercial voice assistants like Alexa for Hospitality exist, but they are not a realistic option for most Sri Lankan hotels. They need a stable internet connection, send guest audio to third-party cloud servers, and carry ongoing licensing and API costs that smaller properties simply cannot absorb.</w:t>
+      </w:r>
+    </w:p>
+    <w:p>
+      <w:pPr>
+        <w:jc w:val="both"/>
+      </w:pPr>
+      <w:r>
+        <w:t>The gap is clear: existing approaches lack real automation, and the commercial alternatives are too costly and too privacy-invasive to fill that gap.</w:t>
+      </w:r>
+    </w:p>
+    <w:p>
+      <w:pPr>
+        <w:jc w:val="both"/>
       </w:pPr>
       <w:r>
         <w:rPr>
@@ -96,138 +910,6 @@
           <w:bCs/>
         </w:rPr>
         <w:lastRenderedPageBreak/>
-        <w:t>Introduction</w:t>
-      </w:r>
-    </w:p>
-    <w:p>
-      <w:pPr>
-        <w:jc w:val="both"/>
-      </w:pPr>
-      <w:r>
-        <w:t>Sri Lanka's hospitality industry is a major part of the national economy, and hotels are always looking for ways to improve the guest experience while keeping costs down. The most common way guests request room services today calling the front desk or filling in a paper form is slow and unreliable. Requests get delayed, staff miss things, and there is no easy way to track what was asked for or when.</w:t>
-      </w:r>
-    </w:p>
-    <w:p>
-      <w:pPr>
-        <w:jc w:val="both"/>
-      </w:pPr>
-      <w:r>
-        <w:t xml:space="preserve">Systems like Amazon Alexa for Hospitality and Google Nest Hub have tried to solve this with voice assistants. But these products depend on cloud servers, </w:t>
-      </w:r>
-      <w:proofErr w:type="gramStart"/>
-      <w:r>
-        <w:t>need</w:t>
-      </w:r>
-      <w:proofErr w:type="gramEnd"/>
-      <w:r>
-        <w:t xml:space="preserve"> a reliable internet connection, and send guest voice data to third-party servers. That raises privacy concerns. They also cost a lot to run hardware, licensing, and API fees add up quickly. For most hotels in Sri Lanka, that kind of investment simply is not practical.</w:t>
-      </w:r>
-    </w:p>
-    <w:p>
-      <w:pPr>
-        <w:jc w:val="both"/>
-      </w:pPr>
-      <w:r>
-        <w:t xml:space="preserve">This research builds a voice assistant designed specifically for hotel room service. It runs entirely on a standard </w:t>
-      </w:r>
-      <w:r>
-        <w:t>commodity</w:t>
-      </w:r>
-      <w:r>
-        <w:t xml:space="preserve"> </w:t>
-      </w:r>
-      <w:r>
-        <w:t xml:space="preserve">mobile </w:t>
-      </w:r>
-      <w:r>
-        <w:t>device</w:t>
-      </w:r>
-      <w:r>
-        <w:t xml:space="preserve"> </w:t>
-      </w:r>
-      <w:r>
-        <w:t xml:space="preserve">which </w:t>
-      </w:r>
-      <w:r>
-        <w:t>provides</w:t>
-      </w:r>
-      <w:r>
-        <w:t xml:space="preserve"> speech-to-text (STT), intent classification, and text-to-speech (TTS) capabilities operating entirely on-device </w:t>
-      </w:r>
-      <w:r>
-        <w:t>w</w:t>
-      </w:r>
-      <w:r>
-        <w:t>ithin a local network</w:t>
-      </w:r>
-      <w:r>
-        <w:t xml:space="preserve">. No internet is needed. No guest data leaves the building. Guests </w:t>
-      </w:r>
-      <w:proofErr w:type="gramStart"/>
-      <w:r>
-        <w:t>speak</w:t>
-      </w:r>
-      <w:proofErr w:type="gramEnd"/>
-      <w:r>
-        <w:t xml:space="preserve"> their request, the device understands it, routes it to the right department, and staff can see and manage all requests on a web dashboard in real time.</w:t>
-      </w:r>
-    </w:p>
-    <w:p>
-      <w:pPr>
-        <w:jc w:val="both"/>
-        <w:rPr>
-          <w:b/>
-          <w:bCs/>
-          <w:lang w:val="en-GB"/>
-        </w:rPr>
-      </w:pPr>
-    </w:p>
-    <w:p>
-      <w:pPr>
-        <w:jc w:val="both"/>
-        <w:rPr>
-          <w:b/>
-          <w:bCs/>
-        </w:rPr>
-      </w:pPr>
-      <w:r>
-        <w:rPr>
-          <w:b/>
-          <w:bCs/>
-        </w:rPr>
-        <w:t>Problem Statement</w:t>
-      </w:r>
-    </w:p>
-    <w:p>
-      <w:pPr>
-        <w:jc w:val="both"/>
-      </w:pPr>
-      <w:r>
-        <w:t>Hotels in developing economies like Sri Lanka face a specific problem: the commercial voice assistant options are either too expensive or require cloud access that is not always reliable. Beyond cost, there is a real privacy issue guests are increasingly uncomfortable knowing their voice is being sent to a remote server.</w:t>
-      </w:r>
-    </w:p>
-    <w:p>
-      <w:pPr>
-        <w:jc w:val="both"/>
-      </w:pPr>
-      <w:r>
-        <w:t>Phone-based room service has its own problems too. There are language barriers, long wait times, and no way to systematically track whether requests are being handled. The whole process depends on staff availability at any given moment.</w:t>
-      </w:r>
-    </w:p>
-    <w:p>
-      <w:pPr>
-        <w:jc w:val="both"/>
-      </w:pPr>
-    </w:p>
-    <w:p>
-      <w:pPr>
-        <w:jc w:val="both"/>
-      </w:pPr>
-      <w:r>
-        <w:rPr>
-          <w:b/>
-          <w:bCs/>
-        </w:rPr>
         <w:t>Research Question</w:t>
       </w:r>
     </w:p>
@@ -259,7 +941,7 @@
         <w:jc w:val="both"/>
       </w:pPr>
       <w:r>
-        <w:t>The aim of this project is to design, build, and evaluate a complete system that runs inside a hotel's local network with no cloud dependency at all</w:t>
+        <w:t>The aim of this project is to design, build, and evaluate a system that runs inside a hotel's local network with no cloud dependency at all</w:t>
       </w:r>
       <w:r>
         <w:t>.</w:t>
@@ -273,12 +955,20 @@
           <w:bCs/>
         </w:rPr>
       </w:pPr>
-      <w:r>
-        <w:rPr>
-          <w:b/>
-          <w:bCs/>
-        </w:rPr>
-        <w:lastRenderedPageBreak/>
+    </w:p>
+    <w:p>
+      <w:pPr>
+        <w:jc w:val="both"/>
+        <w:rPr>
+          <w:b/>
+          <w:bCs/>
+        </w:rPr>
+      </w:pPr>
+      <w:r>
+        <w:rPr>
+          <w:b/>
+          <w:bCs/>
+        </w:rPr>
         <w:t>Objectives</w:t>
       </w:r>
     </w:p>
@@ -309,13 +999,7 @@
         <w:jc w:val="both"/>
       </w:pPr>
       <w:r>
-        <w:t xml:space="preserve">Create a hotel-specific intent classification dataset covering the most common room service request </w:t>
-      </w:r>
-      <w:r>
-        <w:t>categories and</w:t>
-      </w:r>
-      <w:r>
-        <w:t xml:space="preserve"> train an intent classification model that can handle the accuracy challenges introduced by on-device speech recognition.</w:t>
+        <w:t>Create a hotel-specific intent classification dataset covering the most common room service request categories and train an intent classification model that can handle the accuracy challenges introduced by on-device speech recognition.</w:t>
       </w:r>
     </w:p>
     <w:p>
@@ -429,15 +1113,31 @@
       </w:r>
       <w:proofErr w:type="spellEnd"/>
       <w:r>
-        <w:t xml:space="preserve"> running on edge hardware with very low latency, making it a practical choice for real-time use. OpenAI's Whisper (Radford et al., 2023) is more accurate, but it needs far more computing power than a budget Android device can provide.</w:t>
-      </w:r>
-    </w:p>
-    <w:p>
-      <w:pPr>
-        <w:jc w:val="both"/>
-      </w:pPr>
-      <w:r>
-        <w:t xml:space="preserve">Small-Scale NLU Models make it possible to run natural language understanding on a phone or tablet. </w:t>
+        <w:t xml:space="preserve"> running on edge hardware with very low latency, making it a </w:t>
+      </w:r>
+      <w:r>
+        <w:lastRenderedPageBreak/>
+        <w:t>practical choice for real-time use. OpenAI's Whisper (Radford et al., 2023) is more accurate, but it needs far more computing power than a budget Android device can provide.</w:t>
+      </w:r>
+    </w:p>
+    <w:p>
+      <w:pPr>
+        <w:jc w:val="both"/>
+      </w:pPr>
+      <w:r>
+        <w:t xml:space="preserve">Small-Scale NLU </w:t>
+      </w:r>
+      <w:r>
+        <w:t>(</w:t>
+      </w:r>
+      <w:r>
+        <w:t>Natural Language Understanding</w:t>
+      </w:r>
+      <w:r>
+        <w:t xml:space="preserve">) </w:t>
+      </w:r>
+      <w:r>
+        <w:t xml:space="preserve">Models make it possible to run natural language understanding on a phone or tablet. </w:t>
       </w:r>
       <w:proofErr w:type="spellStart"/>
       <w:r>
@@ -501,7 +1201,6 @@
         <w:jc w:val="both"/>
       </w:pPr>
       <w:r>
-        <w:lastRenderedPageBreak/>
         <w:t xml:space="preserve">Edge Computing and Privacy are central to this project's design. Shi et al. (2016) established that processing data at the network edge rather than sending it to the cloud cuts both latency and privacy risk. Purdue University (2018) documented specific privacy vulnerabilities in hotel Alexa deployments. More recent work (2025) showed that </w:t>
       </w:r>
       <w:r>
@@ -647,6 +1346,7 @@
         <w:jc w:val="both"/>
       </w:pPr>
       <w:r>
+        <w:lastRenderedPageBreak/>
         <w:t>Small-scale NLU models for resource-constrained devices</w:t>
       </w:r>
     </w:p>
@@ -685,24 +1385,6 @@
       <w:r>
         <w:t>Sri Lankan hospitality context and digital readiness</w:t>
       </w:r>
-    </w:p>
-    <w:p>
-      <w:pPr>
-        <w:ind w:left="720"/>
-        <w:jc w:val="both"/>
-      </w:pPr>
-    </w:p>
-    <w:p>
-      <w:pPr>
-        <w:ind w:left="720"/>
-        <w:jc w:val="both"/>
-      </w:pPr>
-    </w:p>
-    <w:p>
-      <w:pPr>
-        <w:ind w:left="720"/>
-        <w:jc w:val="both"/>
-      </w:pPr>
     </w:p>
     <w:p>
       <w:pPr>
@@ -722,7 +1404,6 @@
           <w:b/>
           <w:bCs/>
         </w:rPr>
-        <w:lastRenderedPageBreak/>
         <w:t>Dataset Preparation</w:t>
       </w:r>
     </w:p>
@@ -900,7 +1581,13 @@
         <w:jc w:val="both"/>
       </w:pPr>
       <w:r>
-        <w:t>The full system will be built across three components:</w:t>
+        <w:t xml:space="preserve">The </w:t>
+      </w:r>
+      <w:r>
+        <w:t>prototype</w:t>
+      </w:r>
+      <w:r>
+        <w:t xml:space="preserve"> system will be built across three components:</w:t>
       </w:r>
     </w:p>
     <w:p>
@@ -924,6 +1611,7 @@
         <w:jc w:val="both"/>
       </w:pPr>
       <w:r>
+        <w:lastRenderedPageBreak/>
         <w:t>Backend Server: Manages the request lifecycle, routes requests to the correct department automatically, and handles real-time bidirectional communication with both guest devices and staff.</w:t>
       </w:r>
     </w:p>
@@ -957,7 +1645,6 @@
           <w:b/>
           <w:bCs/>
         </w:rPr>
-        <w:lastRenderedPageBreak/>
         <w:t>Evaluation</w:t>
       </w:r>
     </w:p>
@@ -1131,7 +1818,7 @@
                     </pic:cNvPicPr>
                   </pic:nvPicPr>
                   <pic:blipFill>
-                    <a:blip r:embed="rId8">
+                    <a:blip r:embed="rId10">
                       <a:extLst>
                         <a:ext uri="{28A0092B-C50C-407E-A947-70E740481C1C}">
                           <a14:useLocalDpi xmlns:a14="http://schemas.microsoft.com/office/drawing/2010/main" val="0"/>
@@ -1457,25 +2144,24 @@
       <w:tblPr>
         <w:tblStyle w:val="TableGridLight"/>
         <w:tblW w:w="0" w:type="auto"/>
-        <w:tblInd w:w="2095" w:type="dxa"/>
+        <w:tblInd w:w="3" w:type="dxa"/>
         <w:tblLook w:val="04A0" w:firstRow="1" w:lastRow="0" w:firstColumn="1" w:lastColumn="0" w:noHBand="0" w:noVBand="1"/>
       </w:tblPr>
       <w:tblGrid>
-        <w:gridCol w:w="2521"/>
-        <w:gridCol w:w="818"/>
-        <w:gridCol w:w="818"/>
-        <w:gridCol w:w="1014"/>
+        <w:gridCol w:w="3773"/>
+        <w:gridCol w:w="1805"/>
       </w:tblGrid>
       <w:tr>
         <w:tc>
           <w:tcPr>
             <w:tcW w:w="0" w:type="auto"/>
+            <w:shd w:val="clear" w:color="auto" w:fill="D9D9D9" w:themeFill="background1" w:themeFillShade="D9"/>
             <w:hideMark/>
           </w:tcPr>
           <w:p>
             <w:pPr>
               <w:spacing w:after="160" w:line="278" w:lineRule="auto"/>
-              <w:jc w:val="both"/>
+              <w:jc w:val="center"/>
               <w:rPr>
                 <w:rFonts w:asciiTheme="minorHAnsi" w:hAnsiTheme="minorHAnsi"/>
                 <w:b/>
@@ -1490,19 +2176,20 @@
                 <w:bCs/>
                 <w:lang w:val="en-US"/>
               </w:rPr>
-              <w:t>Activity</w:t>
+              <w:t>Work Package</w:t>
             </w:r>
           </w:p>
         </w:tc>
         <w:tc>
           <w:tcPr>
             <w:tcW w:w="0" w:type="auto"/>
+            <w:shd w:val="clear" w:color="auto" w:fill="D9D9D9" w:themeFill="background1" w:themeFillShade="D9"/>
             <w:hideMark/>
           </w:tcPr>
           <w:p>
             <w:pPr>
               <w:spacing w:after="160" w:line="278" w:lineRule="auto"/>
-              <w:jc w:val="both"/>
+              <w:jc w:val="center"/>
               <w:rPr>
                 <w:rFonts w:asciiTheme="minorHAnsi" w:hAnsiTheme="minorHAnsi"/>
                 <w:b/>
@@ -1517,61 +2204,7 @@
                 <w:bCs/>
                 <w:lang w:val="en-US"/>
               </w:rPr>
-              <w:t>Start</w:t>
-            </w:r>
-          </w:p>
-        </w:tc>
-        <w:tc>
-          <w:tcPr>
-            <w:tcW w:w="0" w:type="auto"/>
-            <w:hideMark/>
-          </w:tcPr>
-          <w:p>
-            <w:pPr>
-              <w:spacing w:after="160" w:line="278" w:lineRule="auto"/>
-              <w:jc w:val="both"/>
-              <w:rPr>
-                <w:rFonts w:asciiTheme="minorHAnsi" w:hAnsiTheme="minorHAnsi"/>
-                <w:b/>
-                <w:bCs/>
-                <w:lang w:val="en-US"/>
-              </w:rPr>
-            </w:pPr>
-            <w:r>
-              <w:rPr>
-                <w:rFonts w:asciiTheme="minorHAnsi" w:hAnsiTheme="minorHAnsi"/>
-                <w:b/>
-                <w:bCs/>
-                <w:lang w:val="en-US"/>
-              </w:rPr>
-              <w:t>End</w:t>
-            </w:r>
-          </w:p>
-        </w:tc>
-        <w:tc>
-          <w:tcPr>
-            <w:tcW w:w="0" w:type="auto"/>
-            <w:hideMark/>
-          </w:tcPr>
-          <w:p>
-            <w:pPr>
-              <w:spacing w:after="160" w:line="278" w:lineRule="auto"/>
-              <w:jc w:val="both"/>
-              <w:rPr>
-                <w:rFonts w:asciiTheme="minorHAnsi" w:hAnsiTheme="minorHAnsi"/>
-                <w:b/>
-                <w:bCs/>
-                <w:lang w:val="en-US"/>
-              </w:rPr>
-            </w:pPr>
-            <w:r>
-              <w:rPr>
-                <w:rFonts w:asciiTheme="minorHAnsi" w:hAnsiTheme="minorHAnsi"/>
-                <w:b/>
-                <w:bCs/>
-                <w:lang w:val="en-US"/>
-              </w:rPr>
-              <w:t>Duration</w:t>
+              <w:t>Planned Duration</w:t>
             </w:r>
           </w:p>
         </w:tc>
@@ -1596,335 +2229,7 @@
                 <w:rFonts w:asciiTheme="minorHAnsi" w:hAnsiTheme="minorHAnsi"/>
                 <w:lang w:val="en-US"/>
               </w:rPr>
-              <w:t>Literature Review</w:t>
-            </w:r>
-          </w:p>
-        </w:tc>
-        <w:tc>
-          <w:tcPr>
-            <w:tcW w:w="0" w:type="auto"/>
-            <w:hideMark/>
-          </w:tcPr>
-          <w:p>
-            <w:pPr>
-              <w:spacing w:after="160" w:line="278" w:lineRule="auto"/>
-              <w:jc w:val="both"/>
-              <w:rPr>
-                <w:rFonts w:asciiTheme="minorHAnsi" w:hAnsiTheme="minorHAnsi"/>
-                <w:lang w:val="en-US"/>
-              </w:rPr>
-            </w:pPr>
-            <w:r>
-              <w:rPr>
-                <w:rFonts w:asciiTheme="minorHAnsi" w:hAnsiTheme="minorHAnsi"/>
-                <w:lang w:val="en-US"/>
-              </w:rPr>
-              <w:t>Oct 01</w:t>
-            </w:r>
-          </w:p>
-        </w:tc>
-        <w:tc>
-          <w:tcPr>
-            <w:tcW w:w="0" w:type="auto"/>
-            <w:hideMark/>
-          </w:tcPr>
-          <w:p>
-            <w:pPr>
-              <w:spacing w:after="160" w:line="278" w:lineRule="auto"/>
-              <w:jc w:val="both"/>
-              <w:rPr>
-                <w:rFonts w:asciiTheme="minorHAnsi" w:hAnsiTheme="minorHAnsi"/>
-                <w:lang w:val="en-US"/>
-              </w:rPr>
-            </w:pPr>
-            <w:r>
-              <w:rPr>
-                <w:rFonts w:asciiTheme="minorHAnsi" w:hAnsiTheme="minorHAnsi"/>
-                <w:lang w:val="en-US"/>
-              </w:rPr>
-              <w:t>Oct 28</w:t>
-            </w:r>
-          </w:p>
-        </w:tc>
-        <w:tc>
-          <w:tcPr>
-            <w:tcW w:w="0" w:type="auto"/>
-            <w:hideMark/>
-          </w:tcPr>
-          <w:p>
-            <w:pPr>
-              <w:spacing w:after="160" w:line="278" w:lineRule="auto"/>
-              <w:jc w:val="both"/>
-              <w:rPr>
-                <w:rFonts w:asciiTheme="minorHAnsi" w:hAnsiTheme="minorHAnsi"/>
-                <w:lang w:val="en-US"/>
-              </w:rPr>
-            </w:pPr>
-            <w:r>
-              <w:rPr>
-                <w:rFonts w:asciiTheme="minorHAnsi" w:hAnsiTheme="minorHAnsi"/>
-                <w:lang w:val="en-US"/>
-              </w:rPr>
-              <w:t>4 weeks</w:t>
-            </w:r>
-          </w:p>
-        </w:tc>
-      </w:tr>
-      <w:tr>
-        <w:tc>
-          <w:tcPr>
-            <w:tcW w:w="0" w:type="auto"/>
-            <w:hideMark/>
-          </w:tcPr>
-          <w:p>
-            <w:pPr>
-              <w:spacing w:after="160" w:line="278" w:lineRule="auto"/>
-              <w:jc w:val="both"/>
-              <w:rPr>
-                <w:rFonts w:asciiTheme="minorHAnsi" w:hAnsiTheme="minorHAnsi"/>
-                <w:lang w:val="en-US"/>
-              </w:rPr>
-            </w:pPr>
-            <w:r>
-              <w:rPr>
-                <w:rFonts w:asciiTheme="minorHAnsi" w:hAnsiTheme="minorHAnsi"/>
-                <w:lang w:val="en-US"/>
-              </w:rPr>
-              <w:t>Dataset Preparation</w:t>
-            </w:r>
-          </w:p>
-        </w:tc>
-        <w:tc>
-          <w:tcPr>
-            <w:tcW w:w="0" w:type="auto"/>
-            <w:hideMark/>
-          </w:tcPr>
-          <w:p>
-            <w:pPr>
-              <w:spacing w:after="160" w:line="278" w:lineRule="auto"/>
-              <w:jc w:val="both"/>
-              <w:rPr>
-                <w:rFonts w:asciiTheme="minorHAnsi" w:hAnsiTheme="minorHAnsi"/>
-                <w:lang w:val="en-US"/>
-              </w:rPr>
-            </w:pPr>
-            <w:r>
-              <w:rPr>
-                <w:rFonts w:asciiTheme="minorHAnsi" w:hAnsiTheme="minorHAnsi"/>
-                <w:lang w:val="en-US"/>
-              </w:rPr>
-              <w:t>Oct 15</w:t>
-            </w:r>
-          </w:p>
-        </w:tc>
-        <w:tc>
-          <w:tcPr>
-            <w:tcW w:w="0" w:type="auto"/>
-            <w:hideMark/>
-          </w:tcPr>
-          <w:p>
-            <w:pPr>
-              <w:spacing w:after="160" w:line="278" w:lineRule="auto"/>
-              <w:jc w:val="both"/>
-              <w:rPr>
-                <w:rFonts w:asciiTheme="minorHAnsi" w:hAnsiTheme="minorHAnsi"/>
-                <w:lang w:val="en-US"/>
-              </w:rPr>
-            </w:pPr>
-            <w:r>
-              <w:rPr>
-                <w:rFonts w:asciiTheme="minorHAnsi" w:hAnsiTheme="minorHAnsi"/>
-                <w:lang w:val="en-US"/>
-              </w:rPr>
-              <w:t>Nov 11</w:t>
-            </w:r>
-          </w:p>
-        </w:tc>
-        <w:tc>
-          <w:tcPr>
-            <w:tcW w:w="0" w:type="auto"/>
-            <w:hideMark/>
-          </w:tcPr>
-          <w:p>
-            <w:pPr>
-              <w:spacing w:after="160" w:line="278" w:lineRule="auto"/>
-              <w:jc w:val="both"/>
-              <w:rPr>
-                <w:rFonts w:asciiTheme="minorHAnsi" w:hAnsiTheme="minorHAnsi"/>
-                <w:lang w:val="en-US"/>
-              </w:rPr>
-            </w:pPr>
-            <w:r>
-              <w:rPr>
-                <w:rFonts w:asciiTheme="minorHAnsi" w:hAnsiTheme="minorHAnsi"/>
-                <w:lang w:val="en-US"/>
-              </w:rPr>
-              <w:t>4 weeks</w:t>
-            </w:r>
-          </w:p>
-        </w:tc>
-      </w:tr>
-      <w:tr>
-        <w:tc>
-          <w:tcPr>
-            <w:tcW w:w="0" w:type="auto"/>
-            <w:hideMark/>
-          </w:tcPr>
-          <w:p>
-            <w:pPr>
-              <w:spacing w:after="160" w:line="278" w:lineRule="auto"/>
-              <w:jc w:val="both"/>
-              <w:rPr>
-                <w:rFonts w:asciiTheme="minorHAnsi" w:hAnsiTheme="minorHAnsi"/>
-                <w:lang w:val="en-US"/>
-              </w:rPr>
-            </w:pPr>
-            <w:r>
-              <w:rPr>
-                <w:rFonts w:asciiTheme="minorHAnsi" w:hAnsiTheme="minorHAnsi"/>
-                <w:lang w:val="en-US"/>
-              </w:rPr>
-              <w:t>Model Training</w:t>
-            </w:r>
-          </w:p>
-        </w:tc>
-        <w:tc>
-          <w:tcPr>
-            <w:tcW w:w="0" w:type="auto"/>
-            <w:hideMark/>
-          </w:tcPr>
-          <w:p>
-            <w:pPr>
-              <w:spacing w:after="160" w:line="278" w:lineRule="auto"/>
-              <w:jc w:val="both"/>
-              <w:rPr>
-                <w:rFonts w:asciiTheme="minorHAnsi" w:hAnsiTheme="minorHAnsi"/>
-                <w:lang w:val="en-US"/>
-              </w:rPr>
-            </w:pPr>
-            <w:r>
-              <w:rPr>
-                <w:rFonts w:asciiTheme="minorHAnsi" w:hAnsiTheme="minorHAnsi"/>
-                <w:lang w:val="en-US"/>
-              </w:rPr>
-              <w:t>Nov 05</w:t>
-            </w:r>
-          </w:p>
-        </w:tc>
-        <w:tc>
-          <w:tcPr>
-            <w:tcW w:w="0" w:type="auto"/>
-            <w:hideMark/>
-          </w:tcPr>
-          <w:p>
-            <w:pPr>
-              <w:spacing w:after="160" w:line="278" w:lineRule="auto"/>
-              <w:jc w:val="both"/>
-              <w:rPr>
-                <w:rFonts w:asciiTheme="minorHAnsi" w:hAnsiTheme="minorHAnsi"/>
-                <w:lang w:val="en-US"/>
-              </w:rPr>
-            </w:pPr>
-            <w:r>
-              <w:rPr>
-                <w:rFonts w:asciiTheme="minorHAnsi" w:hAnsiTheme="minorHAnsi"/>
-                <w:lang w:val="en-US"/>
-              </w:rPr>
-              <w:t>Dec 02</w:t>
-            </w:r>
-          </w:p>
-        </w:tc>
-        <w:tc>
-          <w:tcPr>
-            <w:tcW w:w="0" w:type="auto"/>
-            <w:hideMark/>
-          </w:tcPr>
-          <w:p>
-            <w:pPr>
-              <w:spacing w:after="160" w:line="278" w:lineRule="auto"/>
-              <w:jc w:val="both"/>
-              <w:rPr>
-                <w:rFonts w:asciiTheme="minorHAnsi" w:hAnsiTheme="minorHAnsi"/>
-                <w:lang w:val="en-US"/>
-              </w:rPr>
-            </w:pPr>
-            <w:r>
-              <w:rPr>
-                <w:rFonts w:asciiTheme="minorHAnsi" w:hAnsiTheme="minorHAnsi"/>
-                <w:lang w:val="en-US"/>
-              </w:rPr>
-              <w:t>4 weeks</w:t>
-            </w:r>
-          </w:p>
-        </w:tc>
-      </w:tr>
-      <w:tr>
-        <w:tc>
-          <w:tcPr>
-            <w:tcW w:w="0" w:type="auto"/>
-            <w:hideMark/>
-          </w:tcPr>
-          <w:p>
-            <w:pPr>
-              <w:spacing w:after="160" w:line="278" w:lineRule="auto"/>
-              <w:jc w:val="both"/>
-              <w:rPr>
-                <w:rFonts w:asciiTheme="minorHAnsi" w:hAnsiTheme="minorHAnsi"/>
-                <w:lang w:val="en-US"/>
-              </w:rPr>
-            </w:pPr>
-            <w:r>
-              <w:rPr>
-                <w:rFonts w:asciiTheme="minorHAnsi" w:hAnsiTheme="minorHAnsi"/>
-                <w:lang w:val="en-US"/>
-              </w:rPr>
-              <w:t>Android App</w:t>
-            </w:r>
-          </w:p>
-        </w:tc>
-        <w:tc>
-          <w:tcPr>
-            <w:tcW w:w="0" w:type="auto"/>
-            <w:hideMark/>
-          </w:tcPr>
-          <w:p>
-            <w:pPr>
-              <w:spacing w:after="160" w:line="278" w:lineRule="auto"/>
-              <w:jc w:val="both"/>
-              <w:rPr>
-                <w:rFonts w:asciiTheme="minorHAnsi" w:hAnsiTheme="minorHAnsi"/>
-                <w:lang w:val="en-US"/>
-              </w:rPr>
-            </w:pPr>
-            <w:r>
-              <w:rPr>
-                <w:rFonts w:asciiTheme="minorHAnsi" w:hAnsiTheme="minorHAnsi"/>
-                <w:lang w:val="en-US"/>
-              </w:rPr>
-              <w:t>Nov 19</w:t>
-            </w:r>
-          </w:p>
-        </w:tc>
-        <w:tc>
-          <w:tcPr>
-            <w:tcW w:w="0" w:type="auto"/>
-            <w:hideMark/>
-          </w:tcPr>
-          <w:p>
-            <w:pPr>
-              <w:spacing w:after="160" w:line="278" w:lineRule="auto"/>
-              <w:jc w:val="both"/>
-              <w:rPr>
-                <w:rFonts w:asciiTheme="minorHAnsi" w:hAnsiTheme="minorHAnsi"/>
-                <w:lang w:val="en-US"/>
-              </w:rPr>
-            </w:pPr>
-            <w:r>
-              <w:rPr>
-                <w:rFonts w:asciiTheme="minorHAnsi" w:hAnsiTheme="minorHAnsi"/>
-                <w:lang w:val="en-US"/>
-              </w:rPr>
-              <w:t>Dec 23</w:t>
+              <w:t>Research and Planning</w:t>
             </w:r>
           </w:p>
         </w:tc>
@@ -1972,7 +2277,7 @@
                 <w:rFonts w:asciiTheme="minorHAnsi" w:hAnsiTheme="minorHAnsi"/>
                 <w:lang w:val="en-US"/>
               </w:rPr>
-              <w:t>Backend API</w:t>
+              <w:t>Dataset Development and Model Training</w:t>
             </w:r>
           </w:p>
         </w:tc>
@@ -1995,53 +2300,7 @@
                 <w:rFonts w:asciiTheme="minorHAnsi" w:hAnsiTheme="minorHAnsi"/>
                 <w:lang w:val="en-US"/>
               </w:rPr>
-              <w:t>Nov 26</w:t>
-            </w:r>
-          </w:p>
-        </w:tc>
-        <w:tc>
-          <w:tcPr>
-            <w:tcW w:w="0" w:type="auto"/>
-            <w:hideMark/>
-          </w:tcPr>
-          <w:p>
-            <w:pPr>
-              <w:spacing w:after="160" w:line="278" w:lineRule="auto"/>
-              <w:jc w:val="both"/>
-              <w:rPr>
-                <w:rFonts w:asciiTheme="minorHAnsi" w:hAnsiTheme="minorHAnsi"/>
-                <w:lang w:val="en-US"/>
-              </w:rPr>
-            </w:pPr>
-            <w:r>
-              <w:rPr>
-                <w:rFonts w:asciiTheme="minorHAnsi" w:hAnsiTheme="minorHAnsi"/>
-                <w:lang w:val="en-US"/>
-              </w:rPr>
-              <w:t>Dec 23</w:t>
-            </w:r>
-          </w:p>
-        </w:tc>
-        <w:tc>
-          <w:tcPr>
-            <w:tcW w:w="0" w:type="auto"/>
-            <w:hideMark/>
-          </w:tcPr>
-          <w:p>
-            <w:pPr>
-              <w:spacing w:after="160" w:line="278" w:lineRule="auto"/>
-              <w:jc w:val="both"/>
-              <w:rPr>
-                <w:rFonts w:asciiTheme="minorHAnsi" w:hAnsiTheme="minorHAnsi"/>
-                <w:lang w:val="en-US"/>
-              </w:rPr>
-            </w:pPr>
-            <w:r>
-              <w:rPr>
-                <w:rFonts w:asciiTheme="minorHAnsi" w:hAnsiTheme="minorHAnsi"/>
-                <w:lang w:val="en-US"/>
-              </w:rPr>
-              <w:t>4 weeks</w:t>
+              <w:t>5 weeks</w:t>
             </w:r>
           </w:p>
         </w:tc>
@@ -2066,7 +2325,7 @@
                 <w:rFonts w:asciiTheme="minorHAnsi" w:hAnsiTheme="minorHAnsi"/>
                 <w:lang w:val="en-US"/>
               </w:rPr>
-              <w:t>Staff Dashboard</w:t>
+              <w:t>Android Application Development</w:t>
             </w:r>
           </w:p>
         </w:tc>
@@ -2089,53 +2348,7 @@
                 <w:rFonts w:asciiTheme="minorHAnsi" w:hAnsiTheme="minorHAnsi"/>
                 <w:lang w:val="en-US"/>
               </w:rPr>
-              <w:t>Dec 10</w:t>
-            </w:r>
-          </w:p>
-        </w:tc>
-        <w:tc>
-          <w:tcPr>
-            <w:tcW w:w="0" w:type="auto"/>
-            <w:hideMark/>
-          </w:tcPr>
-          <w:p>
-            <w:pPr>
-              <w:spacing w:after="160" w:line="278" w:lineRule="auto"/>
-              <w:jc w:val="both"/>
-              <w:rPr>
-                <w:rFonts w:asciiTheme="minorHAnsi" w:hAnsiTheme="minorHAnsi"/>
-                <w:lang w:val="en-US"/>
-              </w:rPr>
-            </w:pPr>
-            <w:r>
-              <w:rPr>
-                <w:rFonts w:asciiTheme="minorHAnsi" w:hAnsiTheme="minorHAnsi"/>
-                <w:lang w:val="en-US"/>
-              </w:rPr>
-              <w:t>Jan 06</w:t>
-            </w:r>
-          </w:p>
-        </w:tc>
-        <w:tc>
-          <w:tcPr>
-            <w:tcW w:w="0" w:type="auto"/>
-            <w:hideMark/>
-          </w:tcPr>
-          <w:p>
-            <w:pPr>
-              <w:spacing w:after="160" w:line="278" w:lineRule="auto"/>
-              <w:jc w:val="both"/>
-              <w:rPr>
-                <w:rFonts w:asciiTheme="minorHAnsi" w:hAnsiTheme="minorHAnsi"/>
-                <w:lang w:val="en-US"/>
-              </w:rPr>
-            </w:pPr>
-            <w:r>
-              <w:rPr>
-                <w:rFonts w:asciiTheme="minorHAnsi" w:hAnsiTheme="minorHAnsi"/>
-                <w:lang w:val="en-US"/>
-              </w:rPr>
-              <w:t>4 weeks</w:t>
+              <w:t>8 weeks</w:t>
             </w:r>
           </w:p>
         </w:tc>
@@ -2160,7 +2373,7 @@
                 <w:rFonts w:asciiTheme="minorHAnsi" w:hAnsiTheme="minorHAnsi"/>
                 <w:lang w:val="en-US"/>
               </w:rPr>
-              <w:t>Integration &amp; Testing</w:t>
+              <w:t>Backend and Dashboard Development</w:t>
             </w:r>
           </w:p>
         </w:tc>
@@ -2183,53 +2396,7 @@
                 <w:rFonts w:asciiTheme="minorHAnsi" w:hAnsiTheme="minorHAnsi"/>
                 <w:lang w:val="en-US"/>
               </w:rPr>
-              <w:t>Dec 31</w:t>
-            </w:r>
-          </w:p>
-        </w:tc>
-        <w:tc>
-          <w:tcPr>
-            <w:tcW w:w="0" w:type="auto"/>
-            <w:hideMark/>
-          </w:tcPr>
-          <w:p>
-            <w:pPr>
-              <w:spacing w:after="160" w:line="278" w:lineRule="auto"/>
-              <w:jc w:val="both"/>
-              <w:rPr>
-                <w:rFonts w:asciiTheme="minorHAnsi" w:hAnsiTheme="minorHAnsi"/>
-                <w:lang w:val="en-US"/>
-              </w:rPr>
-            </w:pPr>
-            <w:r>
-              <w:rPr>
-                <w:rFonts w:asciiTheme="minorHAnsi" w:hAnsiTheme="minorHAnsi"/>
-                <w:lang w:val="en-US"/>
-              </w:rPr>
-              <w:t>Jan 27</w:t>
-            </w:r>
-          </w:p>
-        </w:tc>
-        <w:tc>
-          <w:tcPr>
-            <w:tcW w:w="0" w:type="auto"/>
-            <w:hideMark/>
-          </w:tcPr>
-          <w:p>
-            <w:pPr>
-              <w:spacing w:after="160" w:line="278" w:lineRule="auto"/>
-              <w:jc w:val="both"/>
-              <w:rPr>
-                <w:rFonts w:asciiTheme="minorHAnsi" w:hAnsiTheme="minorHAnsi"/>
-                <w:lang w:val="en-US"/>
-              </w:rPr>
-            </w:pPr>
-            <w:r>
-              <w:rPr>
-                <w:rFonts w:asciiTheme="minorHAnsi" w:hAnsiTheme="minorHAnsi"/>
-                <w:lang w:val="en-US"/>
-              </w:rPr>
-              <w:t>4 weeks</w:t>
+              <w:t>5 weeks</w:t>
             </w:r>
           </w:p>
         </w:tc>
@@ -2254,147 +2421,7 @@
                 <w:rFonts w:asciiTheme="minorHAnsi" w:hAnsiTheme="minorHAnsi"/>
                 <w:lang w:val="en-US"/>
               </w:rPr>
-              <w:t>Evaluation</w:t>
-            </w:r>
-          </w:p>
-        </w:tc>
-        <w:tc>
-          <w:tcPr>
-            <w:tcW w:w="0" w:type="auto"/>
-            <w:hideMark/>
-          </w:tcPr>
-          <w:p>
-            <w:pPr>
-              <w:spacing w:after="160" w:line="278" w:lineRule="auto"/>
-              <w:jc w:val="both"/>
-              <w:rPr>
-                <w:rFonts w:asciiTheme="minorHAnsi" w:hAnsiTheme="minorHAnsi"/>
-                <w:lang w:val="en-US"/>
-              </w:rPr>
-            </w:pPr>
-            <w:r>
-              <w:rPr>
-                <w:rFonts w:asciiTheme="minorHAnsi" w:hAnsiTheme="minorHAnsi"/>
-                <w:lang w:val="en-US"/>
-              </w:rPr>
-              <w:t>Jan 14</w:t>
-            </w:r>
-          </w:p>
-        </w:tc>
-        <w:tc>
-          <w:tcPr>
-            <w:tcW w:w="0" w:type="auto"/>
-            <w:hideMark/>
-          </w:tcPr>
-          <w:p>
-            <w:pPr>
-              <w:spacing w:after="160" w:line="278" w:lineRule="auto"/>
-              <w:jc w:val="both"/>
-              <w:rPr>
-                <w:rFonts w:asciiTheme="minorHAnsi" w:hAnsiTheme="minorHAnsi"/>
-                <w:lang w:val="en-US"/>
-              </w:rPr>
-            </w:pPr>
-            <w:r>
-              <w:rPr>
-                <w:rFonts w:asciiTheme="minorHAnsi" w:hAnsiTheme="minorHAnsi"/>
-                <w:lang w:val="en-US"/>
-              </w:rPr>
-              <w:t>Feb 10</w:t>
-            </w:r>
-          </w:p>
-        </w:tc>
-        <w:tc>
-          <w:tcPr>
-            <w:tcW w:w="0" w:type="auto"/>
-            <w:hideMark/>
-          </w:tcPr>
-          <w:p>
-            <w:pPr>
-              <w:spacing w:after="160" w:line="278" w:lineRule="auto"/>
-              <w:jc w:val="both"/>
-              <w:rPr>
-                <w:rFonts w:asciiTheme="minorHAnsi" w:hAnsiTheme="minorHAnsi"/>
-                <w:lang w:val="en-US"/>
-              </w:rPr>
-            </w:pPr>
-            <w:r>
-              <w:rPr>
-                <w:rFonts w:asciiTheme="minorHAnsi" w:hAnsiTheme="minorHAnsi"/>
-                <w:lang w:val="en-US"/>
-              </w:rPr>
-              <w:t>4 weeks</w:t>
-            </w:r>
-          </w:p>
-        </w:tc>
-      </w:tr>
-      <w:tr>
-        <w:tc>
-          <w:tcPr>
-            <w:tcW w:w="0" w:type="auto"/>
-            <w:hideMark/>
-          </w:tcPr>
-          <w:p>
-            <w:pPr>
-              <w:spacing w:after="160" w:line="278" w:lineRule="auto"/>
-              <w:jc w:val="both"/>
-              <w:rPr>
-                <w:rFonts w:asciiTheme="minorHAnsi" w:hAnsiTheme="minorHAnsi"/>
-                <w:lang w:val="en-US"/>
-              </w:rPr>
-            </w:pPr>
-            <w:r>
-              <w:rPr>
-                <w:rFonts w:asciiTheme="minorHAnsi" w:hAnsiTheme="minorHAnsi"/>
-                <w:lang w:val="en-US"/>
-              </w:rPr>
-              <w:t>Thesis Writing</w:t>
-            </w:r>
-          </w:p>
-        </w:tc>
-        <w:tc>
-          <w:tcPr>
-            <w:tcW w:w="0" w:type="auto"/>
-            <w:hideMark/>
-          </w:tcPr>
-          <w:p>
-            <w:pPr>
-              <w:spacing w:after="160" w:line="278" w:lineRule="auto"/>
-              <w:jc w:val="both"/>
-              <w:rPr>
-                <w:rFonts w:asciiTheme="minorHAnsi" w:hAnsiTheme="minorHAnsi"/>
-                <w:lang w:val="en-US"/>
-              </w:rPr>
-            </w:pPr>
-            <w:r>
-              <w:rPr>
-                <w:rFonts w:asciiTheme="minorHAnsi" w:hAnsiTheme="minorHAnsi"/>
-                <w:lang w:val="en-US"/>
-              </w:rPr>
-              <w:t>Jan 28</w:t>
-            </w:r>
-          </w:p>
-        </w:tc>
-        <w:tc>
-          <w:tcPr>
-            <w:tcW w:w="0" w:type="auto"/>
-            <w:hideMark/>
-          </w:tcPr>
-          <w:p>
-            <w:pPr>
-              <w:spacing w:after="160" w:line="278" w:lineRule="auto"/>
-              <w:jc w:val="both"/>
-              <w:rPr>
-                <w:rFonts w:asciiTheme="minorHAnsi" w:hAnsiTheme="minorHAnsi"/>
-                <w:lang w:val="en-US"/>
-              </w:rPr>
-            </w:pPr>
-            <w:r>
-              <w:rPr>
-                <w:rFonts w:asciiTheme="minorHAnsi" w:hAnsiTheme="minorHAnsi"/>
-                <w:lang w:val="en-US"/>
-              </w:rPr>
-              <w:t>Mar 10</w:t>
+              <w:t>Integration, Testing and Evaluation</w:t>
             </w:r>
           </w:p>
         </w:tc>
@@ -2442,7 +2469,7 @@
                 <w:rFonts w:asciiTheme="minorHAnsi" w:hAnsiTheme="minorHAnsi"/>
                 <w:lang w:val="en-US"/>
               </w:rPr>
-              <w:t>Final Review &amp; Submission</w:t>
+              <w:t>Report Writing and Submission</w:t>
             </w:r>
           </w:p>
         </w:tc>
@@ -2465,7 +2492,32 @@
                 <w:rFonts w:asciiTheme="minorHAnsi" w:hAnsiTheme="minorHAnsi"/>
                 <w:lang w:val="en-US"/>
               </w:rPr>
-              <w:t>Mar 04</w:t>
+              <w:t>13 weeks</w:t>
+            </w:r>
+          </w:p>
+        </w:tc>
+      </w:tr>
+      <w:tr>
+        <w:tc>
+          <w:tcPr>
+            <w:tcW w:w="0" w:type="auto"/>
+            <w:hideMark/>
+          </w:tcPr>
+          <w:p>
+            <w:pPr>
+              <w:spacing w:after="160" w:line="278" w:lineRule="auto"/>
+              <w:jc w:val="both"/>
+              <w:rPr>
+                <w:rFonts w:asciiTheme="minorHAnsi" w:hAnsiTheme="minorHAnsi"/>
+                <w:lang w:val="en-US"/>
+              </w:rPr>
+            </w:pPr>
+            <w:r>
+              <w:rPr>
+                <w:rFonts w:asciiTheme="minorHAnsi" w:eastAsiaTheme="majorEastAsia" w:hAnsiTheme="minorHAnsi"/>
+                <w:lang w:val="en-US"/>
+              </w:rPr>
+              <w:t>Total</w:t>
             </w:r>
           </w:p>
         </w:tc>
@@ -2485,33 +2537,10 @@
             </w:pPr>
             <w:r>
               <w:rPr>
-                <w:rFonts w:asciiTheme="minorHAnsi" w:hAnsiTheme="minorHAnsi"/>
+                <w:rFonts w:asciiTheme="minorHAnsi" w:eastAsiaTheme="majorEastAsia" w:hAnsiTheme="minorHAnsi"/>
                 <w:lang w:val="en-US"/>
               </w:rPr>
-              <w:t>Mar 31</w:t>
-            </w:r>
-          </w:p>
-        </w:tc>
-        <w:tc>
-          <w:tcPr>
-            <w:tcW w:w="0" w:type="auto"/>
-            <w:hideMark/>
-          </w:tcPr>
-          <w:p>
-            <w:pPr>
-              <w:spacing w:after="160" w:line="278" w:lineRule="auto"/>
-              <w:jc w:val="both"/>
-              <w:rPr>
-                <w:rFonts w:asciiTheme="minorHAnsi" w:hAnsiTheme="minorHAnsi"/>
-                <w:lang w:val="en-US"/>
-              </w:rPr>
-            </w:pPr>
-            <w:r>
-              <w:rPr>
-                <w:rFonts w:asciiTheme="minorHAnsi" w:hAnsiTheme="minorHAnsi"/>
-                <w:lang w:val="en-US"/>
-              </w:rPr>
-              <w:t>4 weeks</w:t>
+              <w:t>25 weeks</w:t>
             </w:r>
           </w:p>
         </w:tc>
@@ -2546,31 +2575,13 @@
       </w:pPr>
       <w:r>
         <w:rPr>
-          <w:b/>
-          <w:bCs/>
           <w:noProof/>
         </w:rPr>
         <w:drawing>
-          <wp:anchor distT="0" distB="0" distL="114300" distR="114300" simplePos="0" relativeHeight="251659264" behindDoc="1" locked="0" layoutInCell="1" allowOverlap="1" wp14:anchorId="34B09389" wp14:editId="0644078E">
-            <wp:simplePos x="0" y="0"/>
-            <wp:positionH relativeFrom="column">
-              <wp:posOffset>57150</wp:posOffset>
-            </wp:positionH>
-            <wp:positionV relativeFrom="paragraph">
-              <wp:posOffset>417195</wp:posOffset>
-            </wp:positionV>
-            <wp:extent cx="5943600" cy="2695575"/>
-            <wp:effectExtent l="0" t="0" r="0" b="9525"/>
-            <wp:wrapTight wrapText="bothSides">
-              <wp:wrapPolygon edited="0">
-                <wp:start x="0" y="0"/>
-                <wp:lineTo x="0" y="21524"/>
-                <wp:lineTo x="21531" y="21524"/>
-                <wp:lineTo x="21531" y="0"/>
-                <wp:lineTo x="0" y="0"/>
-              </wp:wrapPolygon>
-            </wp:wrapTight>
-            <wp:docPr id="1633467987" name="Picture 2"/>
+          <wp:inline distT="0" distB="0" distL="0" distR="0" wp14:anchorId="20F3D8D6" wp14:editId="4D240374">
+            <wp:extent cx="5943600" cy="1428750"/>
+            <wp:effectExtent l="0" t="0" r="0" b="0"/>
+            <wp:docPr id="1814530097" name="Picture 1"/>
             <wp:cNvGraphicFramePr>
               <a:graphicFrameLocks xmlns:a="http://schemas.openxmlformats.org/drawingml/2006/main" noChangeAspect="1"/>
             </wp:cNvGraphicFramePr>
@@ -2578,20 +2589,20 @@
               <a:graphicData uri="http://schemas.openxmlformats.org/drawingml/2006/picture">
                 <pic:pic xmlns:pic="http://schemas.openxmlformats.org/drawingml/2006/picture">
                   <pic:nvPicPr>
-                    <pic:cNvPr id="0" name="Picture 6"/>
+                    <pic:cNvPr id="0" name="Picture 1"/>
                     <pic:cNvPicPr>
                       <a:picLocks noChangeAspect="1" noChangeArrowheads="1"/>
                     </pic:cNvPicPr>
                   </pic:nvPicPr>
-                  <pic:blipFill rotWithShape="1">
-                    <a:blip r:embed="rId9">
+                  <pic:blipFill>
+                    <a:blip r:embed="rId11">
                       <a:extLst>
                         <a:ext uri="{28A0092B-C50C-407E-A947-70E740481C1C}">
                           <a14:useLocalDpi xmlns:a14="http://schemas.microsoft.com/office/drawing/2010/main" val="0"/>
                         </a:ext>
                       </a:extLst>
                     </a:blip>
-                    <a:srcRect b="39530"/>
+                    <a:srcRect/>
                     <a:stretch>
                       <a:fillRect/>
                     </a:stretch>
@@ -2599,7 +2610,7 @@
                   <pic:spPr bwMode="auto">
                     <a:xfrm>
                       <a:off x="0" y="0"/>
-                      <a:ext cx="5943600" cy="2695575"/>
+                      <a:ext cx="5948446" cy="1429915"/>
                     </a:xfrm>
                     <a:prstGeom prst="rect">
                       <a:avLst/>
@@ -2608,36 +2619,13 @@
                     <a:ln>
                       <a:noFill/>
                     </a:ln>
-                    <a:extLst>
-                      <a:ext uri="{53640926-AAD7-44D8-BBD7-CCE9431645EC}">
-                        <a14:shadowObscured xmlns:a14="http://schemas.microsoft.com/office/drawing/2010/main"/>
-                      </a:ext>
-                    </a:extLst>
                   </pic:spPr>
                 </pic:pic>
               </a:graphicData>
             </a:graphic>
-          </wp:anchor>
+          </wp:inline>
         </w:drawing>
       </w:r>
-    </w:p>
-    <w:p>
-      <w:pPr>
-        <w:jc w:val="both"/>
-        <w:rPr>
-          <w:b/>
-          <w:bCs/>
-        </w:rPr>
-      </w:pPr>
-    </w:p>
-    <w:p>
-      <w:pPr>
-        <w:jc w:val="both"/>
-        <w:rPr>
-          <w:b/>
-          <w:bCs/>
-        </w:rPr>
-      </w:pPr>
     </w:p>
     <w:p>
       <w:pPr>
@@ -2663,7 +2651,6 @@
           <w:b/>
           <w:bCs/>
         </w:rPr>
-        <w:lastRenderedPageBreak/>
         <w:t>Expected Outcome</w:t>
       </w:r>
     </w:p>
@@ -2690,7 +2677,19 @@
         <w:t>:</w:t>
       </w:r>
       <w:r>
-        <w:t> A complete, offline voice assistant running on a commodity Android device. The system handles the full request flow — voice input, intent classification, department routing, staff notification, and guest feedback — without any internet connection. It consists of an Android guest app, a backend server, and a web-based staff dashboard.</w:t>
+        <w:t xml:space="preserve"> A complete, offline voice assistant running on a commodity Android device. The system handles the full request flow </w:t>
+      </w:r>
+      <w:r>
+        <w:t>-</w:t>
+      </w:r>
+      <w:r>
+        <w:t xml:space="preserve"> voice input, intent classification, department routing, staff notification, and guest feedback </w:t>
+      </w:r>
+      <w:r>
+        <w:t>-</w:t>
+      </w:r>
+      <w:r>
+        <w:t xml:space="preserve"> without any internet connection. It consists of an Android guest app, a backend server, and a web-based staff dashboard.</w:t>
       </w:r>
     </w:p>
     <w:p>
@@ -2738,14 +2737,7 @@
           <w:b/>
           <w:bCs/>
         </w:rPr>
-        <w:t>A Fine-Tuned On-Device Intent Classification Model</w:t>
-      </w:r>
-      <w:r>
-        <w:rPr>
-          <w:b/>
-          <w:bCs/>
-        </w:rPr>
-        <w:t>:</w:t>
+        <w:t>A Fine-Tuned On-Device Intent Classification Model:</w:t>
       </w:r>
       <w:r>
         <w:t> </w:t>
@@ -2757,7 +2749,11 @@
         <w:t>optimized</w:t>
       </w:r>
       <w:r>
-        <w:t xml:space="preserve"> for on-device inference on commodity Android hardware. The model is expected to achieve greater than 90% intent classification accuracy under realistic speech recognition conditions.</w:t>
+        <w:t xml:space="preserve"> for on-device inference </w:t>
+      </w:r>
+      <w:r>
+        <w:lastRenderedPageBreak/>
+        <w:t>on commodity Android hardware. The model is expected to achieve greater than 90% intent classification accuracy under realistic speech recognition conditions.</w:t>
       </w:r>
     </w:p>
     <w:p>
@@ -2850,11 +2846,23 @@
       <w:r>
         <w:t xml:space="preserve"> makes it GDPR-compatible for hotels serving international guests.</w:t>
       </w:r>
-    </w:p>
-    <w:p>
-      <w:pPr>
-        <w:ind w:left="720"/>
-        <w:jc w:val="both"/>
+      <w:r>
+        <w:t xml:space="preserve"> (</w:t>
+      </w:r>
+      <w:r>
+        <w:t>GDPR (General Data Protection Regulation) is a European Union law that governs how personal data must be collected, stored, and processed, giving individuals rights over their own data.</w:t>
+      </w:r>
+      <w:r>
+        <w:t>)</w:t>
+      </w:r>
+    </w:p>
+    <w:p>
+      <w:pPr>
+        <w:jc w:val="both"/>
+        <w:rPr>
+          <w:b/>
+          <w:bCs/>
+        </w:rPr>
       </w:pPr>
     </w:p>
     <w:p>
@@ -2886,44 +2894,52 @@
         <w:jc w:val="both"/>
       </w:pPr>
       <w:r>
+        <w:t>The research will contribute a hotel-specific intent dataset, a fine-tuned on-device intent classification model, and a complete working prototype deployable on commodity Android hardware. It will also investigate whether training the model on realistic speech-transcribed examples alongside clean text can address the accuracy challenges that on-device speech recognition introduces an area that no existing published work has explored in this specific offline hospitality context.</w:t>
+      </w:r>
+    </w:p>
+    <w:p>
+      <w:pPr>
+        <w:jc w:val="both"/>
+      </w:pPr>
+      <w:r>
+        <w:t xml:space="preserve">This is a realistic, deployable solution for hotels in developing economies that want to </w:t>
+      </w:r>
+      <w:r>
+        <w:t>modernize</w:t>
+      </w:r>
+      <w:r>
+        <w:t xml:space="preserve"> guest services without expensive infrastructure or cloud subscriptions.</w:t>
+      </w:r>
+    </w:p>
+    <w:p>
+      <w:pPr>
+        <w:jc w:val="both"/>
+      </w:pPr>
+    </w:p>
+    <w:p>
+      <w:pPr>
+        <w:jc w:val="both"/>
+      </w:pPr>
+    </w:p>
+    <w:p>
+      <w:pPr>
+        <w:jc w:val="both"/>
+      </w:pPr>
+    </w:p>
+    <w:p>
+      <w:pPr>
+        <w:jc w:val="both"/>
+        <w:rPr>
+          <w:b/>
+          <w:bCs/>
+        </w:rPr>
+      </w:pPr>
+      <w:r>
+        <w:rPr>
+          <w:b/>
+          <w:bCs/>
+        </w:rPr>
         <w:lastRenderedPageBreak/>
-        <w:t>The research will contribute a hotel-specific intent dataset, a fine-tuned on-device intent classification model, and a complete working prototype deployable on commodity Android hardware. It will also investigate whether training the model on realistic speech-transcribed examples alongside clean text can address the accuracy challenges that on-device speech recognition introduces an area that no existing published work has explored in this specific offline hospitality context.</w:t>
-      </w:r>
-    </w:p>
-    <w:p>
-      <w:pPr>
-        <w:jc w:val="both"/>
-      </w:pPr>
-      <w:r>
-        <w:t xml:space="preserve">This is a realistic, deployable solution for hotels in developing economies that want to </w:t>
-      </w:r>
-      <w:proofErr w:type="spellStart"/>
-      <w:r>
-        <w:t>modernise</w:t>
-      </w:r>
-      <w:proofErr w:type="spellEnd"/>
-      <w:r>
-        <w:t xml:space="preserve"> guest services without expensive infrastructure or cloud subscriptions.</w:t>
-      </w:r>
-    </w:p>
-    <w:p>
-      <w:pPr>
-        <w:jc w:val="both"/>
-      </w:pPr>
-    </w:p>
-    <w:p>
-      <w:pPr>
-        <w:jc w:val="both"/>
-        <w:rPr>
-          <w:b/>
-          <w:bCs/>
-        </w:rPr>
-      </w:pPr>
-      <w:r>
-        <w:rPr>
-          <w:b/>
-          <w:bCs/>
-        </w:rPr>
         <w:t>References</w:t>
       </w:r>
     </w:p>
@@ -2953,7 +2969,7 @@
       <w:r>
         <w:t>. </w:t>
       </w:r>
-      <w:hyperlink r:id="rId10" w:history="1">
+      <w:hyperlink r:id="rId12" w:history="1">
         <w:r>
           <w:rPr>
             <w:rStyle w:val="Hyperlink"/>
@@ -3163,7 +3179,6 @@
         <w:jc w:val="both"/>
       </w:pPr>
       <w:r>
-        <w:lastRenderedPageBreak/>
         <w:t>Radford, A. et al. (2023). Robust Speech Recognition via Large-Scale Weak Supervision (Whisper). </w:t>
       </w:r>
       <w:r>
@@ -3261,13 +3276,8 @@
         <w:jc w:val="both"/>
       </w:pPr>
     </w:p>
-    <w:p>
-      <w:pPr>
-        <w:jc w:val="both"/>
-      </w:pPr>
-    </w:p>
     <w:sectPr>
-      <w:footerReference w:type="default" r:id="rId11"/>
+      <w:footerReference w:type="default" r:id="rId13"/>
       <w:pgSz w:w="12240" w:h="15840"/>
       <w:pgMar w:top="1440" w:right="1440" w:bottom="1440" w:left="1440" w:header="720" w:footer="720" w:gutter="0"/>
       <w:cols w:space="720"/>
@@ -6256,6 +6266,140 @@
       <w14:ligatures w14:val="none"/>
     </w:rPr>
   </w:style>
+  <w:style w:type="table" w:styleId="ListTable5Dark-Accent1">
+    <w:name w:val="List Table 5 Dark Accent 1"/>
+    <w:basedOn w:val="TableNormal"/>
+    <w:uiPriority w:val="50"/>
+    <w:rsid w:val="001F6296"/>
+    <w:pPr>
+      <w:spacing w:after="0" w:line="240" w:lineRule="auto"/>
+    </w:pPr>
+    <w:rPr>
+      <w:color w:val="FFFFFF" w:themeColor="background1"/>
+    </w:rPr>
+    <w:tblPr>
+      <w:tblStyleRowBandSize w:val="1"/>
+      <w:tblStyleColBandSize w:val="1"/>
+      <w:tblBorders>
+        <w:top w:val="single" w:sz="24" w:space="0" w:color="156082" w:themeColor="accent1"/>
+        <w:left w:val="single" w:sz="24" w:space="0" w:color="156082" w:themeColor="accent1"/>
+        <w:bottom w:val="single" w:sz="24" w:space="0" w:color="156082" w:themeColor="accent1"/>
+        <w:right w:val="single" w:sz="24" w:space="0" w:color="156082" w:themeColor="accent1"/>
+      </w:tblBorders>
+    </w:tblPr>
+    <w:tcPr>
+      <w:shd w:val="clear" w:color="auto" w:fill="156082" w:themeFill="accent1"/>
+    </w:tcPr>
+    <w:tblStylePr w:type="firstRow">
+      <w:rPr>
+        <w:b/>
+        <w:bCs/>
+      </w:rPr>
+      <w:tblPr/>
+      <w:tcPr>
+        <w:tcBorders>
+          <w:bottom w:val="single" w:sz="18" w:space="0" w:color="FFFFFF" w:themeColor="background1"/>
+        </w:tcBorders>
+      </w:tcPr>
+    </w:tblStylePr>
+    <w:tblStylePr w:type="lastRow">
+      <w:rPr>
+        <w:b/>
+        <w:bCs/>
+      </w:rPr>
+      <w:tblPr/>
+      <w:tcPr>
+        <w:tcBorders>
+          <w:top w:val="single" w:sz="4" w:space="0" w:color="FFFFFF" w:themeColor="background1"/>
+        </w:tcBorders>
+      </w:tcPr>
+    </w:tblStylePr>
+    <w:tblStylePr w:type="firstCol">
+      <w:rPr>
+        <w:b/>
+        <w:bCs/>
+      </w:rPr>
+      <w:tblPr/>
+      <w:tcPr>
+        <w:tcBorders>
+          <w:right w:val="single" w:sz="4" w:space="0" w:color="FFFFFF" w:themeColor="background1"/>
+        </w:tcBorders>
+      </w:tcPr>
+    </w:tblStylePr>
+    <w:tblStylePr w:type="lastCol">
+      <w:rPr>
+        <w:b/>
+        <w:bCs/>
+      </w:rPr>
+      <w:tblPr/>
+      <w:tcPr>
+        <w:tcBorders>
+          <w:left w:val="single" w:sz="4" w:space="0" w:color="FFFFFF" w:themeColor="background1"/>
+        </w:tcBorders>
+      </w:tcPr>
+    </w:tblStylePr>
+    <w:tblStylePr w:type="band1Vert">
+      <w:tblPr/>
+      <w:tcPr>
+        <w:tcBorders>
+          <w:left w:val="single" w:sz="4" w:space="0" w:color="FFFFFF" w:themeColor="background1"/>
+          <w:right w:val="single" w:sz="4" w:space="0" w:color="FFFFFF" w:themeColor="background1"/>
+        </w:tcBorders>
+      </w:tcPr>
+    </w:tblStylePr>
+    <w:tblStylePr w:type="band2Vert">
+      <w:tblPr/>
+      <w:tcPr>
+        <w:tcBorders>
+          <w:left w:val="single" w:sz="4" w:space="0" w:color="FFFFFF" w:themeColor="background1"/>
+          <w:right w:val="single" w:sz="4" w:space="0" w:color="FFFFFF" w:themeColor="background1"/>
+        </w:tcBorders>
+      </w:tcPr>
+    </w:tblStylePr>
+    <w:tblStylePr w:type="band1Horz">
+      <w:tblPr/>
+      <w:tcPr>
+        <w:tcBorders>
+          <w:top w:val="single" w:sz="4" w:space="0" w:color="FFFFFF" w:themeColor="background1"/>
+          <w:bottom w:val="single" w:sz="4" w:space="0" w:color="FFFFFF" w:themeColor="background1"/>
+        </w:tcBorders>
+      </w:tcPr>
+    </w:tblStylePr>
+    <w:tblStylePr w:type="neCell">
+      <w:tblPr/>
+      <w:tcPr>
+        <w:tcBorders>
+          <w:left w:val="nil"/>
+        </w:tcBorders>
+      </w:tcPr>
+    </w:tblStylePr>
+    <w:tblStylePr w:type="nwCell">
+      <w:tblPr/>
+      <w:tcPr>
+        <w:tcBorders>
+          <w:right w:val="nil"/>
+        </w:tcBorders>
+      </w:tcPr>
+    </w:tblStylePr>
+    <w:tblStylePr w:type="seCell">
+      <w:tblPr/>
+      <w:tcPr>
+        <w:tcBorders>
+          <w:top w:val="nil"/>
+          <w:left w:val="nil"/>
+        </w:tcBorders>
+      </w:tcPr>
+    </w:tblStylePr>
+    <w:tblStylePr w:type="swCell">
+      <w:tblPr/>
+      <w:tcPr>
+        <w:tcBorders>
+          <w:top w:val="nil"/>
+          <w:right w:val="nil"/>
+        </w:tcBorders>
+      </w:tcPr>
+    </w:tblStylePr>
+  </w:style>
 </w:styles>
 </file>
 

</xml_diff>